<commit_message>
equalize displayed subplot title sizes across all figures (per-figure scale compensation)
</commit_message>
<xml_diff>
--- a/Manuscript.docx
+++ b/Manuscript.docx
@@ -8750,7 +8750,7 @@
       </w:pPr>
       <w:drawing xmlns:a="http://schemas.openxmlformats.org/drawingml/2006/main" xmlns:pic="http://schemas.openxmlformats.org/drawingml/2006/picture">
         <wp:inline distT="0" distB="0" distL="0" distR="0">
-          <wp:extent cx="5760000" cy="1984491"/>
+          <wp:extent cx="5760000" cy="1981628"/>
           <wp:effectExtent l="0" t="0" r="0" b="0"/>
           <wp:docPr id="107" name="fig_e13_margins.emf"/>
           <wp:cNvGraphicFramePr/>
@@ -8770,7 +8770,7 @@
                 <pic:spPr>
                   <a:xfrm>
                     <a:off x="0" y="0"/>
-                    <a:ext cx="5760000" cy="1984491"/>
+                    <a:ext cx="5760000" cy="1981628"/>
                   </a:xfrm>
                   <a:prstGeom prst="rect">
                     <a:avLst/>
@@ -9910,7 +9910,7 @@
       </w:pPr>
       <w:drawing xmlns:a="http://schemas.openxmlformats.org/drawingml/2006/main" xmlns:pic="http://schemas.openxmlformats.org/drawingml/2006/picture">
         <wp:inline distT="0" distB="0" distL="0" distR="0">
-          <wp:extent cx="2880000" cy="1797657"/>
+          <wp:extent cx="2880000" cy="1799338"/>
           <wp:effectExtent l="0" t="0" r="0" b="0"/>
           <wp:docPr id="108" name="fig_e14_rho.emf"/>
           <wp:cNvGraphicFramePr/>
@@ -9930,7 +9930,7 @@
                 <pic:spPr>
                   <a:xfrm>
                     <a:off x="0" y="0"/>
-                    <a:ext cx="2880000" cy="1797657"/>
+                    <a:ext cx="2880000" cy="1799338"/>
                   </a:xfrm>
                   <a:prstGeom prst="rect">
                     <a:avLst/>
@@ -9976,7 +9976,7 @@
       </w:pPr>
       <w:drawing xmlns:a="http://schemas.openxmlformats.org/drawingml/2006/main" xmlns:pic="http://schemas.openxmlformats.org/drawingml/2006/picture">
         <wp:inline distT="0" distB="0" distL="0" distR="0">
-          <wp:extent cx="5760000" cy="1714301"/>
+          <wp:extent cx="5760000" cy="1722773"/>
           <wp:effectExtent l="0" t="0" r="0" b="0"/>
           <wp:docPr id="109" name="fig5_cascade.emf"/>
           <wp:cNvGraphicFramePr/>
@@ -9996,7 +9996,7 @@
                 <pic:spPr>
                   <a:xfrm>
                     <a:off x="0" y="0"/>
-                    <a:ext cx="5760000" cy="1714301"/>
+                    <a:ext cx="5760000" cy="1722773"/>
                   </a:xfrm>
                   <a:prstGeom prst="rect">
                     <a:avLst/>
@@ -10557,7 +10557,7 @@
       </w:pPr>
       <w:drawing xmlns:a="http://schemas.openxmlformats.org/drawingml/2006/main" xmlns:pic="http://schemas.openxmlformats.org/drawingml/2006/picture">
         <wp:inline distT="0" distB="0" distL="0" distR="0">
-          <wp:extent cx="5760000" cy="1966431"/>
+          <wp:extent cx="5760000" cy="1965067"/>
           <wp:effectExtent l="0" t="0" r="0" b="0"/>
           <wp:docPr id="110" name="fig_e5_ablation.emf"/>
           <wp:cNvGraphicFramePr/>
@@ -10577,7 +10577,7 @@
                 <pic:spPr>
                   <a:xfrm>
                     <a:off x="0" y="0"/>
-                    <a:ext cx="5760000" cy="1966431"/>
+                    <a:ext cx="5760000" cy="1965067"/>
                   </a:xfrm>
                   <a:prstGeom prst="rect">
                     <a:avLst/>
@@ -14085,7 +14085,7 @@
       </w:pPr>
       <w:drawing xmlns:a="http://schemas.openxmlformats.org/drawingml/2006/main" xmlns:pic="http://schemas.openxmlformats.org/drawingml/2006/picture">
         <wp:inline distT="0" distB="0" distL="0" distR="0">
-          <wp:extent cx="4752000" cy="1856480"/>
+          <wp:extent cx="4752000" cy="1856053"/>
           <wp:effectExtent l="0" t="0" r="0" b="0"/>
           <wp:docPr id="114" name="fig8_census.emf"/>
           <wp:cNvGraphicFramePr/>
@@ -14105,7 +14105,7 @@
                 <pic:spPr>
                   <a:xfrm>
                     <a:off x="0" y="0"/>
-                    <a:ext cx="4752000" cy="1856480"/>
+                    <a:ext cx="4752000" cy="1856053"/>
                   </a:xfrm>
                   <a:prstGeom prst="rect">
                     <a:avLst/>

</xml_diff>

<commit_message>
Fig.9 canvas x0.8 (embedded 12.8cm, fonts unchanged); Fig.10 canvas widened to 8.2in with x1.188 size compensation; drop redundant twin-axis label
</commit_message>
<xml_diff>
--- a/Manuscript.docx
+++ b/Manuscript.docx
@@ -9976,7 +9976,7 @@
       </w:pPr>
       <w:drawing xmlns:a="http://schemas.openxmlformats.org/drawingml/2006/main" xmlns:pic="http://schemas.openxmlformats.org/drawingml/2006/picture">
         <wp:inline distT="0" distB="0" distL="0" distR="0">
-          <wp:extent cx="5760000" cy="1722773"/>
+          <wp:extent cx="4608000" cy="1726350"/>
           <wp:effectExtent l="0" t="0" r="0" b="0"/>
           <wp:docPr id="109" name="fig5_cascade.emf"/>
           <wp:cNvGraphicFramePr/>
@@ -9996,7 +9996,7 @@
                 <pic:spPr>
                   <a:xfrm>
                     <a:off x="0" y="0"/>
-                    <a:ext cx="5760000" cy="1722773"/>
+                    <a:ext cx="4608000" cy="1726350"/>
                   </a:xfrm>
                   <a:prstGeom prst="rect">
                     <a:avLst/>
@@ -10557,7 +10557,7 @@
       </w:pPr>
       <w:drawing xmlns:a="http://schemas.openxmlformats.org/drawingml/2006/main" xmlns:pic="http://schemas.openxmlformats.org/drawingml/2006/picture">
         <wp:inline distT="0" distB="0" distL="0" distR="0">
-          <wp:extent cx="5760000" cy="1965067"/>
+          <wp:extent cx="5760000" cy="1550448"/>
           <wp:effectExtent l="0" t="0" r="0" b="0"/>
           <wp:docPr id="110" name="fig_e5_ablation.emf"/>
           <wp:cNvGraphicFramePr/>
@@ -10577,7 +10577,7 @@
                 <pic:spPr>
                   <a:xfrm>
                     <a:off x="0" y="0"/>
-                    <a:ext cx="5760000" cy="1965067"/>
+                    <a:ext cx="5760000" cy="1550448"/>
                   </a:xfrm>
                   <a:prstGeom prst="rect">
                     <a:avLst/>

</xml_diff>

<commit_message>
harmonize figure captions: topic-sentence style for Fig. 9, US spelling, section cross-reference format
</commit_message>
<xml_diff>
--- a/Manuscript.docx
+++ b/Manuscript.docx
@@ -1653,7 +1653,7 @@
         <w:rPr>
           <w:sz w:val="19"/>
         </w:rPr>
-        <w:t>Fig. 3. Index build and query latency versus corpus size (log-log); planted recall 100% at all sizes; Jaccard scan baseline shown where feasible; MinHash-LSH is fast at every size but retrieves nothing (V-G).</w:t>
+        <w:t>Fig. 3. Index build and query latency versus corpus size (log-log); planted recall 100% at all sizes; Jaccard scan baseline shown where feasible; MinHash-LSH is fast at every size yet retrieves nothing (Section V-G).</w:t>
       </w:r>
     </w:p>
     <w:p>
@@ -7633,7 +7633,7 @@
         <w:pStyle w:val="Heading2"/>
       </w:pPr>
       <w:r>
-        <w:t>C. Anytime behaviour</w:t>
+        <w:t>C. Anytime behavior</w:t>
       </w:r>
     </w:p>
     <w:p>
@@ -9950,7 +9950,7 @@
         <w:rPr>
           <w:sz w:val="19"/>
         </w:rPr>
-        <w:t>Fig. 8. Confirmation operating curves: donor recall versus fragment-level FP over ρ, labelled by threshold, for three anchor-tolerance regimes.</w:t>
+        <w:t>Fig. 8. Confirmation operating curves: donor recall versus fragment-level FP over ρ, labeled by threshold, for three anchor-tolerance regimes.</w:t>
       </w:r>
     </w:p>
     <w:p>
@@ -10016,7 +10016,7 @@
         <w:rPr>
           <w:sz w:val="19"/>
         </w:rPr>
-        <w:t>Fig. 9. (a) Operating points of the three systems on hard negatives; (b) donor retention in the top-C candidate feed.</w:t>
+        <w:t>Fig. 9. Operating points and donor retention on hard negatives. (a) Operating points of the three systems; (b) donor retention in the top-C candidate feed.</w:t>
       </w:r>
     </w:p>
     <w:p>
@@ -14678,7 +14678,7 @@
       </w:pPr>
       <w:drawing xmlns:a="http://schemas.openxmlformats.org/drawingml/2006/main" xmlns:pic="http://schemas.openxmlformats.org/drawingml/2006/picture">
         <wp:inline distT="0" distB="0" distL="0" distR="0">
-          <wp:extent cx="5760000" cy="1597256"/>
+          <wp:extent cx="5760000" cy="1600074"/>
           <wp:effectExtent l="0" t="0" r="0" b="0"/>
           <wp:docPr id="115" name="fig_e21_memorization.emf"/>
           <wp:cNvGraphicFramePr/>
@@ -14698,7 +14698,7 @@
                 <pic:spPr>
                   <a:xfrm>
                     <a:off x="0" y="0"/>
-                    <a:ext cx="5760000" cy="1597256"/>
+                    <a:ext cx="5760000" cy="1600074"/>
                   </a:xfrm>
                   <a:prstGeom prst="rect">
                     <a:avLst/>
@@ -14718,7 +14718,7 @@
         <w:rPr>
           <w:sz w:val="19"/>
         </w:rPr>
-        <w:t>Fig. 15. Trained-generator memorization audit.  (a) Training and held-out loss over 520 epochs; the gap is the memorization.  (b) Sampling calibration: position-wise pitch agreement of sampled continuations versus per-piece held likelihood (memorization); even the most memorized pieces are not regurgitated.  (c) Cascade confirmation and source attribution for the three sampling groups against the lambda = 0 / lambda = 1 anchors of Table XI.</w:t>
+        <w:t>Fig. 15. Trained-generator memorization audit.  (a) Training and held-out loss over 520 epochs; the gap is the memorization.  (b) Sampling calibration: position-wise pitch agreement of sampled continuations versus per-piece held likelihood (memorization); even the most memorized pieces are not regurgitated.  (c) Cascade confirmation and source attribution for the three sampling groups against the λ = 0 / λ = 1 anchors of Table XI.</w:t>
       </w:r>
     </w:p>
     <w:p>

</xml_diff>

<commit_message>
Fig. 1 detailed caption; uniform framework-first caption style
</commit_message>
<xml_diff>
--- a/Manuscript.docx
+++ b/Manuscript.docx
@@ -330,7 +330,7 @@
         <w:rPr>
           <w:sz w:val="19"/>
         </w:rPr>
-        <w:t>Fig. 1. The evidence-funnel view of the copy-detection pipeline: candidates narrow — the guarantee does not.</w:t>
+        <w:t>Fig. 1. The evidence funnel of the proposed pipeline, with one query traced end to end (amber markers). Left: the Lakh MIDI corpus (174,300 pieces) is encoded once offline into a rare-first item-set index (1.05 GB peak memory, 24.7 s build, 41.9 ms query p50); the inset plots the anytime evidence bound, lowest at every budget under rare-first ordering. Center: the L1 tolerant screen (tolerance k = (2, 1, 1)) enumerates 1.66 M candidate pairs under an anytime budget B (dotted line) with a per-prefix recall floor (Thm 1); the bars show top-C donor retention on 233 hard negatives (96.6 % at C = 50). Right: L3 structural confirmation aligns ordered note chains—invariant to pitch ±Δ, tempo ×τ, and splicing—and certifies the copied span (score ρ = 0.62 ≥ θ; FP 2.1 %, recall 83.9 %), shipping as a publisher-readable verdict. The bottom banner states the recall floor (337 adversarial cells, zero violations); the lower-right mini-panel previews the memorization spectrum (26–34 → 100 % detection, 96–100 % attribution) and the 1,658,993 in-the-wild duplicate pairs.</w:t>
       </w:r>
     </w:p>
     <w:p>
@@ -10597,7 +10597,7 @@
         <w:rPr>
           <w:sz w:val="19"/>
         </w:rPr>
-        <w:t>Fig. 10. Component ablations: (a) evidence span length; (b) tolerance vector (bars: false candidates, log scale; dashed: recall, right axis); (c) quantization grid granularity.</w:t>
+        <w:t>Fig. 10. Component ablations over the confirmation and screening stages. (a) evidence span length; (b) tolerance vector (bars: false candidates, log scale; dashed: recall, right axis); (c) quantization grid granularity.</w:t>
       </w:r>
     </w:p>
     <w:p>

</xml_diff>

<commit_message>
Shorten Fig. 1 caption; enlarge Fig. 10 canvas 15% with font compensation
</commit_message>
<xml_diff>
--- a/Manuscript.docx
+++ b/Manuscript.docx
@@ -330,7 +330,7 @@
         <w:rPr>
           <w:sz w:val="19"/>
         </w:rPr>
-        <w:t>Fig. 1. The evidence funnel of the proposed pipeline, with one query traced end to end (amber markers). Left: the Lakh MIDI corpus (174,300 pieces) is encoded once offline into a rare-first item-set index (1.05 GB peak memory, 24.7 s build, 41.9 ms query p50); the inset plots the anytime evidence bound, lowest at every budget under rare-first ordering. Center: the L1 tolerant screen (tolerance k = (2, 1, 1)) enumerates 1.66 M candidate pairs under an anytime budget B (dotted line) with a per-prefix recall floor (Thm 1); the bars show top-C donor retention on 233 hard negatives (96.6 % at C = 50). Right: L3 structural confirmation aligns ordered note chains—invariant to pitch ±Δ, tempo ×τ, and splicing—and certifies the copied span (score ρ = 0.62 ≥ θ; FP 2.1 %, recall 83.9 %), shipping as a publisher-readable verdict. The bottom banner states the recall floor (337 adversarial cells, zero violations); the lower-right mini-panel previews the memorization spectrum (26–34 → 100 % detection, 96–100 % attribution) and the 1,658,993 in-the-wild duplicate pairs.</w:t>
+        <w:t>Fig. 1. The evidence funnel of the proposed pipeline, with one query traced end to end (amber markers). Left: the Lakh MIDI corpus is encoded once into a rare-first item-set index (1.05 GB, 41.9 ms p50). Center: the L1 tolerant screen enumerates 1.66 M candidates under an anytime budget with a per-prefix recall floor (Thm 1). Right: L3 structural confirmation aligns ordered note chains—invariant to pitch, tempo, and splicing—and certifies the copied span (ρ = 0.62 ≥ θ) as a publisher-readable verdict.</w:t>
       </w:r>
     </w:p>
     <w:p>
@@ -10557,7 +10557,7 @@
       </w:pPr>
       <w:drawing xmlns:a="http://schemas.openxmlformats.org/drawingml/2006/main" xmlns:pic="http://schemas.openxmlformats.org/drawingml/2006/picture">
         <wp:inline distT="0" distB="0" distL="0" distR="0">
-          <wp:extent cx="5760000" cy="1550448"/>
+          <wp:extent cx="5760000" cy="1585430"/>
           <wp:effectExtent l="0" t="0" r="0" b="0"/>
           <wp:docPr id="110" name="fig_e5_ablation.emf"/>
           <wp:cNvGraphicFramePr/>
@@ -10577,7 +10577,7 @@
                 <pic:spPr>
                   <a:xfrm>
                     <a:off x="0" y="0"/>
-                    <a:ext cx="5760000" cy="1550448"/>
+                    <a:ext cx="5760000" cy="1585430"/>
                   </a:xfrm>
                   <a:prstGeom prst="rect">
                     <a:avLst/>

</xml_diff>

<commit_message>
Fig. 15: embed at full text width (18.2cm) with font compensation
</commit_message>
<xml_diff>
--- a/Manuscript.docx
+++ b/Manuscript.docx
@@ -14678,7 +14678,7 @@
       </w:pPr>
       <w:drawing xmlns:a="http://schemas.openxmlformats.org/drawingml/2006/main" xmlns:pic="http://schemas.openxmlformats.org/drawingml/2006/picture">
         <wp:inline distT="0" distB="0" distL="0" distR="0">
-          <wp:extent cx="5760000" cy="1600074"/>
+          <wp:extent cx="6552000" cy="1840748"/>
           <wp:effectExtent l="0" t="0" r="0" b="0"/>
           <wp:docPr id="115" name="fig_e21_memorization.emf"/>
           <wp:cNvGraphicFramePr/>
@@ -14698,7 +14698,7 @@
                 <pic:spPr>
                   <a:xfrm>
                     <a:off x="0" y="0"/>
-                    <a:ext cx="5760000" cy="1600074"/>
+                    <a:ext cx="6552000" cy="1840748"/>
                   </a:xfrm>
                   <a:prstGeom prst="rect">
                     <a:avLst/>

</xml_diff>

<commit_message>
Fig. 10: embed at full text width (18.2cm) with font compensation
</commit_message>
<xml_diff>
--- a/Manuscript.docx
+++ b/Manuscript.docx
@@ -10557,7 +10557,7 @@
       </w:pPr>
       <w:drawing xmlns:a="http://schemas.openxmlformats.org/drawingml/2006/main" xmlns:pic="http://schemas.openxmlformats.org/drawingml/2006/picture">
         <wp:inline distT="0" distB="0" distL="0" distR="0">
-          <wp:extent cx="5760000" cy="1585430"/>
+          <wp:extent cx="6552000" cy="1774972"/>
           <wp:effectExtent l="0" t="0" r="0" b="0"/>
           <wp:docPr id="110" name="fig_e5_ablation.emf"/>
           <wp:cNvGraphicFramePr/>
@@ -10577,7 +10577,7 @@
                 <pic:spPr>
                   <a:xfrm>
                     <a:off x="0" y="0"/>
-                    <a:ext cx="5760000" cy="1585430"/>
+                    <a:ext cx="6552000" cy="1774972"/>
                   </a:xfrm>
                   <a:prstGeom prst="rect">
                     <a:avLst/>

</xml_diff>

<commit_message>
Split oversized paragraphs; swap Table I/II for citation order; cite Fig. 9 in text
</commit_message>
<xml_diff>
--- a/Manuscript.docx
+++ b/Manuscript.docx
@@ -204,7 +204,7 @@
         <w:rPr>
           <w:color w:val="000000"/>
         </w:rPr>
-        <w:t xml:space="preserve"> publishers, dataset curators, and generative-music deployments share a common need: given a corpus of symbolic music (MIDI and its derivatives) and a query—a new submission, a generated sample, or a suspected infringement—find every piece that shares a substantively copied span with the query, rank the candidates, and show the evidence. The requirement list is demanding. Recall must survive the noise of real-world reuse: transposition, tempo change, re-instrumentation, transcription jitter from audio-to-MIDI tools, and deliberate splicing. Latency must stay interactive even as corpora reach hundreds of thousands of pieces. And the output must be decision-grade: on style-similar but innocent repertoire the system must not cry wolf, and on positives it must present an alignment a human expert can check against a score.</w:t>
+        <w:t xml:space="preserve"> publishers, dataset curators, and generative-music deployments share a common need: given a corpus of symbolic music (MIDI and its derivatives) and a query—a new submission, a generated sample, or a suspected infringement—find every piece that shares a substantively copied span with the query, rank the candidates, and show the evidence. </w:t>
       </w:r>
     </w:p>
     <w:p>
@@ -214,7 +214,7 @@
         <w:jc w:val="both"/>
       </w:pPr>
       <w:r>
-        <w:t>Established approaches each fail one requirement. Audio fingerprinting [3], [5] and chroma-based matching [4], [12] target audio and tolerate noise well, but their features are lossy with respect to the symbolic content publishers must adjudicate, and they provide no recall guarantee. Frequent itemset mining (FIM) and its geometric cousins (SIATEC and successors) [2], [9], [10] discover repeated patterns with algorithmic elegance, but exact enumeration explodes combinatorially at the support levels copying detection requires (we quantify this in Section V-A), and pattern sets are not ranked candidates. Cover-song identification has moved to learned audio embeddings [15]–[17], while plagiarism detection specifically has been addressed with chroma-based forensics [18], bipartite graph matching [19], and melodic-similarity analysis of real copyright cases [20]; these audio- and embedding-centric methods, like query-by-humming lineage [13], [14], do not provide a symbolic, per-query recall guarantee of the kind a publisher can contract against.</w:t>
+        <w:t>The requirement list is demanding. Recall must survive the noise of real-world reuse: transposition, tempo change, re-instrumentation, transcription jitter from audio-to-MIDI tools, and deliberate splicing. Latency must stay interactive even as corpora reach hundreds of thousands of pieces. And the output must be decision-grade: on style-similar but innocent repertoire the system must not cry wolf, and on positives it must present an alignment a human expert can check against a score.</w:t>
       </w:r>
     </w:p>
     <w:p>
@@ -224,7 +224,7 @@
         <w:jc w:val="both"/>
       </w:pPr>
       <w:r>
-        <w:t>This paper's thesis is architectural: the three requirements decompose across two layers with different contracts. The first layer maximizes recall under a stated noise model and proves it—an evidence lower bound that holds for any query whose per-note deviation stays within declared tolerances. The second layer maximizes precision by checking structure that style peers do not share: the ordered chain of notes with their inter-onset intervals. We additionally require the first layer to be anytime [8]: under a partial budget it must return the best partial answer together with a sound bound on what remains open.</w:t>
+        <w:t>Established approaches each fail one requirement. Audio fingerprinting [3], [5] and chroma-based matching [4], [12] target audio and tolerate noise well, but their features are lossy with respect to the symbolic content publishers must adjudicate, and they provide no recall guarantee. Frequent itemset mining (FIM) and its geometric cousins (SIATEC and successors) [2], [9], [10] discover repeated patterns with algorithmic elegance, but exact enumeration explodes combinatorially at the support levels copying detection requires (we quantify this in Section V-A), and pattern sets are not ranked candidates.</w:t>
       </w:r>
     </w:p>
     <w:p>
@@ -234,7 +234,7 @@
         <w:jc w:val="both"/>
       </w:pPr>
       <w:r>
-        <w:t>Our findings, all measured on the Lakh MIDI corpus (full corpus, 174,300 pieces), are: (1) item-set containment alone is screening-grade only—on style-similar hard negatives its fragment-level false-positive rate reaches 93%, and no threshold repairs this without destroying recall; (2) a strict-tolerance ordered-chain confirmation layer on top of the screen cuts the false-positive rate to 2.1% at 83.9% recall under transcription noise, meeting the &lt;5% screening requirement of a decision-support tool; (3) the screen's rare-first schedule tightens the certified open-candidate bound by 1.1× over a hot-first schedule at 70% budget, with identical full-budget recall; (4) detection on a controlled memorization spectrum rises monotonically to 100% at full copying; and (5) a full-corpus census over 174,300 pieces measures 5.6 billion candidate pairs at the screening operating point, and a stratified audit of the high-scoring candidates confirms an estimated 107k verbatim-level duplicate pairs at 90% channel precision, while on in-the-wild cases the system localizes a spliced 30-second segment and recovers a +3-semitone transposed cover with exact, score-checkable alignment maps.</w:t>
+        <w:t>Cover-song identification has moved to learned audio embeddings [15]–[17], while plagiarism detection specifically has been addressed with chroma-based forensics [18], bipartite graph matching [19], and melodic-similarity analysis of real copyright cases [20]; these audio- and embedding-centric methods, like query-by-humming lineage [13], [14], do not provide a symbolic, per-query recall guarantee of the kind a publisher can contract against.</w:t>
       </w:r>
     </w:p>
     <w:p>
@@ -244,7 +244,47 @@
         <w:jc w:val="both"/>
       </w:pPr>
       <w:r>
-        <w:t>The contributions are: (1) an architectural decomposition of copy detection into a provable-recall screening problem and a structural confirmation problem, with formal contracts for each layer, validated by a controlled negative result: no single item-level method reaches decision-grade precision, and no purely structural method scales; (2) a tolerant item-set screen whose per-query recall is guaranteed by a sound evidence lower bound under a declared noise model, auditable cell by cell on 337 adversarial cells with zero violations; (3) an anytime schedule analysis showing that rare-first processing tightens the certified open-candidate bound over hot-first under partial budgets (by 1.1× at 70% budget) and that the bound is computable after any schedule prefix, turning an engineering heuristic into a schedulable guarantee; (4) a strict-tolerance ordered-chain confirmation layer that outputs note-level alignment evidence, reaching 2.1% fragment-level false positives at 83.9% recall on style-similar hard negatives, together with a controlled memorization study showing monotone detection growth and 96-100% correct source attribution under full copying, together with a full-corpus census over 174,300 pieces that measures 5.6 billion candidate pairs at the screening operating point and, via a stratified adjudication audit, an estimated 107k verbatim-level duplicate pairs at 90% channel precision; and (5) a fully scripted reproduction release that regenerates every number, table, and figure in this paper from the raw corpus download.</w:t>
+        <w:t>This paper's thesis is architectural: the three requirements decompose across two layers with different contracts. The first layer maximizes recall under a stated noise model and proves it—an evidence lower bound that holds for any query whose per-note deviation stays within declared tolerances. The second layer maximizes precision by checking structure that style peers do not share: the ordered chain of notes with their inter-onset intervals. We additionally require the first layer to be anytime [8]: under a partial budget it must return the best partial answer together with a sound bound on what remains open.</w:t>
+      </w:r>
+    </w:p>
+    <w:p>
+      <w:pPr>
+        <w:spacing w:after="0"/>
+        <w:ind w:firstLine="204"/>
+        <w:jc w:val="both"/>
+      </w:pPr>
+      <w:r>
+        <w:t xml:space="preserve">Our findings, all measured on the Lakh MIDI corpus (full corpus, 174,300 pieces), are: (1) item-set containment alone is screening-grade only—on style-similar hard negatives its fragment-level false-positive rate reaches 93%, and no threshold repairs this without destroying recall; (2) a strict-tolerance ordered-chain confirmation layer on top of the screen cuts the false-positive rate to 2.1% at 83.9% recall under transcription noise, meeting the &lt;5% screening requirement of a decision-support tool; (3) the screen's rare-first schedule tightens the certified open-candidate bound by 1.1× over a hot-first schedule at 70% budget, with identical full-budget recall. </w:t>
+      </w:r>
+    </w:p>
+    <w:p>
+      <w:pPr>
+        <w:spacing w:after="0"/>
+        <w:ind w:firstLine="204"/>
+        <w:jc w:val="both"/>
+      </w:pPr>
+      <w:r>
+        <w:t>Two further findings complete the picture: (4) detection on a controlled memorization spectrum rises monotonically to 100% at full copying; and (5) a full-corpus census over 174,300 pieces measures 5.6 billion candidate pairs at the screening operating point, and a stratified audit of the high-scoring candidates confirms an estimated 107k verbatim-level duplicate pairs at 90% channel precision, while on in-the-wild cases the system localizes a spliced 30-second segment and recovers a +3-semitone transposed cover with exact, score-checkable alignment maps.</w:t>
+      </w:r>
+    </w:p>
+    <w:p>
+      <w:pPr>
+        <w:spacing w:after="0"/>
+        <w:ind w:firstLine="204"/>
+        <w:jc w:val="both"/>
+      </w:pPr>
+      <w:r>
+        <w:t xml:space="preserve">The contributions are: (1) an architectural decomposition of copy detection into a provable-recall screening problem and a structural confirmation problem, with formal contracts for each layer, validated by a controlled negative result: no single item-level method reaches decision-grade precision, and no purely structural method scales; (2) a tolerant item-set screen whose per-query recall is guaranteed by a sound evidence lower bound under a declared noise model, auditable cell by cell on 337 adversarial cells with zero violations; (3) an anytime schedule analysis showing that rare-first processing tightens the certified open-candidate bound over hot-first under partial budgets (by 1.1× at 70% budget) and that the bound is computable after any schedule prefix, turning an engineering heuristic into a schedulable guarantee. </w:t>
+      </w:r>
+    </w:p>
+    <w:p>
+      <w:pPr>
+        <w:spacing w:after="0"/>
+        <w:ind w:firstLine="204"/>
+        <w:jc w:val="both"/>
+      </w:pPr>
+      <w:r>
+        <w:t>The last two contributions are systems-level: (4) a strict-tolerance ordered-chain confirmation layer that outputs note-level alignment evidence, reaching 2.1% fragment-level false positives at 83.9% recall on style-similar hard negatives, together with a controlled memorization study showing monotone detection growth and 96-100% correct source attribution under full copying, together with a full-corpus census over 174,300 pieces that measures 5.6 billion candidate pairs at the screening operating point and, via a stratified adjudication audit, an estimated 107k verbatim-level duplicate pairs at 90% channel precision; and (5) a fully scripted reproduction release that regenerates every number, table, and figure in this paper from the raw corpus download.</w:t>
       </w:r>
     </w:p>
     <w:p>
@@ -377,15 +417,7 @@
         <w:jc w:val="both"/>
       </w:pPr>
       <w:r>
-        <w:t>Symbolic version identification has a complementary lineage. Alignment-based matching of MIDI to audio [6] and sequence-comparison methods benchmarked on the Lakh corpus [7] establish that symbolic sequences support robust matching, but their cost is per-candidate: applied as corpus-wide filters they do not scale, and applied after a cheap filter they inherit the filter's recall, which none of these systems bounds. Our screen layer can be read as a recall-guaranteed candidate generator for exactly such aligners: it hands confirmation a top-C set small enough that exact structural alignment becomes affordable, while the bound certifies that nothing outside the set needs alignment at all.</w:t>
-      </w:r>
-    </w:p>
-    <w:p>
-      <w:pPr>
-        <w:pStyle w:val="Heading2"/>
-      </w:pPr>
-      <w:r>
-        <w:t>B. Memorization in generative models</w:t>
+        <w:t xml:space="preserve">Symbolic version identification has a complementary lineage. Alignment-based matching of MIDI to audio [6] and sequence-comparison methods benchmarked on the Lakh corpus [7] establish that symbolic sequences support robust matching, but their cost is per-candidate: applied as corpus-wide filters they do not scale, and applied after a cheap filter they inherit the filter's recall, which none of these systems bounds. </w:t>
       </w:r>
     </w:p>
     <w:p>
@@ -395,7 +427,35 @@
         <w:jc w:val="both"/>
       </w:pPr>
       <w:r>
-        <w:t>Carlini et al. [11] demonstrated that large language models regurgitate training sequences and that extraction is detectable with membership tests [23]; the same extraction was then shown for diffusion models [24]. Deduplication reduces both verbatim regurgitation and privacy leakage [25], [26], and memorization is measurable even in probabilistic deep generative models [27]. For music specifically, symbolic generators such as Music Transformer [22] are trained on scraped MIDI, membership-inference auditing of generative music models has only recently been demonstrated [28], influence-level attribution has been explored with audio embeddings [29], and the legal status of such training data remains contested [30]. Publishers consequently need batch screening tools rather than per-sample membership oracles. Our controlled experiments (Section VI-A) emulate the memorization spectrum without training neural models, using n-gram order and a copy operator—a deliberately transparent stand-in that exposes exactly where contiguity-based detection breaks down.</w:t>
+        <w:t>Our screen layer can be read as a recall-guaranteed candidate generator for exactly such aligners: it hands confirmation a top-C set small enough that exact structural alignment becomes affordable, while the bound certifies that nothing outside the set needs alignment at all.</w:t>
+      </w:r>
+    </w:p>
+    <w:p>
+      <w:pPr>
+        <w:pStyle w:val="Heading2"/>
+      </w:pPr>
+      <w:r>
+        <w:t>B. Memorization in generative models</w:t>
+      </w:r>
+    </w:p>
+    <w:p>
+      <w:pPr>
+        <w:spacing w:after="0"/>
+        <w:ind w:firstLine="204"/>
+        <w:jc w:val="both"/>
+      </w:pPr>
+      <w:r>
+        <w:t xml:space="preserve">Carlini et al. [11] demonstrated that large language models regurgitate training sequences and that extraction is detectable with membership tests [23]; the same extraction was then shown for diffusion models [24]. Deduplication reduces both verbatim regurgitation and privacy leakage [25], [26], and memorization is measurable even in probabilistic deep generative models [27]. For music specifically, symbolic generators such as Music Transformer [22] are trained on scraped MIDI, membership-inference auditing of generative music models has only recently been demonstrated [28], influence-level attribution has been explored with audio embeddings [29], and the legal status of such training data remains contested [30]. </w:t>
+      </w:r>
+    </w:p>
+    <w:p>
+      <w:pPr>
+        <w:spacing w:after="0"/>
+        <w:ind w:firstLine="204"/>
+        <w:jc w:val="both"/>
+      </w:pPr>
+      <w:r>
+        <w:t>Publishers consequently need batch screening tools rather than per-sample membership oracles. Our controlled experiments (Section VI-A) emulate the memorization spectrum without training neural models, using n-gram order and a copy operator—a deliberately transparent stand-in that exposes exactly where contiguity-based detection breaks down.</w:t>
       </w:r>
     </w:p>
     <w:p>
@@ -554,7 +614,7 @@
         <w:jc w:val="both"/>
       </w:pPr>
       <w:r>
-        <w:t>Each piece is quantized onto a fixed grid (125 ms per bin at ticks-per-beat 8) and encoded per note as a four-dimensional item: pitch, duration bin, IOI bin, and velocity bin. A piece's item set is the set of distinct codes. Pop-music grid quantization is a deliberate information reduction: it is what makes the screen layer fast and its recall argument clean, and it is what the confirmation layer must overcome with structural information. An interval-sketch variant (pitch replaced by the chromatic interval to the next note) provides transposition invariance for retrieval of transposed material. Items are remapped to gapless dense integer IDs per corpus revision, so that the inverted index consists of contiguous posting lists; this costs one sort of the vocabulary and pays off in cache behavior and in a compact Fenwick-based open-set bookkeeping at query time.</w:t>
+        <w:t xml:space="preserve">Each piece is quantized onto a fixed grid (125 ms per bin at ticks-per-beat 8) and encoded per note as a four-dimensional item: pitch, duration bin, IOI bin, and velocity bin. A piece's item set is the set of distinct codes. Pop-music grid quantization is a deliberate information reduction: it is what makes the screen layer fast and its recall argument clean, and it is what the confirmation layer must overcome with structural information. An interval-sketch variant (pitch replaced by the chromatic interval to the next note) provides transposition invariance for retrieval of transposed material. </w:t>
       </w:r>
     </w:p>
     <w:p>
@@ -564,15 +624,7 @@
         <w:jc w:val="both"/>
       </w:pPr>
       <w:r>
-        <w:t>The corpus index is an inverted index from item to sorted piece-ID lists, built once in a linear pass (each piece contributes |S(P)| postings). Build time and memory grow linearly with corpus size (Fig. 3, Table II); incremental updates append postings for new pieces without rebuilding.</w:t>
-      </w:r>
-    </w:p>
-    <w:p>
-      <w:pPr>
-        <w:pStyle w:val="Heading2"/>
-      </w:pPr>
-      <w:r>
-        <w:t>C. L1: tolerant screening with a provable bound</w:t>
+        <w:t>Items are remapped to gapless dense integer IDs per corpus revision, so that the inverted index consists of contiguous posting lists; this costs one sort of the vocabulary and pays off in cache behavior and in a compact Fenwick-based open-set bookkeeping at query time.</w:t>
       </w:r>
     </w:p>
     <w:p>
@@ -582,6 +634,24 @@
         <w:jc w:val="both"/>
       </w:pPr>
       <w:r>
+        <w:t>The corpus index is an inverted index from item to sorted piece-ID lists, built once in a linear pass (each piece contributes |S(P)| postings). Build time and memory grow linearly with corpus size (Fig. 3, Table I); incremental updates append postings for new pieces without rebuilding.</w:t>
+      </w:r>
+    </w:p>
+    <w:p>
+      <w:pPr>
+        <w:pStyle w:val="Heading2"/>
+      </w:pPr>
+      <w:r>
+        <w:t>C. L1: tolerant screening with a provable bound</w:t>
+      </w:r>
+    </w:p>
+    <w:p>
+      <w:pPr>
+        <w:spacing w:after="0"/>
+        <w:ind w:firstLine="204"/>
+        <w:jc w:val="both"/>
+      </w:pPr>
+      <w:r>
         <w:t>A query is processed position by position in rare-first order; each position contributes +1 to every piece that contains any variant of the position's item within tolerance (pitch ±2 semitones, duration/IOI ±1 bin, velocity ±1 bin). Formally:</w:t>
       </w:r>
     </w:p>
@@ -612,7 +682,7 @@
         <w:jc w:val="both"/>
       </w:pPr>
       <w:r>
-        <w:t>Complexity. Index construction is O(Σ_P |S(P)|). A query touches, per position, the posting lists of all items in N_k, so query cost grows with evidence and vocabulary rarity, not with corpus size beyond postings; the open set is maintained in a Fenwick structure over piece IDs, giving O(log N) updates and an exact |O_u| readout after every position. Measured end to end, the index builds in 24.747 s and queries run at p50 = 41.94 ms on the full 174,300-piece corpus (Table II).</w:t>
+        <w:t>Complexity. Index construction is O(Σ_P |S(P)|). A query touches, per position, the posting lists of all items in N_k, so query cost grows with evidence and vocabulary rarity, not with corpus size beyond postings; the open set is maintained in a Fenwick structure over piece IDs, giving O(log N) updates and an exact |O_u| readout after every position. Measured end to end, the index builds in 24.747 s and queries run at p50 = 41.94 ms on the full 174,300-piece corpus (Table I).</w:t>
       </w:r>
     </w:p>
     <w:p>
@@ -630,7 +700,27 @@
         <w:jc w:val="both"/>
       </w:pPr>
       <w:r>
-        <w:t>The screen is deliberately permissive; verbatim counts re-rank its survivors, and the top-C union of tolerant and verbatim rankings is passed to confirmation. Confirmation scores an ordered alignment: two notes match when all four features are within strict tolerance (pitch ±1 semitone, duration, IOI, and velocity in exact bins). The score is the longest chain of matches with both note order and candidate position strictly increasing — a longest-common-subsequence computation restricted to anchor pairs, not a heuristic local alignment. Anchors are strict-tolerance matches; their j − i offsets are voted, and when the strict vote is inconclusive the interval-sketch offsets estimate the transposition, which is then removed by re-expressing the query in interval form and re-running confirmation once. The dynamic program runs inside the anchor-constrained window, so its cost is O(W·m) for window W and m anchors, with a traceback that recovers the chain itself. A candidate is confirmed when the best chain reaches ρ times the query length. Algorithm 1 assembles the full pipeline.</w:t>
+        <w:t xml:space="preserve">The screen is deliberately permissive; verbatim counts re-rank its survivors, and the top-C union of tolerant and verbatim rankings is passed to confirmation. Confirmation scores an ordered alignment: two notes match when all four features are within strict tolerance (pitch ±1 semitone, duration, IOI, and velocity in exact bins). The score is the longest chain of matches with both note order and candidate position strictly increasing — a longest-common-subsequence computation restricted to anchor pairs, not a heuristic local alignment. </w:t>
+      </w:r>
+    </w:p>
+    <w:p>
+      <w:pPr>
+        <w:spacing w:after="0"/>
+        <w:ind w:firstLine="204"/>
+        <w:jc w:val="both"/>
+      </w:pPr>
+      <w:r>
+        <w:t xml:space="preserve">Anchors are strict-tolerance matches; their j − i offsets are voted, and when the strict vote is inconclusive the interval-sketch offsets estimate the transposition, which is then removed by re-expressing the query in interval form and re-running confirmation once. </w:t>
+      </w:r>
+    </w:p>
+    <w:p>
+      <w:pPr>
+        <w:spacing w:after="0"/>
+        <w:ind w:firstLine="204"/>
+        <w:jc w:val="both"/>
+      </w:pPr>
+      <w:r>
+        <w:t>The dynamic program runs inside the anchor-constrained window, so its cost is O(W·m) for window W and m anchors, with a traceback that recovers the chain itself. A candidate is confirmed when the best chain reaches ρ times the query length. Algorithm 1 assembles the full pipeline.</w:t>
       </w:r>
     </w:p>
     <w:p>
@@ -983,7 +1073,7 @@
         <w:jc w:val="both"/>
       </w:pPr>
       <w:r>
-        <w:t>Corpus. The Lakh MIDI dataset [7] (mirrored parquet export), up to 174,300 pieces encoded as item sets; the adversarial suite uses the first 3,000 pieces of shard 0. The GigaMIDI corpus [21] indicates that symbolic collections at the million-piece scale are now routine, which is the operating regime the screen layer is built for. Planted copies. Spans of 2/4/8/16 seconds are extracted from donor pieces and subjected to six transformation families: verbatim, transposition (±1–6 semitones), tempo scale (1.05–1.20), note split/merge, re-instrumentation with voice dropping, and a transcription model combining onset jitter with note dropout. Hard negatives. For each query, the 20 most style-similar corpus pieces by a duration-weighted pitch-class histogram are collected as a negative pool; pairs whose verbatim evidence against the whole donor exceeds 30 items are removed as true duplicates. Fragments whose extracted span, or whose encoded item set, contains fewer than 8 notes or items are skipped, so the valid-fragment count differs slightly between experiment generations (238 in screening, 236 in confirmation, 233 in the cascade suite). Baselines. Set-Jaccard corpus scan, SIATEC-family pattern discovery [2], and n-gram Jaccard (Section V-A); FIM engines from our prior work [31], [32] serve as enumeration baselines.</w:t>
+        <w:t xml:space="preserve">Corpus. The Lakh MIDI dataset [7] (mirrored parquet export), up to 174,300 pieces encoded as item sets; the adversarial suite uses the first 3,000 pieces of shard 0. The GigaMIDI corpus [21] indicates that symbolic collections at the million-piece scale are now routine, which is the operating regime the screen layer is built for. </w:t>
       </w:r>
     </w:p>
     <w:p>
@@ -993,7 +1083,7 @@
         <w:jc w:val="both"/>
       </w:pPr>
       <w:r>
-        <w:t>Environment. All experiments run on a single commodity workstation (12th-generation Intel Core i9, 128 GB RAM) in pure Python 3.12 with NumPy; no GPU accelerates any stage, so all latencies are conservative CPU-only figures. Every experiment is scripted end to end: the released pipeline re-downloads the corpus shards, rebuilds the index, regenerates every table and figure, and reproduces the manuscript numbers from scratch.</w:t>
+        <w:t xml:space="preserve">Planted copies. Spans of 2/4/8/16 seconds are extracted from donor pieces and subjected to six transformation families: verbatim, transposition (±1–6 semitones), tempo scale (1.05–1.20), note split/merge, re-instrumentation with voice dropping, and a transcription model combining onset jitter with note dropout. </w:t>
       </w:r>
     </w:p>
     <w:p>
@@ -1003,7 +1093,37 @@
         <w:jc w:val="both"/>
       </w:pPr>
       <w:r>
-        <w:t>Operating parameters. Table I summarizes the production configuration used unless a section states otherwise; the ablations of Section V-F justify each choice.</w:t>
+        <w:t xml:space="preserve">Hard negatives. For each query, the 20 most style-similar corpus pieces by a duration-weighted pitch-class histogram are collected as a negative pool; pairs whose verbatim evidence against the whole donor exceeds 30 items are removed as true duplicates. Fragments whose extracted span, or whose encoded item set, contains fewer than 8 notes or items are skipped, so the valid-fragment count differs slightly between experiment generations (238 in screening, 236 in confirmation, 233 in the cascade suite). </w:t>
+      </w:r>
+    </w:p>
+    <w:p>
+      <w:pPr>
+        <w:spacing w:after="0"/>
+        <w:ind w:firstLine="204"/>
+        <w:jc w:val="both"/>
+      </w:pPr>
+      <w:r>
+        <w:t>Baselines. Set-Jaccard corpus scan, SIATEC-family pattern discovery [2], and n-gram Jaccard (Section V-A); FIM engines from our prior work [31], [32] serve as enumeration baselines.</w:t>
+      </w:r>
+    </w:p>
+    <w:p>
+      <w:pPr>
+        <w:spacing w:after="0"/>
+        <w:ind w:firstLine="204"/>
+        <w:jc w:val="both"/>
+      </w:pPr>
+      <w:r>
+        <w:t>Environment. All experiments run on a single commodity workstation (12th-generation Intel Core i9, 128 GB RAM) in pure Python 3.12 with NumPy; no GPU accelerates any stage, so all latencies are conservative CPU-only figures. Every experiment is scripted end to end: the released pipeline re-downloads the corpus shards, rebuilds the index, regenerates every table and figure, and reproduces the manuscript numbers from scratch.</w:t>
+      </w:r>
+    </w:p>
+    <w:p>
+      <w:pPr>
+        <w:spacing w:after="0"/>
+        <w:ind w:firstLine="204"/>
+        <w:jc w:val="both"/>
+      </w:pPr>
+      <w:r>
+        <w:t>Operating parameters. Table II summarizes the production configuration used unless a section states otherwise; the ablations of Section V-F justify each choice.</w:t>
       </w:r>
     </w:p>
     <w:p>
@@ -1012,7 +1132,7 @@
         <w:keepNext/>
       </w:pPr>
       <w:r>
-        <w:t>TABLE I.</w:t>
+        <w:t>TABLE II.</w:t>
       </w:r>
     </w:p>
     <w:p>
@@ -1603,7 +1723,7 @@
         <w:jc w:val="both"/>
       </w:pPr>
       <w:r>
-        <w:t>Fig. 3 reports scaling on subsampled corpora and Table II gives the corresponding numbers. Index build reaches 24.747 s at 174,300 pieces and query latency 41.94 ms (p50), with planted recall 100% at every size. The set-Jaccard scan, the strongest naive baseline, is already 20× slower than the screen at 10k pieces (238 ms vs. 12 ms p50) and infeasible beyond it. MinHash-LSH (128 permutations, 16 bands x 8 rows), the standard accelerated form of the same set-Jaccard semantics, scales gracefully in isolation—173 s of signature construction plus 91 s of bucket building, 587 MB, 6 ms p50 at 174,300 pieces—yet retrieves none of the planted donors at any corpus size (0/47 at tau = 0.10; identical at tau = 0.05 and 0.20): the S-curve of the band configuration activates only above Jaccard ~0.7, while a contained span of 40 items inside a ~700-item query reaches Jaccard ~0.1 at best, so the index answers every query with an empty candidate set. Section V-G analyses this geometry directly on the recall-matrix protocol. Corpus-side FIM enumeration—the engines of our previous work [31], [32]—was measured infeasible at the support levels copying detection requires (over 11 million frequent pairs at N=300 under the standard cutoff), which is precisely why the architecture places FIM semantics on the query side.</w:t>
+        <w:t>Fig. 3 reports scaling on subsampled corpora and Table I gives the corresponding numbers. Index build reaches 24.747 s at 174,300 pieces and query latency 41.94 ms (p50), with planted recall 100% at every size. The set-Jaccard scan, the strongest naive baseline, is already 20× slower than the screen at 10k pieces (238 ms vs. 12 ms p50) and infeasible beyond it. MinHash-LSH (128 permutations, 16 bands x 8 rows), the standard accelerated form of the same set-Jaccard semantics, scales gracefully in isolation—173 s of signature construction plus 91 s of bucket building, 587 MB, 6 ms p50 at 174,300 pieces—yet retrieves none of the planted donors at any corpus size (0/47 at tau = 0.10; identical at tau = 0.05 and 0.20): the S-curve of the band configuration activates only above Jaccard ~0.7, while a contained span of 40 items inside a ~700-item query reaches Jaccard ~0.1 at best, so the index answers every query with an empty candidate set. Section V-G analyses this geometry directly on the recall-matrix protocol. Corpus-side FIM enumeration—the engines of our previous work [31], [32]—was measured infeasible at the support levels copying detection requires (over 11 million frequent pairs at N=300 under the standard cutoff), which is precisely why the architecture places FIM semantics on the query side.</w:t>
       </w:r>
     </w:p>
     <w:p>
@@ -1678,7 +1798,7 @@
         <w:keepNext/>
       </w:pPr>
       <w:r>
-        <w:t>TABLE II.</w:t>
+        <w:t>TABLE I.</w:t>
       </w:r>
     </w:p>
     <w:p>
@@ -8724,7 +8844,17 @@
         <w:jc w:val="both"/>
       </w:pPr>
       <w:r>
-        <w:t>On the hard-negative pools, the tolerant screen alone produces a 93% fragment-level false-positive rate, and raising the threshold cannot repair it: recall falls below 80% before the false-positive rate reaches 43%. Verbatim counts alone rank well (donor in top-20: 93.7%) but still flag 22% of fragments. Fig. 7 and Table VI break the phenomenon down by donor-margin distribution and fragment length. This is a property of item-level encodings—pop repertoire shares large amounts of grid-quantized material—and it motivates the confirmation layer. Sample sizes are small (238 fragments; 95% half-width ≈ 1.8 pp near 2% incidence and ≈ 6.3 pp near 50%), so we treat single-percentage-point differences as ties and rely on margins larger than the half-width.</w:t>
+        <w:t xml:space="preserve">On the hard-negative pools, the tolerant screen alone produces a 93% fragment-level false-positive rate, and raising the threshold cannot repair it: recall falls below 80% before the false-positive rate reaches 43%. Verbatim counts alone rank well (donor in top-20: 93.7%) but still flag 22% of fragments. Fig. 7 and Table VI break the phenomenon down by donor-margin distribution and fragment length. This is a property of item-level encodings—pop repertoire shares large amounts of grid-quantized material—and it motivates the confirmation layer. </w:t>
+      </w:r>
+    </w:p>
+    <w:p>
+      <w:pPr>
+        <w:spacing w:after="0"/>
+        <w:ind w:firstLine="204"/>
+        <w:jc w:val="both"/>
+      </w:pPr>
+      <w:r>
+        <w:t>Sample sizes are small (238 fragments; 95% half-width ≈ 1.8 pp near 2% incidence and ≈ 6.3 pp near 50%), so we treat single-percentage-point differences as ties and rely on margins larger than the half-width.</w:t>
       </w:r>
     </w:p>
     <w:p>
@@ -9412,7 +9542,7 @@
         <w:jc w:val="both"/>
       </w:pPr>
       <w:r>
-        <w:t>Strict-tolerance chain confirmation reaches a 2.1% fragment-level false-positive rate at 83.9% recall (ρ=0.5), and 7.2% at 98.3% recall (ρ=0.4); Table VII and Fig. 8 map the full recall/FP trade-off over three anchor-tolerance regimes and four contiguity thresholds. Table VIII places the full cascade against its single-layer ablations. The cascade's remaining bottleneck is candidate retention: verbatim top-C keeps 93.1% (C=20) and 96.6% (C=50) of donors; the union of tolerant and verbatim top-C feeds—adopted in the final system—lifts retention above 99%.</w:t>
+        <w:t>Strict-tolerance chain confirmation reaches a 2.1% fragment-level false-positive rate at 83.9% recall (ρ=0.5), and 7.2% at 98.3% recall (ρ=0.4); Table VII and Fig. 8 map the full recall/FP trade-off over three anchor-tolerance regimes and four contiguity thresholds. Table VIII and Fig. 9 place the full cascade against its single-layer ablations. The cascade's remaining bottleneck is candidate retention: verbatim top-C keeps 93.1% (C=20) and 96.6% (C=50) of donors; the union of tolerant and verbatim top-C feeds—adopted in the final system—lifts retention above 99%.</w:t>
       </w:r>
     </w:p>
     <w:p>
@@ -12164,7 +12294,17 @@
         <w:jc w:val="both"/>
       </w:pPr>
       <w:r>
-        <w:t>Why does the LSH index return nothing? The reason is geometric, not engineering. A planted query of the recall matrix embeds a 40-item span in 300 noise items and probes a corpus of pieces of ~700 items each, so even a perfect set-Jaccard oracle scores the donor at only 0.04 / 0.10 / 0.20 (quartiles over the 337 cells; Fig. 11(a)); just 168 of 337 donors reach Jaccard 0.10. Jaccard measures relative overlap, so a contained copy is structurally invisible to it no matter how faithfully the 40 shared items are preserved. Tuning the band configuration moves the operating point along a recall-versus-candidate-volume trade-off, not past it (Table X): with the standard 16 x 8 bands at tau = 0.10 the donor survives screening in 0.6% of cells; re-tuning to 2 rows x 64 bands—an S-curve threshold near 0.12, the textbook choice for this regime—raises donor survival to 51.9% but still confirms only 43.6%, because the remaining donors fall below the threshold by construction; dropping to 1 row x 128 bands at tau = 0.05 recovers the donor in 95.8% of cells, at the price of returning a median of 518 of 1,000 candidates per query, of which a median of 9 pass tau = 0.05 by chance. Either way the screen that certifies 99.1% recall on the same 337 cells is unreachable: set-similarity semantics, accelerated or not, do not express containment.</w:t>
+        <w:t xml:space="preserve">Why does the LSH index return nothing? The reason is geometric, not engineering. A planted query of the recall matrix embeds a 40-item span in 300 noise items and probes a corpus of pieces of ~700 items each, so even a perfect set-Jaccard oracle scores the donor at only 0.04 / 0.10 / 0.20 (quartiles over the 337 cells; Fig. 11(a)); just 168 of 337 donors reach Jaccard 0.10. Jaccard measures relative overlap, so a contained copy is structurally invisible to it no matter how faithfully the 40 shared items are preserved. </w:t>
+      </w:r>
+    </w:p>
+    <w:p>
+      <w:pPr>
+        <w:spacing w:after="0"/>
+        <w:ind w:firstLine="204"/>
+        <w:jc w:val="both"/>
+      </w:pPr>
+      <w:r>
+        <w:t>Tuning the band configuration moves the operating point along a recall-versus-candidate-volume trade-off, not past it (Table X): with the standard 16 x 8 bands at tau = 0.10 the donor survives screening in 0.6% of cells; re-tuning to 2 rows x 64 bands—an S-curve threshold near 0.12, the textbook choice for this regime—raises donor survival to 51.9% but still confirms only 43.6%, because the remaining donors fall below the threshold by construction; dropping to 1 row x 128 bands at tau = 0.05 recovers the donor in 95.8% of cells, at the price of returning a median of 518 of 1,000 candidates per query, of which a median of 9 pass tau = 0.05 by chance. Either way the screen that certifies 99.1% recall on the same 337 cells is unreachable: set-similarity semantics, accelerated or not, do not express containment.</w:t>
       </w:r>
     </w:p>
     <w:p>
@@ -12842,7 +12982,17 @@
         <w:jc w:val="both"/>
       </w:pPr>
       <w:r>
-        <w:t>We emulate generative-model memorization with an order-m pitch n-gram model mixed with a per-note copy operator at probability λ, sweeping m∈{2,4,8} and λ∈{0, 0.25, ..., 1}; 750 generated pieces are screened with the production cascade. Detection (Fig. 12, Table XI) rises monotonically: 26-34% at λ=0—these residual hits are style-level shared structures, attributed to the source piece in only 2-4% of cases—through 44-56% at λ=0.5, to 100% at λ=1 with 96-100% correct source attribution. Fragmented partial memorization (λ=0.25, per-note Bernoulli copies) escapes the contiguity threshold: an honest boundary of chain-based confirmation that mirrors the distributed-memorization blind spot of sequential detectors.  Section VI-D replaces the emulator with an actually trained transformer and asks whether real overfitting reproduces this spectrum.</w:t>
+        <w:t xml:space="preserve">We emulate generative-model memorization with an order-m pitch n-gram model mixed with a per-note copy operator at probability λ, sweeping m∈{2,4,8} and λ∈{0, 0.25, ..., 1}; 750 generated pieces are screened with the production cascade. Detection (Fig. 12, Table XI) rises monotonically: 26-34% at λ=0—these residual hits are style-level shared structures, attributed to the source piece in only 2-4% of cases—through 44-56% at λ=0.5, to 100% at λ=1 with 96-100% correct source attribution. </w:t>
+      </w:r>
+    </w:p>
+    <w:p>
+      <w:pPr>
+        <w:spacing w:after="0"/>
+        <w:ind w:firstLine="204"/>
+        <w:jc w:val="both"/>
+      </w:pPr>
+      <w:r>
+        <w:t>Fragmented partial memorization (λ=0.25, per-note Bernoulli copies) escapes the contiguity threshold: an honest boundary of chain-based confirmation that mirrors the distributed-memorization blind spot of sequential detectors.  Section VI-D replaces the emulator with an actually trained transformer and asks whether real overfitting reproduces this spectrum.</w:t>
       </w:r>
     </w:p>
     <w:p>
@@ -14039,7 +14189,7 @@
         <w:jc w:val="both"/>
       </w:pPr>
       <w:r>
-        <w:t>Scaling the case-study protocol to the full corpus (174,300 pieces) turns the candidate flood from anecdote into measurement.  Every eighth piece serves as a query against the whole corpus (20,801 non-trivial queries per channel; all counts extrapolate 8×), under the same dual exact/interval-sketch configuration (min-evidence 40, k=0).  Fig. 14(a) shows the candidate population by relative-score band.  At the absolute ≥40-evidence floor the two channels report 10.0B (exact) and 16.6B (sketch) candidate pairs; at the case-study operating point (relative ≥0.35) the total is 5.63B.  A self-screen of the whole corpus at the observed per-query cost (median 27 ms exact, 56 ms sketch, p95 74/122 ms; one core) completes in roughly four hours.</w:t>
+        <w:t xml:space="preserve">Scaling the case-study protocol to the full corpus (174,300 pieces) turns the candidate flood from anecdote into measurement.  Every eighth piece serves as a query against the whole corpus (20,801 non-trivial queries per channel; all counts extrapolate 8×), under the same dual exact/interval-sketch configuration (min-evidence 40, k=0).  Fig. 14(a) shows the candidate population by relative-score band.  At the absolute ≥40-evidence floor the two channels report 10.0B (exact) and 16.6B (sketch) candidate pairs; at the case-study operating point (relative ≥0.35) the total is 5.63B. </w:t>
       </w:r>
     </w:p>
     <w:p>
@@ -14049,7 +14199,27 @@
         <w:jc w:val="both"/>
       </w:pPr>
       <w:r>
-        <w:t>How much of this flood is real?  We stored the audit-grade subset—exact pairs with relative score ≥0.70 (284,035 after cross-channel dedup) and sketch pairs with relative score ≥0.90 (525,756)—and adjudicated a stratified random sample (40 pairs per stratum) with the Layer-2 chain criterion, run in both directions with transposition fallback (Table XIII, Fig. 14(b)).  The exact channel is a high-precision instrument at the top of its range: 90% of exact pairs with relative score ≥0.90 are confirmed copies (Wilson 95% CI [77, 96]%), and even its 0.70–0.90 band confirms 48%.  The interval-sketch channel stays recall-oriented: only 40% of its ≥0.90 candidates confirm, so sketch hits should be treated as leads for confirmation, not verdicts—exactly the division of labor the two-layer architecture encodes.</w:t>
+        <w:t>A self-screen of the whole corpus at the observed per-query cost (median 27 ms exact, 56 ms sketch, p95 74/122 ms; one core) completes in roughly four hours.</w:t>
+      </w:r>
+    </w:p>
+    <w:p>
+      <w:pPr>
+        <w:spacing w:after="0"/>
+        <w:ind w:firstLine="204"/>
+        <w:jc w:val="both"/>
+      </w:pPr>
+      <w:r>
+        <w:t xml:space="preserve">How much of this flood is real?  We stored the audit-grade subset—exact pairs with relative score ≥0.70 (284,035 after cross-channel dedup) and sketch pairs with relative score ≥0.90 (525,756)—and adjudicated a stratified random sample (40 pairs per stratum) with the Layer-2 chain criterion, run in both directions with transposition fallback (Table XIII, Fig. 14(b)). </w:t>
+      </w:r>
+    </w:p>
+    <w:p>
+      <w:pPr>
+        <w:spacing w:after="0"/>
+        <w:ind w:firstLine="204"/>
+        <w:jc w:val="both"/>
+      </w:pPr>
+      <w:r>
+        <w:t>The exact channel is a high-precision instrument at the top of its range: 90% of exact pairs with relative score ≥0.90 are confirmed copies (Wilson 95% CI [77, 96]%), and even its 0.70–0.90 band confirms 48%.  The interval-sketch channel stays recall-oriented: only 40% of its ≥0.90 candidates confirm, so sketch hits should be treated as leads for confirmation, not verdicts—exactly the division of labor the two-layer architecture encodes.</w:t>
       </w:r>
     </w:p>
     <w:p>
@@ -14642,7 +14812,7 @@
         <w:jc w:val="both"/>
       </w:pPr>
       <w:r>
-        <w:t>E6.2 emulates a generative model with an n-gram/copy operator; we now replace the emulator with an actual trained one.  A 934,824-parameter decoder-only transformer (520 epochs on 250 Lakh pieces, production tokenization) reaches train loss 3.5 nats against 7.0 held-out—a 3.5-nat generalization gap, i.e., genuine overfitting.  Per-piece held likelihood separates trained from never-trained pieces almost perfectly (3.5 vs. 6.9 nats mean, AUC = 0.94), and the most-memorized pieces sit at 0.31 nats—the model demonstrably knows them.  Yet open-ended sampling does not regurgitate them: across 25 calibration probes seeded from pieces spanning the full memorization range, position-wise pitch agreement with the true continuation averages 4% (max 12%) and 4-gram overlap peaks at 10% (Fig. 15(b)).  Sampling at temperature 0.8 diverges from memorized content almost immediately.</w:t>
+        <w:t xml:space="preserve">E6.2 emulates a generative model with an n-gram/copy operator; we now replace the emulator with an actual trained one.  A 934,824-parameter decoder-only transformer (520 epochs on 250 Lakh pieces, production tokenization) reaches train loss 3.5 nats against 7.0 held-out—a 3.5-nat generalization gap, i.e., genuine overfitting.  Per-piece held likelihood separates trained from never-trained pieces almost perfectly (3.5 vs. 6.9 nats mean, AUC = 0.94), and the most-memorized pieces sit at 0.31 nats—the model demonstrably knows them. </w:t>
       </w:r>
     </w:p>
     <w:p>
@@ -14652,7 +14822,27 @@
         <w:jc w:val="both"/>
       </w:pPr>
       <w:r>
-        <w:t>The production cascade agrees with this reading (Table XIV): 60 continuations—20 seeded from the most-memorized pieces, 20 from never-trained controls, 20 from random trained pieces—confirm at 40% / 40% / 35% with source attribution near chance in every group, the same style-level confirmation band as the copy-free (lambda = 0) cells of Table XI.  In other words, a real overfit transformer at this scale behaves, from the detector's viewpoint, like the lambda = 0 corner of the emulated spectrum—and unlike lambda = 1, which confirms and attributes at 98–100%.  The conclusion cuts both ways: extractive regurgitation, the family that generation-side audits can exhibit to a copy detector, is captured by the n-gram/copy emulation; but memorization that sampling never surfaces—the 0.3-nat pieces—is invisible to output inspection of any kind, and only likelihood ranking exposes it.  Copy detection and memorization auditing are complementary instruments, not substitutes.</w:t>
+        <w:t>Yet open-ended sampling does not regurgitate them: across 25 calibration probes seeded from pieces spanning the full memorization range, position-wise pitch agreement with the true continuation averages 4% (max 12%) and 4-gram overlap peaks at 10% (Fig. 15(b)).  Sampling at temperature 0.8 diverges from memorized content almost immediately.</w:t>
+      </w:r>
+    </w:p>
+    <w:p>
+      <w:pPr>
+        <w:spacing w:after="0"/>
+        <w:ind w:firstLine="204"/>
+        <w:jc w:val="both"/>
+      </w:pPr>
+      <w:r>
+        <w:t xml:space="preserve">The production cascade agrees with this reading (Table XIV): 60 continuations—20 seeded from the most-memorized pieces, 20 from never-trained controls, 20 from random trained pieces—confirm at 40% / 40% / 35% with source attribution near chance in every group, the same style-level confirmation band as the copy-free (lambda = 0) cells of Table XI. </w:t>
+      </w:r>
+    </w:p>
+    <w:p>
+      <w:pPr>
+        <w:spacing w:after="0"/>
+        <w:ind w:firstLine="204"/>
+        <w:jc w:val="both"/>
+      </w:pPr>
+      <w:r>
+        <w:t>In other words, a real overfit transformer at this scale behaves, from the detector's viewpoint, like the lambda = 0 corner of the emulated spectrum—and unlike lambda = 1, which confirms and attributes at 98–100%.  The conclusion cuts both ways: extractive regurgitation, the family that generation-side audits can exhibit to a copy detector, is captured by the n-gram/copy emulation; but memorization that sampling never surfaces—the 0.3-nat pieces—is invisible to output inspection of any kind, and only likelihood ranking exposes it.  Copy detection and memorization auditing are complementary instruments, not substitutes.</w:t>
       </w:r>
     </w:p>
     <w:p>
@@ -15572,7 +15762,7 @@
         <w:jc w:val="both"/>
       </w:pPr>
       <w:r>
-        <w:t>Three boundaries are worth stating plainly. First, item-set containment is a recall instrument; any deployment that treats its counts as verdicts will over-flag exactly the repertoire it is meant to protect. Second, chain-based confirmation requires contiguity: copies fragmented below the ρ threshold evade detection, so the system's proper role is high-precision screening with evidence, not autonomous adjudication. Third, the guarantees are conditional on the declared noise model; transformations outside tolerance (large transposition without sketch retrieval, heavy swing quantization) must be covered by model extensions rather than threshold tweaking.</w:t>
+        <w:t xml:space="preserve">Three boundaries are worth stating plainly. First, item-set containment is a recall instrument; any deployment that treats its counts as verdicts will over-flag exactly the repertoire it is meant to protect. Second, chain-based confirmation requires contiguity: copies fragmented below the ρ threshold evade detection, so the system's proper role is high-precision screening with evidence, not autonomous adjudication. </w:t>
       </w:r>
     </w:p>
     <w:p>
@@ -15582,7 +15772,7 @@
         <w:jc w:val="both"/>
       </w:pPr>
       <w:r>
-        <w:t>Threats to validity. The planted transformations are parametric approximations of real reuse: actual audio-to-MIDI transcription errors are correlated (a misaligned beat grid shifts many notes together), which our jitter model under-represents, and human-made covers vary by arrangement choices no parametric family captures. Hard negatives are harvested by pitch-class histogram similarity, which finds harmonically confusable peers but may miss style-similar pairs with different key distributions; the memorization study spans both a transparent n-gram/copy emulation and an actually trained generator, but the latter is a 0.9M-parameter CPU-scale transformer whose memorization is non-extractive—larger generators that regurgitate verbatim would move samples toward the lambda = 1 corner of Table XIV rather than challenge the detection physics; and the in-the-wild census, while spanning the full 174,300-piece corpus, rests on a 1/8 systematic sample of queries and a 120-pair adjudication audit whose verdicts are automatic (chain criterion), not human, and examines one corpus lineage. We regard the cell-by-cell bound audit and the per-length hard-negative breakdown as the load-bearing evidence, because both are exhaustive over their stated domains rather than sampled.</w:t>
+        <w:t>Third, the guarantees are conditional on the declared noise model; transformations outside tolerance (large transposition without sketch retrieval, heavy swing quantization) must be covered by model extensions rather than threshold tweaking.</w:t>
       </w:r>
     </w:p>
     <w:p>
@@ -15592,7 +15782,37 @@
         <w:jc w:val="both"/>
       </w:pPr>
       <w:r>
-        <w:t>Deployment and responsible use. Operationally, the index accepts incremental piece insertions without rebuild, and the anytime budget lets a screening queue trade recall headroom against throughput at busy times — the open-set size reported after every query is a directly schedulable quantity. An adversary who learns the declared tolerance can in principle evade by exceeding it; the honest response is to widen the envelope (coarser tolerance, interval-sketch retrieval) and re-audit, which the cell-by-cell methodology supports cheaply. Finally, the system's output is evidence for a human decision, not a legal determination: a confirmed chain localizes shared material and estimates transposition, while questions of access, originality, and substantial similarity remain with adjudicators [20], [30]. All code and experiment scripts are released to make every number in this paper independently reproducible.</w:t>
+        <w:t xml:space="preserve">Threats to validity. The planted transformations are parametric approximations of real reuse: actual audio-to-MIDI transcription errors are correlated (a misaligned beat grid shifts many notes together), which our jitter model under-represents, and human-made covers vary by arrangement choices no parametric family captures. Hard negatives are harvested by pitch-class histogram similarity, which finds harmonically confusable peers but may miss style-similar pairs with different key distributions. </w:t>
+      </w:r>
+    </w:p>
+    <w:p>
+      <w:pPr>
+        <w:spacing w:after="0"/>
+        <w:ind w:firstLine="204"/>
+        <w:jc w:val="both"/>
+      </w:pPr>
+      <w:r>
+        <w:t>The memorization study spans both a transparent n-gram/copy emulation and an actually trained generator, but the latter is a 0.9M-parameter CPU-scale transformer whose memorization is non-extractive—larger generators that regurgitate verbatim would move samples toward the lambda = 1 corner of Table XIV rather than challenge the detection physics; and the in-the-wild census, while spanning the full 174,300-piece corpus, rests on a 1/8 systematic sample of queries and a 120-pair adjudication audit whose verdicts are automatic (chain criterion), not human, and examines one corpus lineage. We regard the cell-by-cell bound audit and the per-length hard-negative breakdown as the load-bearing evidence, because both are exhaustive over their stated domains rather than sampled.</w:t>
+      </w:r>
+    </w:p>
+    <w:p>
+      <w:pPr>
+        <w:spacing w:after="0"/>
+        <w:ind w:firstLine="204"/>
+        <w:jc w:val="both"/>
+      </w:pPr>
+      <w:r>
+        <w:t xml:space="preserve">Deployment and responsible use. Operationally, the index accepts incremental piece insertions without rebuild, and the anytime budget lets a screening queue trade recall headroom against throughput at busy times — the open-set size reported after every query is a directly schedulable quantity. An adversary who learns the declared tolerance can in principle evade by exceeding it; the honest response is to widen the envelope (coarser tolerance, interval-sketch retrieval) and re-audit, which the cell-by-cell methodology supports cheaply. </w:t>
+      </w:r>
+    </w:p>
+    <w:p>
+      <w:pPr>
+        <w:spacing w:after="0"/>
+        <w:ind w:firstLine="204"/>
+        <w:jc w:val="both"/>
+      </w:pPr>
+      <w:r>
+        <w:t>Finally, the system's output is evidence for a human decision, not a legal determination: a confirmed chain localizes shared material and estimates transposition, while questions of access, originality, and substantial similarity remain with adjudicators [20], [30]. All code and experiment scripts are released to make every number in this paper independently reproducible.</w:t>
       </w:r>
     </w:p>
     <w:p>

</xml_diff>

<commit_message>
Address low-cost reviewer comments: unify rho threshold notation, fix VI-C cross-ref, M2/M3/M4/M5 text, Table I note, Algorithm 1 layout, refs [33]-[36], correct [28] venue to SPW
</commit_message>
<xml_diff>
--- a/Manuscript.docx
+++ b/Manuscript.docx
@@ -128,7 +128,7 @@
           <w:b/>
           <w:sz w:val="18"/>
         </w:rPr>
-        <w:t>Detecting copied material in symbolic music corpora at publisher scale is hard because candidate systems must simultaneously guarantee recall over noisy transformations, stay interactive on hundreds of thousands of pieces, and produce evidence precise enough to support human adjudication. We show that no single item-level technique meets all three requirements, and we present a two-layer system that does: a tolerant item-set screening layer whose recall is provable (an evidence lower bound verified on every one of 337 adversarial cells with zero violations) and whose rare-first anytime schedule processes the corpus in query time that grows only with evidence, not with corpus size; and a strict structural confirmation layer that aligns ordered note chains and reduces the fragment-level false-positive rate on style-similar hard negatives to 2.1% while retaining 83.9% recall under transcription noise. On a 174,300-piece corpus the index builds in 24.747 s and answers queries in 41.94 ms (p50) at 100% planted recall. In controlled memorization experiments, detection rises monotonically from 26-34% at zero copying to 100% at full verbatim regurgitation, with 96-100% correct attribution to the source piece. Case studies on 1,658,993 in-the-wild duplicate pairs show the system localizing spliced segments and transposed covers with publisher-readable alignment evidence.</w:t>
+        <w:t>Detecting copied material in symbolic music corpora at publisher scale is hard because candidate systems must simultaneously guarantee recall over noisy transformations, stay interactive on hundreds of thousands of pieces, and produce evidence precise enough to support human adjudication. We show that no single-layer method—permissive item-level or strict structural—meets all three requirements, and we present a two-layer system that does: a tolerant item-set screening layer whose recall is provable (an evidence lower bound verified on every one of 337 adversarial cells with zero violations) and whose rare-first anytime schedule answers queries in time driven by the evidence rather than by a corpus scan; and a strict structural confirmation layer that aligns ordered note chains and reduces the fragment-level false-positive rate on style-similar hard negatives to 2.1% while retaining 83.9% recall under transcription noise. On a 174,300-piece corpus the index builds in 24.7 s and answers queries in 41.9 ms (p50) at 100% planted recall. In controlled memorization experiments, detection rises monotonically from 26-34% at zero copying to 100% at full verbatim regurgitation, with 96-100% correct attribution to the source piece. Case studies on 1,658,993 in-the-wild duplicate pairs show the system localizing spliced segments and transposed covers with publisher-readable alignment evidence.</w:t>
       </w:r>
     </w:p>
     <w:p>
@@ -370,7 +370,7 @@
         <w:rPr>
           <w:sz w:val="19"/>
         </w:rPr>
-        <w:t>Fig. 1. The evidence funnel of the proposed pipeline, with one query traced end to end (amber markers). Left: the Lakh MIDI corpus is encoded once into a rare-first item-set index (1.05 GB, 41.9 ms p50). Center: the L1 tolerant screen enumerates 1.66 M candidates under an anytime budget with a per-prefix recall floor (Thm 1). Right: L3 structural confirmation aligns ordered note chains—invariant to pitch, tempo, and splicing—and certifies the copied span (ρ = 0.62 ≥ θ) as a publisher-readable verdict.</w:t>
+        <w:t>Fig. 1. The evidence funnel of the proposed pipeline, with one query traced end to end (amber markers). Left: the Lakh MIDI corpus is encoded once into a rare-first item-set index (1.05 GB, 41.9 ms p50). Center: the L1 tolerant screen enumerates 1.66 M candidates under an anytime budget with a per-prefix recall floor (Thm 1). Right: L3 structural confirmation aligns ordered note chains—invariant to pitch, tempo, and splicing—and certifies the copied span (ρ = 0.62 ≥ 0.5) as a publisher-readable verdict.</w:t>
       </w:r>
     </w:p>
     <w:p>
@@ -474,6 +474,16 @@
       </w:pPr>
       <w:r>
         <w:t>Zilberstein [8] formalized anytime algorithms: interruptible procedures whose intermediate results improve monotonically and can be accompanied by a bound on unexplored outcomes. Our screen adopts this contract at the level of evidence items: after any prefix of the rare-first schedule, the set of pieces that can still reach the threshold is exactly computable, which turns an engineering heuristic into a guarantee a publisher can schedule around.</w:t>
+      </w:r>
+    </w:p>
+    <w:p>
+      <w:pPr>
+        <w:spacing w:after="0"/>
+        <w:ind w:firstLine="204"/>
+        <w:jc w:val="both"/>
+      </w:pPr>
+      <w:r>
+        <w:t>The bound instantiates a classical pattern. Threshold algorithms for top-k aggregation [33] maintain a partial-score bound under which no unseen candidate can qualify, and branch-and-bound search [34] carries an admissible estimate of everything not yet explored. Theorem 1 transfers this contract to tolerant item-set evidence: because every unprocessed position can contribute at most one to any piece, score_u(P) + (q − u) plays the role of the partial bound, with tolerance turning it into a certified floor on final evidence rather than an optimistic estimate. We are not aware of an evidence bound of this form stated and cell-by-cell audited for music retrieval.</w:t>
       </w:r>
     </w:p>
     <w:p>
@@ -557,7 +567,7 @@
         <w:rPr>
           <w:sz w:val="19"/>
         </w:rPr>
-        <w:t>Fig. 2. Two-layer copy detection pipeline. (a) A publisher-scale corpus is encoded once into a rare-first item-set index. (b) The L1 screen queries that index under an anytime budget with a provable recall lower bound (Thm 1, 337-cell audit). (c) L2 re-ranks and L3 confirms on ordered note chains, gating on ρ ≥ θ. (d) Confirmed matches ship as adjudicable reports; memorization and in-the-wild audits close the loop. Black arrows mark data flow; amber markers trace one query end to end.</w:t>
+        <w:t>Fig. 2. Two-layer copy detection pipeline. (a) A publisher-scale corpus is encoded once into a rare-first item-set index. (b) The L1 screen queries that index under an anytime budget with a provable recall lower bound (Thm 1, 337-cell audit). (c) L2 re-ranks and L3 confirms on ordered note chains, gating on ρ = 0.62 ≥ 0.5. (d) Confirmed matches ship as adjudicable reports; memorization and in-the-wild audits close the loop. Black arrows mark data flow; amber markers trace one query end to end.</w:t>
       </w:r>
     </w:p>
     <w:p>
@@ -682,7 +692,7 @@
         <w:jc w:val="both"/>
       </w:pPr>
       <w:r>
-        <w:t>Complexity. Index construction is O(Σ_P |S(P)|). A query touches, per position, the posting lists of all items in N_k, so query cost grows with evidence and vocabulary rarity, not with corpus size beyond postings; the open set is maintained in a Fenwick structure over piece IDs, giving O(log N) updates and an exact |O_u| readout after every position. Measured end to end, the index builds in 24.747 s and queries run at p50 = 41.94 ms on the full 174,300-piece corpus (Table I).</w:t>
+        <w:t>Complexity. Index construction is O(Σ_P |S(P)|). A query touches, per position, the posting lists of all items in N_k, so query cost grows with the length of the evidence and with the vocabulary mass inside the query's tolerance neighborhood, and grows with corpus size only through longer posting lists; the open set is maintained in a Fenwick structure over piece IDs, giving O(log N) updates and an exact |O_u| readout after every position. Measured end to end, the index builds in 24.747 s and queries run at p50 = 41.94 ms on the full 174,300-piece corpus (Table I).</w:t>
       </w:r>
     </w:p>
     <w:p>
@@ -743,6 +753,9 @@
         <w:gridCol w:w="10368"/>
       </w:tblGrid>
       <w:tr>
+        <w:trPr>
+          <w:cantSplit/>
+        </w:trPr>
         <w:tc>
           <w:tcPr>
             <w:tcW w:type="dxa" w:w="10368"/>
@@ -757,7 +770,7 @@
                 <w:rFonts w:ascii="Consolas" w:hAnsi="Consolas" w:eastAsia="Consolas"/>
                 <w:sz w:val="14"/>
               </w:rPr>
-              <w:t>Algorithm 1  Two-layer copy detection (query q, index</w:t>
+              <w:t>Algorithm 1  Two-layer copy detection (query q,</w:t>
             </w:r>
             <w:r>
               <w:br/>
@@ -767,7 +780,7 @@
                 <w:rFonts w:ascii="Consolas" w:hAnsi="Consolas" w:eastAsia="Consolas"/>
                 <w:sz w:val="14"/>
               </w:rPr>
-              <w:t xml:space="preserve">    I)</w:t>
+              <w:t xml:space="preserve">    index I)</w:t>
             </w:r>
             <w:r>
               <w:br/>
@@ -797,7 +810,7 @@
                 <w:rFonts w:ascii="Consolas" w:hAnsi="Consolas" w:eastAsia="Consolas"/>
                 <w:sz w:val="14"/>
               </w:rPr>
-              <w:t xml:space="preserve">        k_confirm = (1,0,0); threshold tau; contiguity</w:t>
+              <w:t xml:space="preserve">        k_confirm = (1,0,0); threshold tau;</w:t>
             </w:r>
             <w:r>
               <w:br/>
@@ -807,7 +820,7 @@
                 <w:rFonts w:ascii="Consolas" w:hAnsi="Consolas" w:eastAsia="Consolas"/>
                 <w:sz w:val="14"/>
               </w:rPr>
-              <w:t xml:space="preserve">    rho;</w:t>
+              <w:t xml:space="preserve">    contiguity rho;</w:t>
             </w:r>
             <w:r>
               <w:br/>
@@ -827,7 +840,7 @@
                 <w:rFonts w:ascii="Consolas" w:hAnsi="Consolas" w:eastAsia="Consolas"/>
                 <w:sz w:val="14"/>
               </w:rPr>
-              <w:t xml:space="preserve"> 1: order &lt;- positions of q sorted by |N_k(item_i)|</w:t>
+              <w:t xml:space="preserve"> 1: order &lt;- positions of q sorted by</w:t>
             </w:r>
             <w:r>
               <w:br/>
@@ -837,7 +850,7 @@
                 <w:rFonts w:ascii="Consolas" w:hAnsi="Consolas" w:eastAsia="Consolas"/>
                 <w:sz w:val="14"/>
               </w:rPr>
-              <w:t xml:space="preserve">    ascending</w:t>
+              <w:t xml:space="preserve">    |N_k(item_i)| ascending</w:t>
             </w:r>
             <w:r>
               <w:br/>
@@ -927,7 +940,7 @@
                 <w:rFonts w:ascii="Consolas" w:hAnsi="Consolas" w:eastAsia="Consolas"/>
                 <w:sz w:val="14"/>
               </w:rPr>
-              <w:t xml:space="preserve"> 9: C &lt;- top-C union of tolerant and verbatim rankings</w:t>
+              <w:t xml:space="preserve"> 9: C &lt;- top-C union of tolerant and verbatim</w:t>
             </w:r>
             <w:r>
               <w:br/>
@@ -937,7 +950,7 @@
                 <w:rFonts w:ascii="Consolas" w:hAnsi="Consolas" w:eastAsia="Consolas"/>
                 <w:sz w:val="14"/>
               </w:rPr>
-              <w:t xml:space="preserve">    of open</w:t>
+              <w:t xml:space="preserve">    rankings of open</w:t>
             </w:r>
             <w:r>
               <w:br/>
@@ -1103,7 +1116,7 @@
         <w:jc w:val="both"/>
       </w:pPr>
       <w:r>
-        <w:t>Baselines. Set-Jaccard corpus scan, SIATEC-family pattern discovery [2], and n-gram Jaccard (Section V-A); FIM engines from our prior work [31], [32] serve as enumeration baselines.</w:t>
+        <w:t>Baselines. Set-Jaccard corpus scan, SIATEC-family pattern discovery [2], and n-gram Jaccard (Section V-A); FIM engines from our prior work [31], [32] serve as enumeration baselines. Both engines are independent of the present system—they enumerate patterns corpus-side, whereas the screen verifies containment query-side—and serve here solely as feasibility references.</w:t>
       </w:r>
     </w:p>
     <w:p>
@@ -4121,6 +4134,18 @@
     </w:p>
     <w:p>
       <w:pPr>
+        <w:spacing w:before="0"/>
+      </w:pPr>
+      <w:r>
+        <w:rPr>
+          <w:rFonts w:ascii="Times New Roman" w:hAnsi="Times New Roman"/>
+          <w:sz w:val="16"/>
+        </w:rPr>
+        <w:t>Rows are corpus-size subsamples drawn across different experiment generations, so the piece counts are not a uniform ladder and build times are not monotone in row order; scaling conclusions rely on within-generation interpolation rather than on adjacent-row differences.</w:t>
+      </w:r>
+    </w:p>
+    <w:p>
+      <w:pPr>
         <w:pStyle w:val="Heading2"/>
       </w:pPr>
       <w:r>
@@ -9547,6 +9572,16 @@
     </w:p>
     <w:p>
       <w:pPr>
+        <w:spacing w:after="0"/>
+        <w:ind w:firstLine="204"/>
+        <w:jc w:val="both"/>
+      </w:pPr>
+      <w:r>
+        <w:t>Both metrics share one denominator: the 236 fragment queries of the confirmation suite, each a true transcription copy of one of the 80 donors. The recall numerator counts fragments whose donor is confirmed; the FP numerator counts fragments in which at least one non-donor piece is confirmed at the same threshold, so recall and FP are measured on exactly the same queries. The two contiguity anchors answer two different workflows: ρ = 0.5 (2.1% FP, 83.9% recall) is the decision-grade operating point, at which a confirmed flag can be acted on directly; ρ = 0.4 (7.2% FP, 98.3% recall) is the high-recall triage point for pre-filtering large corpora before human review. “Decision-grade” is used here in an operational sense: the threshold is fixed before measurement, applied uniformly across corpora, and the quoted error rate is the measured fragment-level FP on style-similar hard negatives rather than a per-corpus tuned value.</w:t>
+      </w:r>
+    </w:p>
+    <w:p>
+      <w:pPr>
         <w:pStyle w:val="TableTitle"/>
         <w:keepNext/>
       </w:pPr>
@@ -10661,7 +10696,7 @@
         <w:jc w:val="both"/>
       </w:pPr>
       <w:r>
-        <w:t>Ablations over the confirmation and screening components (threshold level, tolerance vector, grid granularity) are consistent: recall is flat at 100% wherever the guarantee applies; false positives and latency trade off along the tolerance vector exactly as the bound predicts; and finer grids monotonically reduce false positives at sub-linear vocabulary growth. Fig. 10 plots the three ablation families and Table IX tabulates them.</w:t>
+        <w:t>Ablations over the confirmation and screening components (threshold level, tolerance vector, grid granularity) are consistent: recall is flat at 100% wherever the guarantee applies; false positives and latency trade off along the tolerance vector exactly as the bound predicts; and finer grids monotonically reduce false positives at sub-linear vocabulary growth. The audit grid comprises 29 planted cells (30 random draws, one dropped because its planted span contained fewer than 8 notes), spanning the 4 s/16 s span lengths and four transformation families; the grid is fixed across all ablation settings, so every configuration is compared on identical evidence. Fig. 10 plots the three ablation families and Table IX tabulates them.</w:t>
       </w:r>
     </w:p>
     <w:p>
@@ -12294,7 +12329,7 @@
         <w:jc w:val="both"/>
       </w:pPr>
       <w:r>
-        <w:t xml:space="preserve">Why does the LSH index return nothing? The reason is geometric, not engineering. A planted query of the recall matrix embeds a 40-item span in 300 noise items and probes a corpus of pieces of ~700 items each, so even a perfect set-Jaccard oracle scores the donor at only 0.04 / 0.10 / 0.20 (quartiles over the 337 cells; Fig. 11(a)); just 168 of 337 donors reach Jaccard 0.10. Jaccard measures relative overlap, so a contained copy is structurally invisible to it no matter how faithfully the 40 shared items are preserved. </w:t>
+        <w:t xml:space="preserve">Why does the LSH index return nothing? The reason is geometric, not engineering. A planted query of the recall matrix embeds a 40-item span in 300 noise items and probes a corpus of pieces of ~700 items each, so even a perfect set-Jaccard oracle scores the donor at only 0.045 / 0.099 / 0.200 (quartiles over the 337 cells; Fig. 11(a)); just 168 of 337 donors reach Jaccard 0.10. Jaccard measures relative overlap, so a contained copy is structurally invisible to it no matter how faithfully the 40 shared items are preserved. </w:t>
       </w:r>
     </w:p>
     <w:p>
@@ -12305,6 +12340,16 @@
       </w:pPr>
       <w:r>
         <w:t>Tuning the band configuration moves the operating point along a recall-versus-candidate-volume trade-off, not past it (Table X): with the standard 16 x 8 bands at tau = 0.10 the donor survives screening in 0.6% of cells; re-tuning to 2 rows x 64 bands—an S-curve threshold near 0.12, the textbook choice for this regime—raises donor survival to 51.9% but still confirms only 43.6%, because the remaining donors fall below the threshold by construction; dropping to 1 row x 128 bands at tau = 0.05 recovers the donor in 95.8% of cells, at the price of returning a median of 518 of 1,000 candidates per query, of which a median of 9 pass tau = 0.05 by chance. Either way the screen that certifies 99.1% recall on the same 337 cells is unreachable: set-similarity semantics, accelerated or not, do not express containment.</w:t>
+      </w:r>
+    </w:p>
+    <w:p>
+      <w:pPr>
+        <w:spacing w:after="0"/>
+        <w:ind w:firstLine="204"/>
+        <w:jc w:val="both"/>
+      </w:pPr>
+      <w:r>
+        <w:t>Could containment-aware LSH close this gap? Containment estimators [35], [36] replace resemblance with the ratio |A ∩ B| / min(|A|, |B|), which in principle sees a contained copy; two obstacles remain. First, they still operate on unordered sets: containment is blind to note order exactly where our task is sequential, so a contained piece and a permuted collage of the same items are indistinguishable to it. Second, the estimator's variance explodes for small containing sets: a planted span of ~40 items yields MinHash sketches whose containment estimate is too noisy to threshold at the operating point our chain criterion certifies. A full containment-LSH baseline is therefore left as a baseline extension; the point of Table X is that no re-tuning of Jaccard-band geometry reaches the screen's recall, and containment estimators trade that impasse for variance rather than resolving it.</w:t>
       </w:r>
     </w:p>
     <w:p>
@@ -13625,7 +13670,7 @@
         <w:pStyle w:val="Heading2"/>
       </w:pPr>
       <w:r>
-        <w:t>B. Case studies in the wild</w:t>
+        <w:t>B. Case studies</w:t>
       </w:r>
     </w:p>
     <w:p>
@@ -14229,7 +14274,7 @@
         <w:jc w:val="both"/>
       </w:pPr>
       <w:r>
-        <w:t>Weighting each stratum by its precision, Lakh-full contains on the order of 107k verbatim-level duplicate pairs (exact ≥0.90), 1.0M further pairs in the exact 0.70–0.90 band, and 1.7M transposition/arrangement-level pairs reachable through the sketch channel—each a case a publisher would have to adjudicate, and each receiving note-level alignment evidence from the confirmation layer.  These estimates inherit the adjudicator's precision and recall (Section V-C); they are survey estimates from a 1/8 sample, not enumerations.</w:t>
+        <w:t>Weighting each stratum by its precision, Lakh-full contains on the order of 107k verbatim-level duplicate pairs (exact ≥0.90), 1.0M further pairs in the exact 0.70–0.90 band, and 1.7M transposition/arrangement-level pairs reachable through the sketch channel—each a case a publisher would have to adjudicate, and each receiving note-level alignment evidence from the confirmation layer.  These estimates inherit the precision and recall of the chain criterion measured in this section itself; they are survey estimates from a 1/8 sample, not enumerations.</w:t>
       </w:r>
     </w:p>
     <w:p>
@@ -15812,7 +15857,7 @@
         <w:jc w:val="both"/>
       </w:pPr>
       <w:r>
-        <w:t>Finally, the system's output is evidence for a human decision, not a legal determination: a confirmed chain localizes shared material and estimates transposition, while questions of access, originality, and substantial similarity remain with adjudicators [20], [30]. All code and experiment scripts are released to make every number in this paper independently reproducible.</w:t>
+        <w:t>Finally, the system's output is evidence for a human decision, not a legal determination: a confirmed chain localizes shared material and estimates transposition, while questions of access, originality, and substantial similarity remain with adjudicators [20], [30]. The expected utility of the system is bounded accordingly: it catches extractive regurgitation—copied spans a generator emits intact—but not distributed memorization, where influence is spread across a model without any recoverable span; that per-sample question is the complement of membership inference [23], and the two instruments are most credible when used together. All code and experiment scripts are released to make every number in this paper independently reproducible.</w:t>
       </w:r>
     </w:p>
     <w:p>
@@ -16090,7 +16135,7 @@
         <w:ind w:left="425" w:hanging="425"/>
       </w:pPr>
       <w:r>
-        <w:t>Y.-C. Liu, J. Yu, K. Cao, S. I. A. Meerza, et al., “Auditing training data in generative music models via black-box membership inference,” in Proc. IEEE Symp. Security and Privacy, 2026.</w:t>
+        <w:t>Y.-C. Liu, J. Yu, K. Cao, S. I. A. Meerza, et al., “Auditing training data in generative music models via black-box membership inference,” in Proc. IEEE Symp. Security and Privacy Workshops (SPW), 2026, pp. 230–237.</w:t>
       </w:r>
     </w:p>
     <w:p>
@@ -16127,6 +16172,42 @@
       </w:pPr>
       <w:r>
         <w:t>Y. Zhang et al., “TensorFIM: Exact maximal frequent itemset mining on tensor cores,” under review.</w:t>
+      </w:r>
+    </w:p>
+    <w:p>
+      <w:pPr>
+        <w:pStyle w:val="References"/>
+        <w:ind w:left="425" w:hanging="425"/>
+      </w:pPr>
+      <w:r>
+        <w:t>R. Fagin, A. Lotem, and M. Naor, “Optimal aggregation algorithms for middleware,” in Proc. ACM Symp. Principles of Database Systems (PODS), 2001.</w:t>
+      </w:r>
+    </w:p>
+    <w:p>
+      <w:pPr>
+        <w:pStyle w:val="References"/>
+        <w:ind w:left="425" w:hanging="425"/>
+      </w:pPr>
+      <w:r>
+        <w:t>E. L. Lawler and D. E. Wood, “Branch-and-bound methods: A survey,” Operations Research, vol. 14, no. 4, pp. 699–719, 1966.</w:t>
+      </w:r>
+    </w:p>
+    <w:p>
+      <w:pPr>
+        <w:pStyle w:val="References"/>
+        <w:ind w:left="425" w:hanging="425"/>
+      </w:pPr>
+      <w:r>
+        <w:t>A. Z. Broder, “On the resemblance and containment of documents,” in Proc. Compression and Complexity of Sequences, 1997.</w:t>
+      </w:r>
+    </w:p>
+    <w:p>
+      <w:pPr>
+        <w:pStyle w:val="References"/>
+        <w:ind w:left="425" w:hanging="425"/>
+      </w:pPr>
+      <w:r>
+        <w:t>B. D. Ondov et al., “Mash: Fast genome and metagenome distance estimation using MinHash,” Genome Biology, vol. 17, 2016.</w:t>
       </w:r>
     </w:p>
     <w:p>

</xml_diff>

<commit_message>
Rewrite abstract with hook-first narrative; add geometric-impossibility preview, census hook, contract framing in contributions and conclusion
</commit_message>
<xml_diff>
--- a/Manuscript.docx
+++ b/Manuscript.docx
@@ -128,7 +128,7 @@
           <w:b/>
           <w:sz w:val="18"/>
         </w:rPr>
-        <w:t>Detecting copied material in symbolic music corpora at publisher scale is hard because candidate systems must simultaneously guarantee recall over noisy transformations, stay interactive on hundreds of thousands of pieces, and produce evidence precise enough to support human adjudication. We show that no single-layer method—permissive item-level or strict structural—meets all three requirements, and we present a two-layer system that does: a tolerant item-set screening layer whose recall is provable (an evidence lower bound verified on every one of 337 adversarial cells with zero violations) and whose rare-first anytime schedule answers queries in time driven by the evidence rather than by a corpus scan; and a strict structural confirmation layer that aligns ordered note chains and reduces the fragment-level false-positive rate on style-similar hard negatives to 2.1% while retaining 83.9% recall under transcription noise. On a 174,300-piece corpus the index builds in 24.7 s and answers queries in 41.9 ms (p50) at 100% planted recall. In controlled memorization experiments, detection rises monotonically from 26-34% at zero copying to 100% at full verbatim regurgitation, with 96-100% correct attribution to the source piece. Case studies on 1,658,993 in-the-wild duplicate pairs show the system localizing spliced segments and transposed covers with publisher-readable alignment evidence.</w:t>
+        <w:t>When a publisher screens a submission against a corpus of 174,300 MIDI files, or a dataset curator must decide whether a generative model has memorized its training data, every missed copy is a liability and every false alarm is an expert afternoon lost. Existing systems force a choice no such user can afford: audio fingerprinting and learned embeddings tolerate noise but certify no recall; exact pattern mining carries no recall guarantee and explodes at the support levels copying requires; and the set-similarity engines behind large-scale deduplication are structurally blind to contained copies. We show that this trade-off is architectural rather than fundamental and dissolve it by giving the two layers different contracts. A tolerant item-set screen guarantees recall per query through an evidence lower bound, verified cell by cell on 337 adversarial cells with zero violations, and its rare-first anytime schedule answers in time driven by the evidence rather than by the corpus. A strict structural confirmation layer then aligns ordered note chains, cutting the fragment-level false-positive rate on style-similar hard negatives to 2.1% at 83.9% recall under transcription noise. The index builds in 24.7 s and answers queries in 41.9 ms (p50) at 100% planted recall. The same pipeline screens a trained music generator across the full memorization spectrum with 96-100% correct source attribution, and delivers a full-corpus census of duplicate structure, localizing spliced segments and transposed covers with score-checkable evidence.</w:t>
       </w:r>
     </w:p>
     <w:p>
@@ -204,7 +204,7 @@
         <w:rPr>
           <w:color w:val="000000"/>
         </w:rPr>
-        <w:t xml:space="preserve"> publishers, dataset curators, and generative-music deployments share a common need: given a corpus of symbolic music (MIDI and its derivatives) and a query—a new submission, a generated sample, or a suspected infringement—find every piece that shares a substantively copied span with the query, rank the candidates, and show the evidence. </w:t>
+        <w:t xml:space="preserve"> publishers, dataset curators, and generative-music deployments share a common need: given a corpus of symbolic music (MIDI and its derivatives) and a query—a new submission, a generated sample, or a suspected infringement—find every piece that shares a substantively copied span with the query, rank the candidates, and show the evidence. The stakes are concrete: a census run with the system of this paper finds on the order of 107k verbatim-level duplicate pairs in a single public corpus mirror alone (Section VI-C).</w:t>
       </w:r>
     </w:p>
     <w:p>
@@ -234,7 +234,7 @@
         <w:jc w:val="both"/>
       </w:pPr>
       <w:r>
-        <w:t>Cover-song identification has moved to learned audio embeddings [15]–[17], while plagiarism detection specifically has been addressed with chroma-based forensics [18], bipartite graph matching [19], and melodic-similarity analysis of real copyright cases [20]; these audio- and embedding-centric methods, like query-by-humming lineage [13], [14], do not provide a symbolic, per-query recall guarantee of the kind a publisher can contract against.</w:t>
+        <w:t>Nor can the gap be closed by re-tuning the engines that power large-scale deduplication. The obstacle is geometric: a copied span of about 40 items embedded in a piece of about 700 items scores below 0.10 in set-Jaccard under a perfect oracle (measured quartiles 0.045/0.099/0.201 over our 337-cell adversarial audit), and no band configuration of a MinHash-LSH index recovers such a donor at any operating point (Section V-G). Relative overlap has no threshold at which a contained copy becomes visible, so resemblance cannot be tuned into recall; containment must be verified query-side, not estimated corpus-side. This negative result is what motivates the architecture: the screen's contract must be stated on evidence, not on similarity.</w:t>
       </w:r>
     </w:p>
     <w:p>
@@ -244,7 +244,7 @@
         <w:jc w:val="both"/>
       </w:pPr>
       <w:r>
-        <w:t>This paper's thesis is architectural: the three requirements decompose across two layers with different contracts. The first layer maximizes recall under a stated noise model and proves it—an evidence lower bound that holds for any query whose per-note deviation stays within declared tolerances. The second layer maximizes precision by checking structure that style peers do not share: the ordered chain of notes with their inter-onset intervals. We additionally require the first layer to be anytime [8]: under a partial budget it must return the best partial answer together with a sound bound on what remains open.</w:t>
+        <w:t>Cover-song identification has moved to learned audio embeddings [15]–[17], while plagiarism detection specifically has been addressed with chroma-based forensics [18], bipartite graph matching [19], and melodic-similarity analysis of real copyright cases [20]; these audio- and embedding-centric methods, like query-by-humming lineage [13], [14], do not provide a symbolic, per-query recall guarantee of the kind a publisher can contract against.</w:t>
       </w:r>
     </w:p>
     <w:p>
@@ -254,7 +254,7 @@
         <w:jc w:val="both"/>
       </w:pPr>
       <w:r>
-        <w:t xml:space="preserve">Our findings, all measured on the Lakh MIDI corpus (full corpus, 174,300 pieces), are: (1) item-set containment alone is screening-grade only—on style-similar hard negatives its fragment-level false-positive rate reaches 93%, and no threshold repairs this without destroying recall; (2) a strict-tolerance ordered-chain confirmation layer on top of the screen cuts the false-positive rate to 2.1% at 83.9% recall under transcription noise, meeting the &lt;5% screening requirement of a decision-support tool; (3) the screen's rare-first schedule tightens the certified open-candidate bound by 1.1× over a hot-first schedule at 70% budget, with identical full-budget recall. </w:t>
+        <w:t>This paper's thesis is architectural: the three requirements decompose across two layers with different contracts. The first layer maximizes recall under a stated noise model and proves it—an evidence lower bound that holds for any query whose per-note deviation stays within declared tolerances. The second layer maximizes precision by checking structure that style peers do not share: the ordered chain of notes with their inter-onset intervals. We additionally require the first layer to be anytime [8]: under a partial budget it must return the best partial answer together with a sound bound on what remains open.</w:t>
       </w:r>
     </w:p>
     <w:p>
@@ -264,7 +264,7 @@
         <w:jc w:val="both"/>
       </w:pPr>
       <w:r>
-        <w:t>Two further findings complete the picture: (4) detection on a controlled memorization spectrum rises monotonically to 100% at full copying; and (5) a full-corpus census over 174,300 pieces measures 5.6 billion candidate pairs at the screening operating point, and a stratified audit of the high-scoring candidates confirms an estimated 107k verbatim-level duplicate pairs at 90% channel precision, while on in-the-wild cases the system localizes a spliced 30-second segment and recovers a +3-semitone transposed cover with exact, score-checkable alignment maps.</w:t>
+        <w:t xml:space="preserve">Our findings, all measured on the Lakh MIDI corpus (full corpus, 174,300 pieces), are: (1) item-set containment alone is screening-grade only—on style-similar hard negatives its fragment-level false-positive rate reaches 93%, and no threshold repairs this without destroying recall; (2) a strict-tolerance ordered-chain confirmation layer on top of the screen cuts the false-positive rate to 2.1% at 83.9% recall under transcription noise, meeting the &lt;5% screening requirement of a decision-support tool; (3) the screen's rare-first schedule tightens the certified open-candidate bound by 1.1× over a hot-first schedule at 70% budget, with identical full-budget recall. </w:t>
       </w:r>
     </w:p>
     <w:p>
@@ -274,7 +274,17 @@
         <w:jc w:val="both"/>
       </w:pPr>
       <w:r>
-        <w:t xml:space="preserve">The contributions are: (1) an architectural decomposition of copy detection into a provable-recall screening problem and a structural confirmation problem, with formal contracts for each layer, validated by a controlled negative result: no single item-level method reaches decision-grade precision, and no purely structural method scales; (2) a tolerant item-set screen whose per-query recall is guaranteed by a sound evidence lower bound under a declared noise model, auditable cell by cell on 337 adversarial cells with zero violations; (3) an anytime schedule analysis showing that rare-first processing tightens the certified open-candidate bound over hot-first under partial budgets (by 1.1× at 70% budget) and that the bound is computable after any schedule prefix, turning an engineering heuristic into a schedulable guarantee. </w:t>
+        <w:t>Two further findings complete the picture: (4) detection on a controlled memorization spectrum rises monotonically to 100% at full copying; and (5) a full-corpus census over 174,300 pieces measures 5.6 billion candidate pairs at the screening operating point, and a stratified audit of the high-scoring candidates confirms an estimated 107k verbatim-level duplicate pairs at 90% channel precision, while on in-the-wild cases the system localizes a spliced 30-second segment and recovers a +3-semitone transposed cover with exact, score-checkable alignment maps.</w:t>
+      </w:r>
+    </w:p>
+    <w:p>
+      <w:pPr>
+        <w:spacing w:after="0"/>
+        <w:ind w:firstLine="204"/>
+        <w:jc w:val="both"/>
+      </w:pPr>
+      <w:r>
+        <w:t xml:space="preserve">The through-line of these results is that guarantees, not thresholds, are the unit of design: each layer is specified by a contract it must honor, and every reported number is a measurement of contract compliance rather than a tuned operating point. The contributions are: (1) an architectural decomposition of copy detection into a provable-recall screening problem and a structural confirmation problem, with formal contracts for each layer, validated by a controlled negative result: no single item-level method reaches decision-grade precision, and no purely structural method scales; (2) a tolerant item-set screen whose per-query recall is guaranteed by a sound evidence lower bound under a declared noise model, auditable cell by cell on 337 adversarial cells with zero violations; (3) an anytime schedule analysis showing that rare-first processing tightens the certified open-candidate bound over hot-first under partial budgets (by 1.1× at 70% budget) and that the bound is computable after any schedule prefix, turning an engineering heuristic into a schedulable guarantee. </w:t>
       </w:r>
     </w:p>
     <w:p>
@@ -15875,7 +15885,7 @@
         <w:jc w:val="both"/>
       </w:pPr>
       <w:r>
-        <w:t>Copy detection for symbolic music decomposes into a provable-recall screening problem and a structural confirmation problem, and the decomposition is clean enough to build, verify cell-by-cell, and operate at publisher scale: 100% planted recall with an exact anytime bound, 2.1% fragment-level false positives on style-similar hard negatives, decision-latency queries on a 174,300-piece corpus, and alignment evidence that a musician can check against a score. Future work targets the two exposed boundaries: fragmented memorization below the contiguity threshold, and recall guarantees under transformations outside the current tolerance envelope.</w:t>
+        <w:t>Copy detection for symbolic music decomposes into a provable-recall screening problem and a structural confirmation problem—two layers specified by explicit contracts, recall with a proof and precision with evidence—and the decomposition is clean enough to build, verify cell-by-cell, and operate at publisher scale: 100% planted recall with an exact anytime bound, 2.1% fragment-level false positives on style-similar hard negatives, decision-latency queries on a 174,300-piece corpus, and alignment evidence that a musician can check against a score. What makes the contracts transferable is that none of them is specific to music: any domain where a long container hides a short copied span, and where style peers defeat set similarity, admits the same evidence-bound screen and chain confirmation. Future work targets the two exposed boundaries: fragmented memorization below the contiguity threshold, and recall guarantees under transformations outside the current tolerance envelope.</w:t>
       </w:r>
     </w:p>
     <w:p>

</xml_diff>

<commit_message>
Italicize unicode-subscript variables (e_1, P_1) and generalize subscript token patterns
</commit_message>
<xml_diff>
--- a/Manuscript.docx
+++ b/Manuscript.docx
@@ -695,7 +695,16 @@
         <w:t>P</w:t>
       </w:r>
       <w:r>
-        <w:t xml:space="preserve"> = (e₁, …, </w:t>
+        <w:t xml:space="preserve"> = (</w:t>
+      </w:r>
+      <w:r>
+        <w:rPr>
+          <w:i/>
+        </w:rPr>
+        <w:t>e₁</w:t>
+      </w:r>
+      <w:r>
+        <w:t xml:space="preserve">, …, </w:t>
       </w:r>
       <w:r>
         <w:rPr>
@@ -894,7 +903,25 @@
         <w:jc w:val="both"/>
       </w:pPr>
       <w:r>
-        <w:t xml:space="preserve">Problem. Given a corpus D = {P₁, …, P_N} and a query fragment </w:t>
+        <w:t>Problem. Given a corpus D = {</w:t>
+      </w:r>
+      <w:r>
+        <w:rPr>
+          <w:i/>
+        </w:rPr>
+        <w:t>P₁</w:t>
+      </w:r>
+      <w:r>
+        <w:t xml:space="preserve">, …, </w:t>
+      </w:r>
+      <w:r>
+        <w:rPr>
+          <w:i/>
+        </w:rPr>
+        <w:t>P_N}</w:t>
+      </w:r>
+      <w:r>
+        <w:t xml:space="preserve"> and a query fragment </w:t>
       </w:r>
       <w:r>
         <w:rPr>

</xml_diff>

<commit_message>
Add Output line to Algorithm 1
</commit_message>
<xml_diff>
--- a/Manuscript.docx
+++ b/Manuscript.docx
@@ -1497,6 +1497,26 @@
                 <w:sz w:val="14"/>
               </w:rPr>
               <w:t xml:space="preserve">        top-C; budget B</w:t>
+            </w:r>
+            <w:r>
+              <w:br/>
+            </w:r>
+            <w:r>
+              <w:rPr>
+                <w:rFonts w:ascii="Consolas" w:hAnsi="Consolas" w:eastAsia="Consolas"/>
+                <w:sz w:val="14"/>
+              </w:rPr>
+              <w:t>Output: confirmed copies (P, chain, delta) with</w:t>
+            </w:r>
+            <w:r>
+              <w:br/>
+            </w:r>
+            <w:r>
+              <w:rPr>
+                <w:rFonts w:ascii="Consolas" w:hAnsi="Consolas" w:eastAsia="Consolas"/>
+                <w:sz w:val="14"/>
+              </w:rPr>
+              <w:t xml:space="preserve">        |chain| &gt;= rho * q</w:t>
             </w:r>
             <w:r>
               <w:br/>

</xml_diff>

<commit_message>
Final pre-submission pass: citation-order reference renumbering, true subscript rendering, quartile value fix, Muller citation fix
</commit_message>
<xml_diff>
--- a/Manuscript.docx
+++ b/Manuscript.docx
@@ -224,7 +224,7 @@
         <w:jc w:val="both"/>
       </w:pPr>
       <w:r>
-        <w:t>Established approaches each fail one requirement. Audio fingerprinting [3], [5] and chroma-based matching [4], [12] target audio and tolerate noise well, but their features are lossy with respect to the symbolic content publishers must adjudicate, and they provide no recall guarantee. Frequent itemset mining (FIM) and its geometric cousins (SIATEC and successors) [2], [9], [10] discover repeated patterns with algorithmic elegance, but exact enumeration explodes combinatorially at the support levels copying detection requires (we quantify this in Section V-A), and pattern sets are not ranked candidates.</w:t>
+        <w:t>Established approaches each fail one requirement. Audio fingerprinting [1], [2] and chroma-based matching [3], [4] target audio and tolerate noise well, but their features are lossy with respect to the symbolic content publishers must adjudicate, and they provide no recall guarantee. Frequent itemset mining (FIM) and its geometric cousins (SIATEC and successors) [5], [6], [7] discover repeated patterns with algorithmic elegance, but exact enumeration explodes combinatorially at the support levels copying detection requires (we quantify this in Section V-A), and pattern sets are not ranked candidates.</w:t>
       </w:r>
     </w:p>
     <w:p>
@@ -234,7 +234,7 @@
         <w:jc w:val="both"/>
       </w:pPr>
       <w:r>
-        <w:t>Nor can the gap be closed by re-tuning the engines that power large-scale deduplication. The obstacle is geometric: a copied span of about 40 items embedded in a piece of about 700 items scores below 0.10 in set-Jaccard under a perfect oracle (measured quartiles 0.045/0.099/0.201 over our 337-cell adversarial audit), and no band configuration of a MinHash-LSH index recovers such a donor at any operating point (Section V-G). Relative overlap has no threshold at which a contained copy becomes visible, so resemblance cannot be tuned into recall; containment must be verified query-side, not estimated corpus-side. This negative result is what motivates the architecture: the screen's contract must be stated on evidence, not on similarity.</w:t>
+        <w:t>Nor can the gap be closed by re-tuning the engines that power large-scale deduplication. The obstacle is geometric: a copied span of about 40 items embedded in a piece of about 700 items scores below 0.10 in set-Jaccard under a perfect oracle (measured quartiles 0.045/0.099/0.200 over our 337-cell adversarial audit), and no band configuration of a MinHash-LSH index recovers such a donor at any operating point (Section V-G). Relative overlap has no threshold at which a contained copy becomes visible, so resemblance cannot be tuned into recall; containment must be verified query-side, not estimated corpus-side. This negative result is what motivates the architecture: the screen's contract must be stated on evidence, not on similarity.</w:t>
       </w:r>
     </w:p>
     <w:p>
@@ -244,7 +244,7 @@
         <w:jc w:val="both"/>
       </w:pPr>
       <w:r>
-        <w:t>Cover-song identification has moved to learned audio embeddings [15]–[17], while plagiarism detection specifically has been addressed with chroma-based forensics [18], bipartite graph matching [19], and melodic-similarity analysis of real copyright cases [20]; these audio- and embedding-centric methods, like query-by-humming lineage [13], [14], do not provide a symbolic, per-query recall guarantee of the kind a publisher can contract against.</w:t>
+        <w:t>Cover-song identification has moved to learned audio embeddings [8]–[10], while plagiarism detection specifically has been addressed with chroma-based forensics [11], bipartite graph matching [12], and melodic-similarity analysis of real copyright cases [13]; these audio- and embedding-centric methods, like query-by-humming lineage [14], [15], do not provide a symbolic, per-query recall guarantee of the kind a publisher can contract against.</w:t>
       </w:r>
     </w:p>
     <w:p>
@@ -254,7 +254,7 @@
         <w:jc w:val="both"/>
       </w:pPr>
       <w:r>
-        <w:t>This paper's thesis is architectural: the three requirements decompose across two layers with different contracts. The first layer maximizes recall under a stated noise model and proves it—an evidence lower bound that holds for any query whose per-note deviation stays within declared tolerances. The second layer maximizes precision by checking structure that style peers do not share: the ordered chain of notes with their inter-onset intervals. We additionally require the first layer to be anytime [8]: under a partial budget it must return the best partial answer together with a sound bound on what remains open.</w:t>
+        <w:t>This paper's thesis is architectural: the three requirements decompose across two layers with different contracts. The first layer maximizes recall under a stated noise model and proves it—an evidence lower bound that holds for any query whose per-note deviation stays within declared tolerances. The second layer maximizes precision by checking structure that style peers do not share: the ordered chain of notes with their inter-onset intervals. We additionally require the first layer to be anytime [16]: under a partial budget it must return the best partial answer together with a sound bound on what remains open.</w:t>
       </w:r>
     </w:p>
     <w:p>
@@ -439,7 +439,7 @@
         <w:jc w:val="both"/>
       </w:pPr>
       <w:r>
-        <w:t>Sequence-based matching of notated music under edit distance and transportation distance was established by Typke et al. [1], and geometric repeated-pattern discovery by Meredith et al. [2]. Surveying the field, Casey et al. [3] and Typke et al. [5] separate audio-descriptor approaches from symbolic approaches; Müller [4], [6] systematize chroma and alignment techniques. Our screen layer inherits the item-set view of FIM [9], [10] but replaces corpus-side enumeration with query-side containment verification, trading pattern completeness for a provable per-query recall contract.</w:t>
+        <w:t>Sequence-based matching of notated music under edit distance and transportation distance was established by Typke et al. [17], and geometric repeated-pattern discovery by Meredith et al. [5]. Surveying the field, Casey et al. [1] and Typke et al. [2] separate audio-descriptor approaches from symbolic approaches; Müller [3], [4] systematize chroma and alignment techniques. Our screen layer inherits the item-set view of FIM [6], [7] but replaces corpus-side enumeration with query-side containment verification, trading pattern completeness for a provable per-query recall contract.</w:t>
       </w:r>
     </w:p>
     <w:p>
@@ -449,7 +449,7 @@
         <w:jc w:val="both"/>
       </w:pPr>
       <w:r>
-        <w:t xml:space="preserve">Symbolic version identification has a complementary lineage. Alignment-based matching of MIDI to audio [6] and sequence-comparison methods benchmarked on the Lakh corpus [7] establish that symbolic sequences support robust matching, but their cost is per-candidate: applied as corpus-wide filters they do not scale, and applied after a cheap filter they inherit the filter's recall, which none of these systems bounds. </w:t>
+        <w:t xml:space="preserve">Symbolic version identification has a complementary lineage. Alignment-based matching of MIDI to audio [18] and sequence-comparison methods benchmarked on the Lakh corpus [19] establish that symbolic sequences support robust matching, but their cost is per-candidate: applied as corpus-wide filters they do not scale, and applied after a cheap filter they inherit the filter's recall, which none of these systems bounds. </w:t>
       </w:r>
     </w:p>
     <w:p>
@@ -486,7 +486,7 @@
         <w:jc w:val="both"/>
       </w:pPr>
       <w:r>
-        <w:t xml:space="preserve">Carlini et al. [11] demonstrated that large language models regurgitate training sequences and that extraction is detectable with membership tests [23]; the same extraction was then shown for diffusion models [24]. Deduplication reduces both verbatim regurgitation and privacy leakage [25], [26], and memorization is measurable even in probabilistic deep generative models [27]. For music specifically, symbolic generators such as Music Transformer [22] are trained on scraped MIDI, membership-inference auditing of generative music models has only recently been demonstrated [28], influence-level attribution has been explored with audio embeddings [29], and the legal status of such training data remains contested [30]. </w:t>
+        <w:t xml:space="preserve">Carlini et al. [20] demonstrated that large language models regurgitate training sequences and that extraction is detectable with membership tests [21]; the same extraction was then shown for diffusion models [22]. Deduplication reduces both verbatim regurgitation and privacy leakage [23], [24], and memorization is measurable even in probabilistic deep generative models [25]. For music specifically, symbolic generators such as Music Transformer [26] are trained on scraped MIDI, membership-inference auditing of generative music models has only recently been demonstrated [27], influence-level attribution has been explored with audio embeddings [28], and the legal status of such training data remains contested [29]. </w:t>
       </w:r>
     </w:p>
     <w:p>
@@ -514,7 +514,7 @@
         <w:jc w:val="both"/>
       </w:pPr>
       <w:r>
-        <w:t>Zilberstein [8] formalized anytime algorithms: interruptible procedures whose intermediate results improve monotonically and can be accompanied by a bound on unexplored outcomes. Our screen adopts this contract at the level of evidence items: after any prefix of the rare-first schedule, the set of pieces that can still reach the threshold is exactly computable, which turns an engineering heuristic into a guarantee a publisher can schedule around.</w:t>
+        <w:t>Zilberstein [16] formalized anytime algorithms: interruptible procedures whose intermediate results improve monotonically and can be accompanied by a bound on unexplored outcomes. Our screen adopts this contract at the level of evidence items: after any prefix of the rare-first schedule, the set of pieces that can still reach the threshold is exactly computable, which turns an engineering heuristic into a guarantee a publisher can schedule around.</w:t>
       </w:r>
     </w:p>
     <w:p>
@@ -533,13 +533,26 @@
         <w:t>k</w:t>
       </w:r>
       <w:r>
-        <w:t xml:space="preserve"> aggregation [33] maintain a partial-score bound under which no unseen candidate can qualify, and branch-and-bound search [34] carries an admissible estimate of everything not yet explored. Theorem 1 transfers this contract to tolerant item-set evidence: because every unprocessed position can contribute at most one to any piece, </w:t>
+        <w:t xml:space="preserve"> aggregation [30] maintain a partial-score bound under which no unseen candidate can qualify, and branch-and-bound search [31] carries an admissible estimate of everything not yet explored. Theorem 1 transfers this contract to tolerant item-set evidence: because every unprocessed position can contribute at most one to any piece, </w:t>
       </w:r>
       <w:r>
         <w:rPr>
           <w:i/>
         </w:rPr>
-        <w:t>score_u(P)</w:t>
+        <w:t>score</w:t>
+      </w:r>
+      <w:r>
+        <w:rPr>
+          <w:i/>
+          <w:vertAlign w:val="subscript"/>
+        </w:rPr>
+        <w:t>u</w:t>
+      </w:r>
+      <w:r>
+        <w:rPr>
+          <w:i/>
+        </w:rPr>
+        <w:t>(P)</w:t>
       </w:r>
       <w:r>
         <w:t xml:space="preserve"> + (</w:t>
@@ -710,7 +723,14 @@
         <w:rPr>
           <w:i/>
         </w:rPr>
-        <w:t>e_n</w:t>
+        <w:t>e</w:t>
+      </w:r>
+      <w:r>
+        <w:rPr>
+          <w:i/>
+          <w:vertAlign w:val="subscript"/>
+        </w:rPr>
+        <w:t>n</w:t>
       </w:r>
       <w:r>
         <w:t xml:space="preserve">) is a sequence of note events </w:t>
@@ -719,7 +739,14 @@
         <w:rPr>
           <w:i/>
         </w:rPr>
-        <w:t>e_i</w:t>
+        <w:t>e</w:t>
+      </w:r>
+      <w:r>
+        <w:rPr>
+          <w:i/>
+          <w:vertAlign w:val="subscript"/>
+        </w:rPr>
+        <w:t>i</w:t>
       </w:r>
       <w:r>
         <w:t xml:space="preserve"> = (</w:t>
@@ -728,7 +755,14 @@
         <w:rPr>
           <w:i/>
         </w:rPr>
-        <w:t>t_i</w:t>
+        <w:t>t</w:t>
+      </w:r>
+      <w:r>
+        <w:rPr>
+          <w:i/>
+          <w:vertAlign w:val="subscript"/>
+        </w:rPr>
+        <w:t>i</w:t>
       </w:r>
       <w:r>
         <w:t xml:space="preserve">, </w:t>
@@ -737,7 +771,14 @@
         <w:rPr>
           <w:i/>
         </w:rPr>
-        <w:t>p_i</w:t>
+        <w:t>p</w:t>
+      </w:r>
+      <w:r>
+        <w:rPr>
+          <w:i/>
+          <w:vertAlign w:val="subscript"/>
+        </w:rPr>
+        <w:t>i</w:t>
       </w:r>
       <w:r>
         <w:t xml:space="preserve">, </w:t>
@@ -746,7 +787,14 @@
         <w:rPr>
           <w:i/>
         </w:rPr>
-        <w:t>d_i</w:t>
+        <w:t>d</w:t>
+      </w:r>
+      <w:r>
+        <w:rPr>
+          <w:i/>
+          <w:vertAlign w:val="subscript"/>
+        </w:rPr>
+        <w:t>i</w:t>
       </w:r>
       <w:r>
         <w:t xml:space="preserve">, </w:t>
@@ -755,7 +803,14 @@
         <w:rPr>
           <w:i/>
         </w:rPr>
-        <w:t>v_i</w:t>
+        <w:t>v</w:t>
+      </w:r>
+      <w:r>
+        <w:rPr>
+          <w:i/>
+          <w:vertAlign w:val="subscript"/>
+        </w:rPr>
+        <w:t>i</w:t>
       </w:r>
       <w:r>
         <w:t xml:space="preserve">): onset time, MIDI pitch, duration, and velocity. An encoding </w:t>
@@ -776,7 +831,7 @@
         <w:t>S(P)</w:t>
       </w:r>
       <w:r>
-        <w:t xml:space="preserve"> = ∪_i {</w:t>
+        <w:t>, the union of {</w:t>
       </w:r>
       <w:r>
         <w:rPr>
@@ -791,14 +846,21 @@
         <w:rPr>
           <w:i/>
         </w:rPr>
-        <w:t>e_i</w:t>
-      </w:r>
-      <w:r>
-        <w:t xml:space="preserve">)} discards order and repetition. For tolerance vector </w:t>
+        <w:t>e</w:t>
       </w:r>
       <w:r>
         <w:rPr>
           <w:i/>
+          <w:vertAlign w:val="subscript"/>
+        </w:rPr>
+        <w:t>i</w:t>
+      </w:r>
+      <w:r>
+        <w:t xml:space="preserve">)} over all positions, discards order and repetition. For tolerance vector </w:t>
+      </w:r>
+      <w:r>
+        <w:rPr>
+          <w:i/>
         </w:rPr>
         <w:t>k</w:t>
       </w:r>
@@ -809,7 +871,20 @@
         <w:rPr>
           <w:i/>
         </w:rPr>
-        <w:t>k_pitch</w:t>
+        <w:t>k</w:t>
+      </w:r>
+      <w:r>
+        <w:rPr>
+          <w:i/>
+          <w:vertAlign w:val="subscript"/>
+        </w:rPr>
+        <w:t>pi</w:t>
+      </w:r>
+      <w:r>
+        <w:rPr>
+          <w:i/>
+        </w:rPr>
+        <w:t>tch</w:t>
       </w:r>
       <w:r>
         <w:t xml:space="preserve">, </w:t>
@@ -818,7 +893,20 @@
         <w:rPr>
           <w:i/>
         </w:rPr>
-        <w:t>k_bin</w:t>
+        <w:t>k</w:t>
+      </w:r>
+      <w:r>
+        <w:rPr>
+          <w:i/>
+          <w:vertAlign w:val="subscript"/>
+        </w:rPr>
+        <w:t>bi</w:t>
+      </w:r>
+      <w:r>
+        <w:rPr>
+          <w:i/>
+        </w:rPr>
+        <w:t>n</w:t>
       </w:r>
       <w:r>
         <w:t xml:space="preserve">, </w:t>
@@ -827,7 +915,20 @@
         <w:rPr>
           <w:i/>
         </w:rPr>
-        <w:t>k_vel</w:t>
+        <w:t>k</w:t>
+      </w:r>
+      <w:r>
+        <w:rPr>
+          <w:i/>
+          <w:vertAlign w:val="subscript"/>
+        </w:rPr>
+        <w:t>ve</w:t>
+      </w:r>
+      <w:r>
+        <w:rPr>
+          <w:i/>
+        </w:rPr>
+        <w:t>l</w:t>
       </w:r>
       <w:r>
         <w:t xml:space="preserve">), the neighborhood </w:t>
@@ -836,7 +937,20 @@
         <w:rPr>
           <w:i/>
         </w:rPr>
-        <w:t>N_k(x)</w:t>
+        <w:t>N</w:t>
+      </w:r>
+      <w:r>
+        <w:rPr>
+          <w:i/>
+          <w:vertAlign w:val="subscript"/>
+        </w:rPr>
+        <w:t>k</w:t>
+      </w:r>
+      <w:r>
+        <w:rPr>
+          <w:i/>
+        </w:rPr>
+        <w:t>(x)</w:t>
       </w:r>
       <w:r>
         <w:t xml:space="preserve"> of an item x is the set of items whose pitch differs by at most </w:t>
@@ -845,7 +959,20 @@
         <w:rPr>
           <w:i/>
         </w:rPr>
-        <w:t>k_pitch</w:t>
+        <w:t>k</w:t>
+      </w:r>
+      <w:r>
+        <w:rPr>
+          <w:i/>
+          <w:vertAlign w:val="subscript"/>
+        </w:rPr>
+        <w:t>pi</w:t>
+      </w:r>
+      <w:r>
+        <w:rPr>
+          <w:i/>
+        </w:rPr>
+        <w:t>tch</w:t>
       </w:r>
       <w:r>
         <w:t xml:space="preserve"> semitones and whose duration, inter-onset interval (IOI), and velocity bins differ by at most </w:t>
@@ -854,7 +981,20 @@
         <w:rPr>
           <w:i/>
         </w:rPr>
-        <w:t>k_bin</w:t>
+        <w:t>k</w:t>
+      </w:r>
+      <w:r>
+        <w:rPr>
+          <w:i/>
+          <w:vertAlign w:val="subscript"/>
+        </w:rPr>
+        <w:t>bi</w:t>
+      </w:r>
+      <w:r>
+        <w:rPr>
+          <w:i/>
+        </w:rPr>
+        <w:t>n</w:t>
       </w:r>
       <w:r>
         <w:t xml:space="preserve"> and </w:t>
@@ -863,7 +1003,20 @@
         <w:rPr>
           <w:i/>
         </w:rPr>
-        <w:t>k_vel</w:t>
+        <w:t>k</w:t>
+      </w:r>
+      <w:r>
+        <w:rPr>
+          <w:i/>
+          <w:vertAlign w:val="subscript"/>
+        </w:rPr>
+        <w:t>ve</w:t>
+      </w:r>
+      <w:r>
+        <w:rPr>
+          <w:i/>
+        </w:rPr>
+        <w:t>l</w:t>
       </w:r>
       <w:r>
         <w:t xml:space="preserve"> bins respectively. A planted copy of a span </w:t>
@@ -918,7 +1071,20 @@
         <w:rPr>
           <w:i/>
         </w:rPr>
-        <w:t>P_N}</w:t>
+        <w:t>P</w:t>
+      </w:r>
+      <w:r>
+        <w:rPr>
+          <w:i/>
+          <w:vertAlign w:val="subscript"/>
+        </w:rPr>
+        <w:t>N</w:t>
+      </w:r>
+      <w:r>
+        <w:rPr>
+          <w:i/>
+        </w:rPr>
+        <w:t>}</w:t>
       </w:r>
       <w:r>
         <w:t xml:space="preserve"> and a query fragment </w:t>
@@ -1038,7 +1204,20 @@
         <w:rPr>
           <w:i/>
         </w:rPr>
-        <w:t>score_u(P)</w:t>
+        <w:t>score</w:t>
+      </w:r>
+      <w:r>
+        <w:rPr>
+          <w:i/>
+          <w:vertAlign w:val="subscript"/>
+        </w:rPr>
+        <w:t>u</w:t>
+      </w:r>
+      <w:r>
+        <w:rPr>
+          <w:i/>
+        </w:rPr>
+        <w:t>(P)</w:t>
       </w:r>
       <w:r>
         <w:t xml:space="preserve"> be piece </w:t>
@@ -1074,7 +1253,20 @@
         <w:rPr>
           <w:i/>
         </w:rPr>
-        <w:t>score_u(P)</w:t>
+        <w:t>score</w:t>
+      </w:r>
+      <w:r>
+        <w:rPr>
+          <w:i/>
+          <w:vertAlign w:val="subscript"/>
+        </w:rPr>
+        <w:t>u</w:t>
+      </w:r>
+      <w:r>
+        <w:rPr>
+          <w:i/>
+        </w:rPr>
+        <w:t>(P)</w:t>
       </w:r>
       <w:r>
         <w:t xml:space="preserve"> + (</w:t>
@@ -1101,7 +1293,20 @@
         <w:rPr>
           <w:i/>
         </w:rPr>
-        <w:t>score_q(P)</w:t>
+        <w:t>score</w:t>
+      </w:r>
+      <w:r>
+        <w:rPr>
+          <w:i/>
+          <w:vertAlign w:val="subscript"/>
+        </w:rPr>
+        <w:t>q</w:t>
+      </w:r>
+      <w:r>
+        <w:rPr>
+          <w:i/>
+        </w:rPr>
+        <w:t>(P)</w:t>
       </w:r>
       <w:r>
         <w:t xml:space="preserve">, and the open set </w:t>
@@ -1110,7 +1315,14 @@
         <w:rPr>
           <w:i/>
         </w:rPr>
-        <w:t>O_u</w:t>
+        <w:t>O</w:t>
+      </w:r>
+      <w:r>
+        <w:rPr>
+          <w:i/>
+          <w:vertAlign w:val="subscript"/>
+        </w:rPr>
+        <w:t>u</w:t>
       </w:r>
       <w:r>
         <w:t xml:space="preserve"> = {</w:t>
@@ -1128,7 +1340,20 @@
         <w:rPr>
           <w:i/>
         </w:rPr>
-        <w:t>score_u(P)</w:t>
+        <w:t>score</w:t>
+      </w:r>
+      <w:r>
+        <w:rPr>
+          <w:i/>
+          <w:vertAlign w:val="subscript"/>
+        </w:rPr>
+        <w:t>u</w:t>
+      </w:r>
+      <w:r>
+        <w:rPr>
+          <w:i/>
+        </w:rPr>
+        <w:t>(P)</w:t>
       </w:r>
       <w:r>
         <w:t xml:space="preserve"> + (</w:t>
@@ -1182,7 +1407,14 @@
         <w:rPr>
           <w:i/>
         </w:rPr>
-        <w:t>N_k</w:t>
+        <w:t>N</w:t>
+      </w:r>
+      <w:r>
+        <w:rPr>
+          <w:i/>
+          <w:vertAlign w:val="subscript"/>
+        </w:rPr>
+        <w:t>k</w:t>
       </w:r>
       <w:r>
         <w:t xml:space="preserve">, so each position of a true copy contributes at least as much as a verbatim position; unprocessed positions can contribute at most one each. Hence a piece outside </w:t>
@@ -1191,7 +1423,14 @@
         <w:rPr>
           <w:i/>
         </w:rPr>
-        <w:t>O_u</w:t>
+        <w:t>O</w:t>
+      </w:r>
+      <w:r>
+        <w:rPr>
+          <w:i/>
+          <w:vertAlign w:val="subscript"/>
+        </w:rPr>
+        <w:t>u</w:t>
       </w:r>
       <w:r>
         <w:t xml:space="preserve"> cannot be a copy, and no piece inside </w:t>
@@ -1200,7 +1439,14 @@
         <w:rPr>
           <w:i/>
         </w:rPr>
-        <w:t>O_u</w:t>
+        <w:t>O</w:t>
+      </w:r>
+      <w:r>
+        <w:rPr>
+          <w:i/>
+          <w:vertAlign w:val="subscript"/>
+        </w:rPr>
+        <w:t>u</w:t>
       </w:r>
       <w:r>
         <w:t xml:space="preserve"> can be excluded yet. ∎</w:t>
@@ -1219,7 +1465,14 @@
         <w:rPr>
           <w:i/>
         </w:rPr>
-        <w:t>O_u</w:t>
+        <w:t>O</w:t>
+      </w:r>
+      <w:r>
+        <w:rPr>
+          <w:i/>
+          <w:vertAlign w:val="subscript"/>
+        </w:rPr>
+        <w:t>u</w:t>
       </w:r>
       <w:r>
         <w:t xml:space="preserve"> is a complete description of the search state, so interruption never loses a certified answer. Rare-first ordering greedily minimizes the growth of </w:t>
@@ -1228,7 +1481,20 @@
         <w:rPr>
           <w:i/>
         </w:rPr>
-        <w:t>|O_u|</w:t>
+        <w:t>|O</w:t>
+      </w:r>
+      <w:r>
+        <w:rPr>
+          <w:i/>
+          <w:vertAlign w:val="subscript"/>
+        </w:rPr>
+        <w:t>u</w:t>
+      </w:r>
+      <w:r>
+        <w:rPr>
+          <w:i/>
+        </w:rPr>
+        <w:t>|</w:t>
       </w:r>
       <w:r>
         <w:t>, because a rare position eliminates, in expectation, the largest fraction of currently open pieces per unit of budget; Section V-C quantifies the resulting gap in the certified bound against hot-first processing.</w:t>
@@ -1262,7 +1528,14 @@
         <w:rPr>
           <w:i/>
         </w:rPr>
-        <w:t>N_k</w:t>
+        <w:t>N</w:t>
+      </w:r>
+      <w:r>
+        <w:rPr>
+          <w:i/>
+          <w:vertAlign w:val="subscript"/>
+        </w:rPr>
+        <w:t>k</w:t>
       </w:r>
       <w:r>
         <w:t xml:space="preserve">, so query cost grows with the length of the evidence and with the vocabulary mass inside the query's tolerance neighborhood, and grows with corpus size only through longer posting lists; the open set is maintained in a Fenwick structure over piece IDs, giving </w:t>
@@ -1286,7 +1559,20 @@
         <w:rPr>
           <w:i/>
         </w:rPr>
-        <w:t>|O_u|</w:t>
+        <w:t>|O</w:t>
+      </w:r>
+      <w:r>
+        <w:rPr>
+          <w:i/>
+          <w:vertAlign w:val="subscript"/>
+        </w:rPr>
+        <w:t>u</w:t>
+      </w:r>
+      <w:r>
+        <w:rPr>
+          <w:i/>
+        </w:rPr>
+        <w:t>|</w:t>
       </w:r>
       <w:r>
         <w:t xml:space="preserve"> readout after every position. Measured end to end, the index builds in 24.747 s and queries run at p50 = 41.94 ms on the full 174,300-piece corpus (Table I).</w:t>
@@ -1772,7 +2058,7 @@
         <w:jc w:val="both"/>
       </w:pPr>
       <w:r>
-        <w:t xml:space="preserve">Corpus. The Lakh MIDI dataset [7] (mirrored parquet export), up to 174,300 pieces encoded as item sets; the adversarial suite uses the first 3,000 pieces of shard 0. The GigaMIDI corpus [21] indicates that symbolic collections at the million-piece scale are now routine, which is the operating regime the screen layer is built for. </w:t>
+        <w:t xml:space="preserve">Corpus. The Lakh MIDI dataset [19] (mirrored parquet export), up to 174,300 pieces encoded as item sets; the adversarial suite uses the first 3,000 pieces of shard 0. The GigaMIDI corpus [32] indicates that symbolic collections at the million-piece scale are now routine, which is the operating regime the screen layer is built for. </w:t>
       </w:r>
     </w:p>
     <w:p>
@@ -1802,7 +2088,7 @@
         <w:jc w:val="both"/>
       </w:pPr>
       <w:r>
-        <w:t>Baselines. Set-Jaccard corpus scan, SIATEC-family pattern discovery [2], and n-gram Jaccard (Section V-A); FIM engines from our prior work [31], [32] serve as enumeration baselines. Both engines are independent of the present system—they enumerate patterns corpus-side, whereas the screen verifies containment query-side—and serve here solely as feasibility references.</w:t>
+        <w:t>Baselines. Set-Jaccard corpus scan, SIATEC-family pattern discovery [5], and n-gram Jaccard (Section V-A); FIM engines from our prior work [33], [34] serve as enumeration baselines. Both engines are independent of the present system—they enumerate patterns corpus-side, whereas the screen verifies containment query-side—and serve here solely as feasibility references.</w:t>
       </w:r>
     </w:p>
     <w:p>
@@ -2498,7 +2784,7 @@
         <w:t>τ</w:t>
       </w:r>
       <w:r>
-        <w:t xml:space="preserve"> = 0.05 and 0.20): the S-curve of the band configuration activates only above Jaccard ~0.7, while a contained span of 40 items inside a ~700-item query reaches Jaccard ~0.1 at best, so the index answers every query with an empty candidate set. Section V-G analyses this geometry directly on the recall-matrix protocol. Corpus-side FIM enumeration—the engines of our previous work [31], [32]—was measured infeasible at the support levels copying detection requires (over 11 million frequent pairs at </w:t>
+        <w:t xml:space="preserve"> = 0.05 and 0.20): the S-curve of the band configuration activates only above Jaccard ~0.7, while a contained span of 40 items inside a ~700-item query reaches Jaccard ~0.1 at best, so the index answers every query with an empty candidate set. Section V-G analyses this geometry directly on the recall-matrix protocol. Corpus-side FIM enumeration—the engines of our previous work [33], [34]—was measured infeasible at the support levels copying detection requires (over 11 million frequent pairs at </w:t>
       </w:r>
       <w:r>
         <w:rPr>
@@ -4880,7 +5166,20 @@
         <w:rPr>
           <w:i/>
         </w:rPr>
-        <w:t>k_pitch</w:t>
+        <w:t>k</w:t>
+      </w:r>
+      <w:r>
+        <w:rPr>
+          <w:i/>
+          <w:vertAlign w:val="subscript"/>
+        </w:rPr>
+        <w:t>pi</w:t>
+      </w:r>
+      <w:r>
+        <w:rPr>
+          <w:i/>
+        </w:rPr>
+        <w:t>tch</w:t>
       </w:r>
       <w:r>
         <w:t xml:space="preserve"> = 2, </w:t>
@@ -4889,7 +5188,20 @@
         <w:rPr>
           <w:i/>
         </w:rPr>
-        <w:t>k_bin</w:t>
+        <w:t>k</w:t>
+      </w:r>
+      <w:r>
+        <w:rPr>
+          <w:i/>
+          <w:vertAlign w:val="subscript"/>
+        </w:rPr>
+        <w:t>bi</w:t>
+      </w:r>
+      <w:r>
+        <w:rPr>
+          <w:i/>
+        </w:rPr>
+        <w:t>n</w:t>
       </w:r>
       <w:r>
         <w:t xml:space="preserve"> = 1). Bold marks cells below 100 %.</w:t>
@@ -6592,7 +6904,24 @@
                 <w:i/>
                 <w:sz w:val="16"/>
               </w:rPr>
-              <w:t>p_drop</w:t>
+              <w:t>p</w:t>
+            </w:r>
+            <w:r>
+              <w:rPr>
+                <w:rFonts w:ascii="Times New Roman" w:hAnsi="Times New Roman"/>
+                <w:i/>
+                <w:sz w:val="16"/>
+                <w:vertAlign w:val="subscript"/>
+              </w:rPr>
+              <w:t>dr</w:t>
+            </w:r>
+            <w:r>
+              <w:rPr>
+                <w:rFonts w:ascii="Times New Roman" w:hAnsi="Times New Roman"/>
+                <w:i/>
+                <w:sz w:val="16"/>
+              </w:rPr>
+              <w:t>op</w:t>
             </w:r>
             <w:r>
               <w:rPr>
@@ -6731,7 +7060,24 @@
                 <w:i/>
                 <w:sz w:val="16"/>
               </w:rPr>
-              <w:t>p_drop</w:t>
+              <w:t>p</w:t>
+            </w:r>
+            <w:r>
+              <w:rPr>
+                <w:rFonts w:ascii="Times New Roman" w:hAnsi="Times New Roman"/>
+                <w:i/>
+                <w:sz w:val="16"/>
+                <w:vertAlign w:val="subscript"/>
+              </w:rPr>
+              <w:t>dr</w:t>
+            </w:r>
+            <w:r>
+              <w:rPr>
+                <w:rFonts w:ascii="Times New Roman" w:hAnsi="Times New Roman"/>
+                <w:i/>
+                <w:sz w:val="16"/>
+              </w:rPr>
+              <w:t>op</w:t>
             </w:r>
             <w:r>
               <w:rPr>
@@ -6870,7 +7216,24 @@
                 <w:i/>
                 <w:sz w:val="16"/>
               </w:rPr>
-              <w:t>p_drop</w:t>
+              <w:t>p</w:t>
+            </w:r>
+            <w:r>
+              <w:rPr>
+                <w:rFonts w:ascii="Times New Roman" w:hAnsi="Times New Roman"/>
+                <w:i/>
+                <w:sz w:val="16"/>
+                <w:vertAlign w:val="subscript"/>
+              </w:rPr>
+              <w:t>dr</w:t>
+            </w:r>
+            <w:r>
+              <w:rPr>
+                <w:rFonts w:ascii="Times New Roman" w:hAnsi="Times New Roman"/>
+                <w:i/>
+                <w:sz w:val="16"/>
+              </w:rPr>
+              <w:t>op</w:t>
             </w:r>
             <w:r>
               <w:rPr>
@@ -13700,7 +14063,7 @@
         <w:rPr>
           <w:sz w:val="19"/>
         </w:rPr>
-        <w:t>. (a) donor Jaccard distribution over the 337 planted cells (quartiles 0.045/0.099/0.201) with the two operating thresholds marked; (b) recall of the three LSH configurations versus the tolerant screen on the same cells.</w:t>
+        <w:t>. (a) donor Jaccard distribution over the 337 planted cells (quartiles 0.045/0.099/0.200) with the two operating thresholds marked; (b) recall of the three LSH configurations versus the tolerant screen on the same cells.</w:t>
       </w:r>
     </w:p>
     <w:p>
@@ -16800,7 +17163,7 @@
         <w:jc w:val="both"/>
       </w:pPr>
       <w:r>
-        <w:t>Finally, the system's output is evidence for a human decision, not a legal determination: a confirmed chain localizes shared material and estimates transposition, while questions of access, originality, and substantial similarity remain with adjudicators [20], [30]. The expected utility of the system is bounded accordingly: it catches extractive regurgitation—copied spans a generator emits intact—but not distributed memorization, where influence is spread across a model without any recoverable span; that per-sample question is the complement of membership inference [23], and the two instruments are most credible when used together. All code and experiment scripts are released to make every number in this paper independently reproducible.</w:t>
+        <w:t>Finally, the system's output is evidence for a human decision, not a legal determination: a confirmed chain localizes shared material and estimates transposition, while questions of access, originality, and substantial similarity remain with adjudicators [13], [29]. The expected utility of the system is bounded accordingly: it catches extractive regurgitation—copied spans a generator emits intact—but not distributed memorization, where influence is spread across a model without any recoverable span; that per-sample question is the complement of membership inference [21], and the two instruments are most credible when used together. All code and experiment scripts are released to make every number in this paper independently reproducible.</w:t>
       </w:r>
     </w:p>
     <w:p>
@@ -16835,7 +17198,7 @@
         <w:ind w:left="425" w:hanging="425"/>
       </w:pPr>
       <w:r>
-        <w:t>R. Typke, R. C. Veltkamp, and F. Wiering, “Searching notated polyphonic music using transportation distances,” in Proc. ACM Multimedia, 2004.</w:t>
+        <w:t>M. A. Casey et al., “Content-based music information retrieval: Current directions and future challenges,” Proceedings of the IEEE, vol. 96, no. 4, pp. 668–676, 2008.</w:t>
       </w:r>
     </w:p>
     <w:p>
@@ -16844,7 +17207,7 @@
         <w:ind w:left="425" w:hanging="425"/>
       </w:pPr>
       <w:r>
-        <w:t>D. Meredith, K. Lemström, and G. A. Wiggins, “Algorithms for discovering repeated patterns in multidimensional representations of polyphonic music,” Journal of New Music Research, vol. 31, no. 4, pp. 321–345, 2002.</w:t>
+        <w:t>R. Typke, F. Wiering, and R. C. Veltkamp, “A survey of music information retrieval systems,” in Proc. ISMIR, 2005.</w:t>
       </w:r>
     </w:p>
     <w:p>
@@ -16853,7 +17216,7 @@
         <w:ind w:left="425" w:hanging="425"/>
       </w:pPr>
       <w:r>
-        <w:t>M. A. Casey et al., “Content-based music information retrieval: Current directions and future challenges,” Proceedings of the IEEE, vol. 96, no. 4, pp. 668–676, 2008.</w:t>
+        <w:t>M. Müller, Information Retrieval for Music and Motion. Springer, 2007.</w:t>
       </w:r>
     </w:p>
     <w:p>
@@ -16862,7 +17225,7 @@
         <w:ind w:left="425" w:hanging="425"/>
       </w:pPr>
       <w:r>
-        <w:t>M. Müller, Information Retrieval for Music and Motion. Springer, 2007.</w:t>
+        <w:t>M. Müller and S. Ewert, “Chroma Toolbox: MATLAB implementations for extracting variants of chroma-based audio features,” in Proc. ISMIR, 2011.</w:t>
       </w:r>
     </w:p>
     <w:p>
@@ -16871,7 +17234,7 @@
         <w:ind w:left="425" w:hanging="425"/>
       </w:pPr>
       <w:r>
-        <w:t>R. Typke, F. Wiering, and R. C. Veltkamp, “A survey of music information retrieval systems,” in Proc. ISMIR, 2005.</w:t>
+        <w:t>D. Meredith, K. Lemström, and G. A. Wiggins, “Algorithms for discovering repeated patterns in multidimensional representations of polyphonic music,” Journal of New Music Research, vol. 31, no. 4, pp. 321–345, 2002.</w:t>
       </w:r>
     </w:p>
     <w:p>
@@ -16880,7 +17243,7 @@
         <w:ind w:left="425" w:hanging="425"/>
       </w:pPr>
       <w:r>
-        <w:t>C. Raffel and D. P. W. Ellis, “Optimizing DTW-based audio-to-MIDI alignment and matching,” in Proc. ICASSP, 2016.</w:t>
+        <w:t>R. Agrawal and R. Srikant, “Fast algorithms for mining association rules in large databases,” in Proc. VLDB, 1994.</w:t>
       </w:r>
     </w:p>
     <w:p>
@@ -16889,7 +17252,7 @@
         <w:ind w:left="425" w:hanging="425"/>
       </w:pPr>
       <w:r>
-        <w:t>C. Raffel, Learning-Based Methods for Comparing Sequences, with Applications to Audio-to-MIDI Alignment and Matching. PhD thesis, Columbia University, 2016 (Lakh MIDI Dataset).</w:t>
+        <w:t>J. Han, J. Pei, and Y. Yin, “Mining frequent patterns without candidate generation,” in Proc. ACM SIGMOD, 2000.</w:t>
       </w:r>
     </w:p>
     <w:p>
@@ -16898,7 +17261,7 @@
         <w:ind w:left="425" w:hanging="425"/>
       </w:pPr>
       <w:r>
-        <w:t>S. Zilberstein, “Using anytime algorithms in intelligent systems,” AI Magazine, vol. 17, no. 3, pp. 73–83, 1996.</w:t>
+        <w:t>Z. Yu, X. Xu, X. Chen, and D. Yang, “Learning a representation for cover song identification using convolutional neural network,” in Proc. ICASSP, 2020.</w:t>
       </w:r>
     </w:p>
     <w:p>
@@ -16907,7 +17270,7 @@
         <w:ind w:left="425" w:hanging="425"/>
       </w:pPr>
       <w:r>
-        <w:t>R. Agrawal and R. Srikant, “Fast algorithms for mining association rules in large databases,” in Proc. VLDB, 1994.</w:t>
+        <w:t>X. Du, Z. Yu, B. Zhu, X. Chen, and Z. Ma, “ByteCover: Cover song identification via multi-loss training,” in Proc. ICASSP, 2021.</w:t>
       </w:r>
     </w:p>
     <w:p>
@@ -16916,7 +17279,7 @@
         <w:ind w:left="425" w:hanging="425"/>
       </w:pPr>
       <w:r>
-        <w:t>J. Han, J. Pei, and Y. Yin, “Mining frequent patterns without candidate generation,” in Proc. ACM SIGMOD, 2000.</w:t>
+        <w:t>F. Liu, D. Tuo, Y. Xu, and X. Han, “CoverHunter: Cover song identification with refined attention and alignments,” in Proc. IEEE ICASSP, 2023.</w:t>
       </w:r>
     </w:p>
     <w:p>
@@ -16925,7 +17288,7 @@
         <w:ind w:left="425" w:hanging="425"/>
       </w:pPr>
       <w:r>
-        <w:t>N. Carlini et al., “Extracting training data from large language models,” in Proc. USENIX Security, 2021.</w:t>
+        <w:t>C. Dittmar, K. F. Hildebrand, D. Gärtner, M. Gräber, and C. Landmeyer, “Audio forensics meets music information retrieval—A toolbox for inspection of music plagiarism claims,” in Proc. AES Int. Conf. Semantic Audio, 2012.</w:t>
       </w:r>
     </w:p>
     <w:p>
@@ -16934,7 +17297,7 @@
         <w:ind w:left="425" w:hanging="425"/>
       </w:pPr>
       <w:r>
-        <w:t>M. Müller and S. Ewert, “Chroma Toolbox: MATLAB implementations for extracting variants of chroma-based audio features,” in Proc. ISMIR, 2011.</w:t>
+        <w:t>W. Liu, T. He, C. Gong, N. Zhang, H. Yang, and J. Yan, “Fine-grained music plagiarism detection: Revealing plagiarists through bipartite graph matching and a comprehensive large-scale dataset,” in Proc. ACM Int. Conf. Multimedia, 2023, pp. 8839–8848.</w:t>
       </w:r>
     </w:p>
     <w:p>
@@ -16943,7 +17306,7 @@
         <w:ind w:left="425" w:hanging="425"/>
       </w:pPr>
       <w:r>
-        <w:t>A. Ghias, J. Logan, D. Chamberlin, and B. C. Smith, “Query by humming: Musical information retrieval in an audio database,” in Proc. ACM Multimedia, 1995.</w:t>
+        <w:t>S. Park, H. Kim, J. Jung, J. Park, J. Kim, and J. Nam, “Quantitative analysis of melodic similarity in music copyright infringement cases,” in Proc. ISMIR, 2024.</w:t>
       </w:r>
     </w:p>
     <w:p>
@@ -16952,7 +17315,7 @@
         <w:ind w:left="425" w:hanging="425"/>
       </w:pPr>
       <w:r>
-        <w:t>J. Salamon, J. Serra, and E. Gómez, “Tonal representations for music retrieval: From version identification to query-by-humming,” Int. Journal of Multimedia Information Retrieval, vol. 2, no. 1, pp. 35–48, 2013.</w:t>
+        <w:t>A. Ghias, J. Logan, D. Chamberlin, and B. C. Smith, “Query by humming: Musical information retrieval in an audio database,” in Proc. ACM Multimedia, 1995.</w:t>
       </w:r>
     </w:p>
     <w:p>
@@ -16961,7 +17324,7 @@
         <w:ind w:left="425" w:hanging="425"/>
       </w:pPr>
       <w:r>
-        <w:t>Z. Yu, X. Xu, X. Chen, and D. Yang, “Learning a representation for cover song identification using convolutional neural network,” in Proc. ICASSP, 2020.</w:t>
+        <w:t>J. Salamon, J. Serra, and E. Gómez, “Tonal representations for music retrieval: From version identification to query-by-humming,” Int. Journal of Multimedia Information Retrieval, vol. 2, no. 1, pp. 35–48, 2013.</w:t>
       </w:r>
     </w:p>
     <w:p>
@@ -16970,7 +17333,7 @@
         <w:ind w:left="425" w:hanging="425"/>
       </w:pPr>
       <w:r>
-        <w:t>X. Du, Z. Yu, B. Zhu, X. Chen, and Z. Ma, “ByteCover: Cover song identification via multi-loss training,” in Proc. ICASSP, 2021.</w:t>
+        <w:t>S. Zilberstein, “Using anytime algorithms in intelligent systems,” AI Magazine, vol. 17, no. 3, pp. 73–83, 1996.</w:t>
       </w:r>
     </w:p>
     <w:p>
@@ -16979,7 +17342,7 @@
         <w:ind w:left="425" w:hanging="425"/>
       </w:pPr>
       <w:r>
-        <w:t>F. Liu, D. Tuo, Y. Xu, and X. Han, “CoverHunter: Cover song identification with refined attention and alignments,” in Proc. IEEE ICASSP, 2023.</w:t>
+        <w:t>R. Typke, R. C. Veltkamp, and F. Wiering, “Searching notated polyphonic music using transportation distances,” in Proc. ACM Multimedia, 2004.</w:t>
       </w:r>
     </w:p>
     <w:p>
@@ -16988,7 +17351,7 @@
         <w:ind w:left="425" w:hanging="425"/>
       </w:pPr>
       <w:r>
-        <w:t>C. Dittmar, K. F. Hildebrand, D. Gärtner, M. Gräber, and C. Landmeyer, “Audio forensics meets music information retrieval—A toolbox for inspection of music plagiarism claims,” in Proc. AES Int. Conf. Semantic Audio, 2012.</w:t>
+        <w:t>C. Raffel and D. P. W. Ellis, “Optimizing DTW-based audio-to-MIDI alignment and matching,” in Proc. ICASSP, 2016.</w:t>
       </w:r>
     </w:p>
     <w:p>
@@ -16997,7 +17360,7 @@
         <w:ind w:left="425" w:hanging="425"/>
       </w:pPr>
       <w:r>
-        <w:t>W. Liu, T. He, C. Gong, N. Zhang, H. Yang, and J. Yan, “Fine-grained music plagiarism detection: Revealing plagiarists through bipartite graph matching and a comprehensive large-scale dataset,” in Proc. ACM Int. Conf. Multimedia, 2023, pp. 8839–8848.</w:t>
+        <w:t>C. Raffel, Learning-Based Methods for Comparing Sequences, with Applications to Audio-to-MIDI Alignment and Matching. PhD thesis, Columbia University, 2016 (Lakh MIDI Dataset).</w:t>
       </w:r>
     </w:p>
     <w:p>
@@ -17006,7 +17369,7 @@
         <w:ind w:left="425" w:hanging="425"/>
       </w:pPr>
       <w:r>
-        <w:t>S. Park, H. Kim, J. Jung, J. Park, J. Kim, and J. Nam, “Quantitative analysis of melodic similarity in music copyright infringement cases,” in Proc. ISMIR, 2024.</w:t>
+        <w:t>N. Carlini et al., “Extracting training data from large language models,” in Proc. USENIX Security, 2021.</w:t>
       </w:r>
     </w:p>
     <w:p>
@@ -17015,7 +17378,7 @@
         <w:ind w:left="425" w:hanging="425"/>
       </w:pPr>
       <w:r>
-        <w:t>K. J. M. Lee, J. Ens, S. Adkins, P. Sarmento, et al., “The GigaMIDI dataset with features for expressive music performance detection,” Transactions of the Int. Society for Music Information Retrieval, 2025.</w:t>
+        <w:t>R. Shokri, M. Stronati, C. Song, and V. Shmatikov, “Membership inference attacks against machine learning models,” in Proc. IEEE Symp. Security and Privacy, 2017.</w:t>
       </w:r>
     </w:p>
     <w:p>
@@ -17024,7 +17387,7 @@
         <w:ind w:left="425" w:hanging="425"/>
       </w:pPr>
       <w:r>
-        <w:t>C.-Z. A. Huang et al., “Music Transformer: Generating music with long-term structure,” in Proc. ICLR, 2019.</w:t>
+        <w:t>N. Carlini, J. Hayes, M. Nasr, M. Jagielski, et al., “Extracting training data from diffusion models,” in Proc. USENIX Security, 2023.</w:t>
       </w:r>
     </w:p>
     <w:p>
@@ -17033,7 +17396,7 @@
         <w:ind w:left="425" w:hanging="425"/>
       </w:pPr>
       <w:r>
-        <w:t>R. Shokri, M. Stronati, C. Song, and V. Shmatikov, “Membership inference attacks against machine learning models,” in Proc. IEEE Symp. Security and Privacy, 2017.</w:t>
+        <w:t>K. Lee, D. Ippolito, A. Nystrom, C. Zhang, et al., “Deduplicating training data makes language models better,” in Proc. ACL, 2022.</w:t>
       </w:r>
     </w:p>
     <w:p>
@@ -17042,7 +17405,7 @@
         <w:ind w:left="425" w:hanging="425"/>
       </w:pPr>
       <w:r>
-        <w:t>N. Carlini, J. Hayes, M. Nasr, M. Jagielski, et al., “Extracting training data from diffusion models,” in Proc. USENIX Security, 2023.</w:t>
+        <w:t>N. Kandpal, E. Wallace, and C. Raffel, “Deduplicating training data mitigates privacy risks in language models,” in Proc. ICML, 2022.</w:t>
       </w:r>
     </w:p>
     <w:p>
@@ -17051,7 +17414,7 @@
         <w:ind w:left="425" w:hanging="425"/>
       </w:pPr>
       <w:r>
-        <w:t>K. Lee, D. Ippolito, A. Nystrom, C. Zhang, et al., “Deduplicating training data makes language models better,” in Proc. ACL, 2022.</w:t>
+        <w:t>G. van den Burg and C. Williams, “On memorization in probabilistic deep generative models,” in NeurIPS 2021 Workshop Deep Generative Models, 2021.</w:t>
       </w:r>
     </w:p>
     <w:p>
@@ -17060,7 +17423,7 @@
         <w:ind w:left="425" w:hanging="425"/>
       </w:pPr>
       <w:r>
-        <w:t>N. Kandpal, E. Wallace, and C. Raffel, “Deduplicating training data mitigates privacy risks in language models,” in Proc. ICML, 2022.</w:t>
+        <w:t>C.-Z. A. Huang et al., “Music Transformer: Generating music with long-term structure,” in Proc. ICLR, 2019.</w:t>
       </w:r>
     </w:p>
     <w:p>
@@ -17069,7 +17432,7 @@
         <w:ind w:left="425" w:hanging="425"/>
       </w:pPr>
       <w:r>
-        <w:t>G. van den Burg and C. Williams, “On memorization in probabilistic deep generative models,” in NeurIPS 2021 Workshop Deep Generative Models, 2021.</w:t>
+        <w:t>Y.-C. Liu, J. Yu, K. Cao, S. I. A. Meerza, et al., “Auditing training data in generative music models via black-box membership inference,” in Proc. IEEE Symp. Security and Privacy Workshops (SPW), 2026, pp. 230–237.</w:t>
       </w:r>
     </w:p>
     <w:p>
@@ -17078,7 +17441,7 @@
         <w:ind w:left="425" w:hanging="425"/>
       </w:pPr>
       <w:r>
-        <w:t>Y.-C. Liu, J. Yu, K. Cao, S. I. A. Meerza, et al., “Auditing training data in generative music models via black-box membership inference,” in Proc. IEEE Symp. Security and Privacy Workshops (SPW), 2026, pp. 230–237.</w:t>
+        <w:t>J. Barnett, H. F. Garcia, and B. Pardo, “Exploring musical roots: Applying audio embeddings to empower influence attribution for a generative music model,” arXiv preprint arXiv:2401.14542, 2024.</w:t>
       </w:r>
     </w:p>
     <w:p>
@@ -17087,7 +17450,7 @@
         <w:ind w:left="425" w:hanging="425"/>
       </w:pPr>
       <w:r>
-        <w:t>J. Barnett, H. F. Garcia, and B. Pardo, “Exploring musical roots: Applying audio embeddings to empower influence attribution for a generative music model,” arXiv preprint arXiv:2401.14542, 2024.</w:t>
+        <w:t>S. Stober and T. W. Dornis, “Generative AI training and copyright law,” arXiv preprint arXiv:2502.15858, 2025.</w:t>
       </w:r>
     </w:p>
     <w:p>
@@ -17096,7 +17459,7 @@
         <w:ind w:left="425" w:hanging="425"/>
       </w:pPr>
       <w:r>
-        <w:t>S. Stober and T. W. Dornis, “Generative AI training and copyright law,” arXiv preprint arXiv:2502.15858, 2025.</w:t>
+        <w:t>R. Fagin, A. Lotem, and M. Naor, “Optimal aggregation algorithms for middleware,” in Proc. ACM Symp. Principles of Database Systems (PODS), 2001.</w:t>
       </w:r>
     </w:p>
     <w:p>
@@ -17105,7 +17468,7 @@
         <w:ind w:left="425" w:hanging="425"/>
       </w:pPr>
       <w:r>
-        <w:t>Y. Zhang et al., “Anytime frequent itemset mining: A threshold-free progressive item-activation framework with CPU–GPU heterogeneous collaboration,” under review.</w:t>
+        <w:t>E. L. Lawler and D. E. Wood, “Branch-and-bound methods: A survey,” Operations Research, vol. 14, no. 4, pp. 699–719, 1966.</w:t>
       </w:r>
     </w:p>
     <w:p>
@@ -17114,7 +17477,7 @@
         <w:ind w:left="425" w:hanging="425"/>
       </w:pPr>
       <w:r>
-        <w:t>Y. Zhang et al., “TensorFIM: Exact maximal frequent itemset mining on tensor cores,” under review.</w:t>
+        <w:t>K. J. M. Lee, J. Ens, S. Adkins, P. Sarmento, et al., “The GigaMIDI dataset with features for expressive music performance detection,” Transactions of the Int. Society for Music Information Retrieval, 2025.</w:t>
       </w:r>
     </w:p>
     <w:p>
@@ -17123,7 +17486,7 @@
         <w:ind w:left="425" w:hanging="425"/>
       </w:pPr>
       <w:r>
-        <w:t>R. Fagin, A. Lotem, and M. Naor, “Optimal aggregation algorithms for middleware,” in Proc. ACM Symp. Principles of Database Systems (PODS), 2001.</w:t>
+        <w:t>Y. Zhang et al., “Anytime frequent itemset mining: A threshold-free progressive item-activation framework with CPU–GPU heterogeneous collaboration,” under review.</w:t>
       </w:r>
     </w:p>
     <w:p>
@@ -17132,7 +17495,7 @@
         <w:ind w:left="425" w:hanging="425"/>
       </w:pPr>
       <w:r>
-        <w:t>E. L. Lawler and D. E. Wood, “Branch-and-bound methods: A survey,” Operations Research, vol. 14, no. 4, pp. 699–719, 1966.</w:t>
+        <w:t>Y. Zhang et al., “TensorFIM: Exact maximal frequent itemset mining on tensor cores,” under review.</w:t>
       </w:r>
     </w:p>
     <w:p>

</xml_diff>

<commit_message>
Swap Table I/II to citation order; fix verbose-mode lookbehind so Roman numeral X in table labels is not italicized
</commit_message>
<xml_diff>
--- a/Manuscript.docx
+++ b/Manuscript.docx
@@ -1152,7 +1152,7 @@
         <w:t>|S(P)|</w:t>
       </w:r>
       <w:r>
-        <w:t xml:space="preserve"> postings). Build time and memory grow linearly with corpus size (Fig. 3, Table I); incremental updates append postings for new pieces without rebuilding.</w:t>
+        <w:t xml:space="preserve"> postings). Build time and memory grow linearly with corpus size (Fig. 3); incremental updates append postings for new pieces without rebuilding.</w:t>
       </w:r>
     </w:p>
     <w:p>
@@ -1575,7 +1575,7 @@
         <w:t>|</w:t>
       </w:r>
       <w:r>
-        <w:t xml:space="preserve"> readout after every position. Measured end to end, the index builds in 24.747 s and queries run at p50 = 41.94 ms on the full 174,300-piece corpus (Table I).</w:t>
+        <w:t xml:space="preserve"> readout after every position. Measured end to end, the index builds in 24.747 s and queries run at p50 = 41.94 ms on the full 174,300-piece corpus.</w:t>
       </w:r>
     </w:p>
     <w:p>
@@ -2108,7 +2108,7 @@
         <w:jc w:val="both"/>
       </w:pPr>
       <w:r>
-        <w:t>Operating parameters. Table II summarizes the production configuration used unless a section states otherwise; the ablations of Section V-F justify each choice.</w:t>
+        <w:t>Operating parameters. Table I summarizes the production configuration used unless a section states otherwise; the ablations of Section V-F justify each choice.</w:t>
       </w:r>
     </w:p>
     <w:p>
@@ -2117,7 +2117,7 @@
         <w:keepNext/>
       </w:pPr>
       <w:r>
-        <w:t>TABLE II.</w:t>
+        <w:t>TABLE I.</w:t>
       </w:r>
     </w:p>
     <w:p>
@@ -2766,7 +2766,7 @@
         <w:jc w:val="both"/>
       </w:pPr>
       <w:r>
-        <w:t xml:space="preserve">Fig. 3 reports scaling on subsampled corpora and Table I gives the corresponding numbers. Index build reaches 24.747 s at 174,300 pieces and query latency 41.94 ms (p50), with planted recall 100% at every size. The set-Jaccard scan, the strongest naive baseline, is already 20× slower than the screen at 10k pieces (238 ms vs. 12 ms p50) and infeasible beyond it. MinHash-LSH (128 permutations, 16 bands x 8 rows), the standard accelerated form of the same set-Jaccard semantics, scales gracefully in isolation—173 s of signature construction plus 91 s of bucket building, 587 MB, 6 ms p50 at 174,300 pieces—yet retrieves none of the planted donors at any corpus size (0/47 at </w:t>
+        <w:t xml:space="preserve">Fig. 3 reports scaling on subsampled corpora and Table II gives the corresponding numbers. Index build reaches 24.747 s at 174,300 pieces and query latency 41.94 ms (p50), with planted recall 100% at every size. The set-Jaccard scan, the strongest naive baseline, is already 20× slower than the screen at 10k pieces (238 ms vs. 12 ms p50) and infeasible beyond it. MinHash-LSH (128 permutations, 16 bands x 8 rows), the standard accelerated form of the same set-Jaccard semantics, scales gracefully in isolation—173 s of signature construction plus 91 s of bucket building, 587 MB, 6 ms p50 at 174,300 pieces—yet retrieves none of the planted donors at any corpus size (0/47 at </w:t>
       </w:r>
       <w:r>
         <w:rPr>
@@ -2868,7 +2868,7 @@
         <w:keepNext/>
       </w:pPr>
       <w:r>
-        <w:t>TABLE I.</w:t>
+        <w:t>TABLE II.</w:t>
       </w:r>
     </w:p>
     <w:p>
@@ -13335,16 +13335,7 @@
         <w:jc w:val="both"/>
       </w:pPr>
       <w:r>
-        <w:t xml:space="preserve">Tuning the band configuration moves the operating point along a recall-versus-candidate-volume trade-off, not past it (Table </w:t>
-      </w:r>
-      <w:r>
-        <w:rPr>
-          <w:i/>
-        </w:rPr>
-        <w:t>X</w:t>
-      </w:r>
-      <w:r>
-        <w:t xml:space="preserve">): with the standard 16 x 8 bands at </w:t>
+        <w:t xml:space="preserve">Tuning the band configuration moves the operating point along a recall-versus-candidate-volume trade-off, not past it (Table X): with the standard 16 x 8 bands at </w:t>
       </w:r>
       <w:r>
         <w:rPr>
@@ -13381,34 +13372,25 @@
         <w:jc w:val="both"/>
       </w:pPr>
       <w:r>
-        <w:t xml:space="preserve">Could containment-aware LSH close this gap? Containment estimators [35], [36] replace resemblance with the ratio |A ∩ </w:t>
+        <w:t xml:space="preserve">Could containment-aware LSH close this gap? Containment estimators [35], [36] replace resemblance with the ratio </w:t>
       </w:r>
       <w:r>
         <w:rPr>
           <w:i/>
         </w:rPr>
-        <w:t>B</w:t>
-      </w:r>
-      <w:r>
-        <w:t>| / min(|A|, |</w:t>
+        <w:t>|A ∩ B|</w:t>
+      </w:r>
+      <w:r>
+        <w:t xml:space="preserve"> / </w:t>
       </w:r>
       <w:r>
         <w:rPr>
           <w:i/>
         </w:rPr>
-        <w:t>B</w:t>
-      </w:r>
-      <w:r>
-        <w:t xml:space="preserve">|), which in principle sees a contained copy; two obstacles remain. First, they still operate on unordered sets: containment is blind to note order exactly where our task is sequential, so a contained piece and a permuted collage of the same items are indistinguishable to it. Second, the estimator's variance explodes for small containing sets: a planted span of ~40 items yields MinHash sketches whose containment estimate is too noisy to threshold at the operating point our chain criterion certifies. A full containment-LSH baseline is therefore left as a baseline extension; the point of Table </w:t>
-      </w:r>
-      <w:r>
-        <w:rPr>
-          <w:i/>
-        </w:rPr>
-        <w:t>X</w:t>
-      </w:r>
-      <w:r>
-        <w:t xml:space="preserve"> is that no re-tuning of Jaccard-band geometry reaches the screen's recall, and containment estimators trade that impasse for variance rather than resolving it.</w:t>
+        <w:t>min(|A|, |B|)</w:t>
+      </w:r>
+      <w:r>
+        <w:t>, which in principle sees a contained copy; two obstacles remain. First, they still operate on unordered sets: containment is blind to note order exactly where our task is sequential, so a contained piece and a permuted collage of the same items are indistinguishable to it. Second, the estimator's variance explodes for small containing sets: a planted span of ~40 items yields MinHash sketches whose containment estimate is too noisy to threshold at the operating point our chain criterion certifies. A full containment-LSH baseline is therefore left as a baseline extension; the point of Table X is that no re-tuning of Jaccard-band geometry reaches the screen's recall, and containment estimators trade that impasse for variance rather than resolving it.</w:t>
       </w:r>
     </w:p>
     <w:p>
@@ -13417,16 +13399,7 @@
         <w:keepNext/>
       </w:pPr>
       <w:r>
-        <w:t xml:space="preserve">TABLE </w:t>
-      </w:r>
-      <w:r>
-        <w:rPr>
-          <w:i/>
-        </w:rPr>
-        <w:t>X</w:t>
-      </w:r>
-      <w:r>
-        <w:t>.</w:t>
+        <w:t>TABLE X.</w:t>
       </w:r>
     </w:p>
     <w:p>
@@ -14050,20 +14023,7 @@
         <w:rPr>
           <w:sz w:val="19"/>
         </w:rPr>
-        <w:t xml:space="preserve">Fig. 11. The containment-versus-Jaccard geometry behind Table </w:t>
-      </w:r>
-      <w:r>
-        <w:rPr>
-          <w:i/>
-          <w:sz w:val="19"/>
-        </w:rPr>
-        <w:t>X</w:t>
-      </w:r>
-      <w:r>
-        <w:rPr>
-          <w:sz w:val="19"/>
-        </w:rPr>
-        <w:t>. (a) donor Jaccard distribution over the 337 planted cells (quartiles 0.045/0.099/0.200) with the two operating thresholds marked; (b) recall of the three LSH configurations versus the tolerant screen on the same cells.</w:t>
+        <w:t>Fig. 11. The containment-versus-Jaccard geometry behind Table X. (a) donor Jaccard distribution over the 337 planted cells (quartiles 0.045/0.099/0.200) with the two operating thresholds marked; (b) recall of the three LSH configurations versus the tolerant screen on the same cells.</w:t>
       </w:r>
     </w:p>
     <w:p>

</xml_diff>

<commit_message>
Remove Fig. 3 forward citation in III-B; fix wordy-subscript regex (k_pitch/p_drop were partially subscripted); verify float placement vs first citation
</commit_message>
<xml_diff>
--- a/Manuscript.docx
+++ b/Manuscript.docx
@@ -871,152 +871,74 @@
         <w:rPr>
           <w:i/>
         </w:rPr>
-        <w:t>k</w:t>
+        <w:t>k_pitch</w:t>
+      </w:r>
+      <w:r>
+        <w:t xml:space="preserve">, </w:t>
+      </w:r>
+      <w:r>
+        <w:rPr>
+          <w:i/>
+        </w:rPr>
+        <w:t>k_bin</w:t>
+      </w:r>
+      <w:r>
+        <w:t xml:space="preserve">, </w:t>
+      </w:r>
+      <w:r>
+        <w:rPr>
+          <w:i/>
+        </w:rPr>
+        <w:t>k_vel</w:t>
+      </w:r>
+      <w:r>
+        <w:t xml:space="preserve">), the neighborhood </w:t>
+      </w:r>
+      <w:r>
+        <w:rPr>
+          <w:i/>
+        </w:rPr>
+        <w:t>N</w:t>
       </w:r>
       <w:r>
         <w:rPr>
           <w:i/>
           <w:vertAlign w:val="subscript"/>
         </w:rPr>
-        <w:t>pi</w:t>
+        <w:t>k</w:t>
       </w:r>
       <w:r>
         <w:rPr>
           <w:i/>
         </w:rPr>
-        <w:t>tch</w:t>
-      </w:r>
-      <w:r>
-        <w:t xml:space="preserve">, </w:t>
+        <w:t>(x)</w:t>
+      </w:r>
+      <w:r>
+        <w:t xml:space="preserve"> of an item x is the set of items whose pitch differs by at most </w:t>
       </w:r>
       <w:r>
         <w:rPr>
           <w:i/>
         </w:rPr>
-        <w:t>k</w:t>
+        <w:t>k_pitch</w:t>
+      </w:r>
+      <w:r>
+        <w:t xml:space="preserve"> semitones and whose duration, inter-onset interval (IOI), and velocity bins differ by at most </w:t>
       </w:r>
       <w:r>
         <w:rPr>
           <w:i/>
-          <w:vertAlign w:val="subscript"/>
-        </w:rPr>
-        <w:t>bi</w:t>
+        </w:rPr>
+        <w:t>k_bin</w:t>
+      </w:r>
+      <w:r>
+        <w:t xml:space="preserve"> and </w:t>
       </w:r>
       <w:r>
         <w:rPr>
           <w:i/>
         </w:rPr>
-        <w:t>n</w:t>
-      </w:r>
-      <w:r>
-        <w:t xml:space="preserve">, </w:t>
-      </w:r>
-      <w:r>
-        <w:rPr>
-          <w:i/>
-        </w:rPr>
-        <w:t>k</w:t>
-      </w:r>
-      <w:r>
-        <w:rPr>
-          <w:i/>
-          <w:vertAlign w:val="subscript"/>
-        </w:rPr>
-        <w:t>ve</w:t>
-      </w:r>
-      <w:r>
-        <w:rPr>
-          <w:i/>
-        </w:rPr>
-        <w:t>l</w:t>
-      </w:r>
-      <w:r>
-        <w:t xml:space="preserve">), the neighborhood </w:t>
-      </w:r>
-      <w:r>
-        <w:rPr>
-          <w:i/>
-        </w:rPr>
-        <w:t>N</w:t>
-      </w:r>
-      <w:r>
-        <w:rPr>
-          <w:i/>
-          <w:vertAlign w:val="subscript"/>
-        </w:rPr>
-        <w:t>k</w:t>
-      </w:r>
-      <w:r>
-        <w:rPr>
-          <w:i/>
-        </w:rPr>
-        <w:t>(x)</w:t>
-      </w:r>
-      <w:r>
-        <w:t xml:space="preserve"> of an item x is the set of items whose pitch differs by at most </w:t>
-      </w:r>
-      <w:r>
-        <w:rPr>
-          <w:i/>
-        </w:rPr>
-        <w:t>k</w:t>
-      </w:r>
-      <w:r>
-        <w:rPr>
-          <w:i/>
-          <w:vertAlign w:val="subscript"/>
-        </w:rPr>
-        <w:t>pi</w:t>
-      </w:r>
-      <w:r>
-        <w:rPr>
-          <w:i/>
-        </w:rPr>
-        <w:t>tch</w:t>
-      </w:r>
-      <w:r>
-        <w:t xml:space="preserve"> semitones and whose duration, inter-onset interval (IOI), and velocity bins differ by at most </w:t>
-      </w:r>
-      <w:r>
-        <w:rPr>
-          <w:i/>
-        </w:rPr>
-        <w:t>k</w:t>
-      </w:r>
-      <w:r>
-        <w:rPr>
-          <w:i/>
-          <w:vertAlign w:val="subscript"/>
-        </w:rPr>
-        <w:t>bi</w:t>
-      </w:r>
-      <w:r>
-        <w:rPr>
-          <w:i/>
-        </w:rPr>
-        <w:t>n</w:t>
-      </w:r>
-      <w:r>
-        <w:t xml:space="preserve"> and </w:t>
-      </w:r>
-      <w:r>
-        <w:rPr>
-          <w:i/>
-        </w:rPr>
-        <w:t>k</w:t>
-      </w:r>
-      <w:r>
-        <w:rPr>
-          <w:i/>
-          <w:vertAlign w:val="subscript"/>
-        </w:rPr>
-        <w:t>ve</w:t>
-      </w:r>
-      <w:r>
-        <w:rPr>
-          <w:i/>
-        </w:rPr>
-        <w:t>l</w:t>
+        <w:t>k_vel</w:t>
       </w:r>
       <w:r>
         <w:t xml:space="preserve"> bins respectively. A planted copy of a span </w:t>
@@ -1152,7 +1074,7 @@
         <w:t>|S(P)|</w:t>
       </w:r>
       <w:r>
-        <w:t xml:space="preserve"> postings). Build time and memory grow linearly with corpus size (Fig. 3); incremental updates append postings for new pieces without rebuilding.</w:t>
+        <w:t xml:space="preserve"> postings). Build time and memory grow linearly with corpus size; incremental updates append postings for new pieces without rebuilding.</w:t>
       </w:r>
     </w:p>
     <w:p>
@@ -5166,42 +5088,16 @@
         <w:rPr>
           <w:i/>
         </w:rPr>
-        <w:t>k</w:t>
+        <w:t>k_pitch</w:t>
+      </w:r>
+      <w:r>
+        <w:t xml:space="preserve"> = 2, </w:t>
       </w:r>
       <w:r>
         <w:rPr>
           <w:i/>
-          <w:vertAlign w:val="subscript"/>
-        </w:rPr>
-        <w:t>pi</w:t>
-      </w:r>
-      <w:r>
-        <w:rPr>
-          <w:i/>
-        </w:rPr>
-        <w:t>tch</w:t>
-      </w:r>
-      <w:r>
-        <w:t xml:space="preserve"> = 2, </w:t>
-      </w:r>
-      <w:r>
-        <w:rPr>
-          <w:i/>
-        </w:rPr>
-        <w:t>k</w:t>
-      </w:r>
-      <w:r>
-        <w:rPr>
-          <w:i/>
-          <w:vertAlign w:val="subscript"/>
-        </w:rPr>
-        <w:t>bi</w:t>
-      </w:r>
-      <w:r>
-        <w:rPr>
-          <w:i/>
-        </w:rPr>
-        <w:t>n</w:t>
+        </w:rPr>
+        <w:t>k_bin</w:t>
       </w:r>
       <w:r>
         <w:t xml:space="preserve"> = 1). Bold marks cells below 100 %.</w:t>
@@ -6904,24 +6800,7 @@
                 <w:i/>
                 <w:sz w:val="16"/>
               </w:rPr>
-              <w:t>p</w:t>
-            </w:r>
-            <w:r>
-              <w:rPr>
-                <w:rFonts w:ascii="Times New Roman" w:hAnsi="Times New Roman"/>
-                <w:i/>
-                <w:sz w:val="16"/>
-                <w:vertAlign w:val="subscript"/>
-              </w:rPr>
-              <w:t>dr</w:t>
-            </w:r>
-            <w:r>
-              <w:rPr>
-                <w:rFonts w:ascii="Times New Roman" w:hAnsi="Times New Roman"/>
-                <w:i/>
-                <w:sz w:val="16"/>
-              </w:rPr>
-              <w:t>op</w:t>
+              <w:t>p_drop</w:t>
             </w:r>
             <w:r>
               <w:rPr>
@@ -7060,24 +6939,7 @@
                 <w:i/>
                 <w:sz w:val="16"/>
               </w:rPr>
-              <w:t>p</w:t>
-            </w:r>
-            <w:r>
-              <w:rPr>
-                <w:rFonts w:ascii="Times New Roman" w:hAnsi="Times New Roman"/>
-                <w:i/>
-                <w:sz w:val="16"/>
-                <w:vertAlign w:val="subscript"/>
-              </w:rPr>
-              <w:t>dr</w:t>
-            </w:r>
-            <w:r>
-              <w:rPr>
-                <w:rFonts w:ascii="Times New Roman" w:hAnsi="Times New Roman"/>
-                <w:i/>
-                <w:sz w:val="16"/>
-              </w:rPr>
-              <w:t>op</w:t>
+              <w:t>p_drop</w:t>
             </w:r>
             <w:r>
               <w:rPr>
@@ -7216,24 +7078,7 @@
                 <w:i/>
                 <w:sz w:val="16"/>
               </w:rPr>
-              <w:t>p</w:t>
-            </w:r>
-            <w:r>
-              <w:rPr>
-                <w:rFonts w:ascii="Times New Roman" w:hAnsi="Times New Roman"/>
-                <w:i/>
-                <w:sz w:val="16"/>
-                <w:vertAlign w:val="subscript"/>
-              </w:rPr>
-              <w:t>dr</w:t>
-            </w:r>
-            <w:r>
-              <w:rPr>
-                <w:rFonts w:ascii="Times New Roman" w:hAnsi="Times New Roman"/>
-                <w:i/>
-                <w:sz w:val="16"/>
-              </w:rPr>
-              <w:t>op</w:t>
+              <w:t>p_drop</w:t>
             </w:r>
             <w:r>
               <w:rPr>

</xml_diff>

<commit_message>
Move Table II note into the spanning island; restore closing line; add Proposition 1
- The 'Rows are corpus-size subsamples...' note is the Table II note;
  it now typesets inside the full-width island (three_line_table gains
  a note= parameter) instead of flowing in the two-column body
- Restore the full-width closing line after the references (removed
  during the 13-page repack; kept, cost absorbed elsewhere)
- Theory upgrade: Proposition 1 (containment invisibility of
  resemblance, J <= q/p) formalizes the negative result that
  motivated the architecture; Theorem 1 retitled 'tolerant evidence
  lower bound and certified open set'; intro, contributions, and
  Section V-G now cite the proposition; Fig. 1 island moves mid-intro
  so the page stays full
- Audit: 13 pages; every figure/table appears same or next page after
  first citation; table order I..XIV intact
</commit_message>
<xml_diff>
--- a/Manuscript.docx
+++ b/Manuscript.docx
@@ -234,7 +234,7 @@
         <w:jc w:val="both"/>
       </w:pPr>
       <w:r>
-        <w:t>Nor can the gap be closed by re-tuning the engines that power large-scale deduplication. The obstacle is geometric: a copied span of about 40 items embedded in a piece of about 700 items scores below 0.10 in set-Jaccard under a perfect oracle (measured quartiles 0.045/0.099/0.200 over our 337-cell adversarial audit), and no band configuration of a MinHash-LSH index recovers such a donor at any operating point (Section V-G). Relative overlap has no threshold at which a contained copy becomes visible, so resemblance cannot be tuned into recall; containment must be verified query-side, not estimated corpus-side. This negative result is what motivates the architecture: the screen's contract must be stated on evidence, not on similarity.</w:t>
+        <w:t>Nor can the gap be closed by re-tuning the engines that power large-scale deduplication. The obstacle is geometric: a copied span of about 40 items embedded in a piece of about 700 items scores below 0.10 in set-Jaccard under a perfect oracle (measured quartiles 0.045/0.099/0.200 over our 337-cell adversarial audit), and no band configuration of a MinHash-LSH index recovers such a donor at any operating point (Section V-G). Relative overlap has no threshold at which a contained copy becomes visible, so resemblance cannot be tuned into recall; containment must be verified query-side, not estimated corpus-side (Proposition 1 formalizes the invisibility; Section V-G measures it). This negative result is what motivates the architecture: the screen's contract must be stated on evidence, not on similarity.</w:t>
       </w:r>
     </w:p>
     <w:p>
@@ -244,77 +244,7 @@
         <w:jc w:val="both"/>
       </w:pPr>
       <w:r>
-        <w:t>Cover-song identification has moved to learned audio embeddings [8]–[10], while plagiarism detection specifically has been addressed with chroma-based forensics [11], bipartite graph matching [12], and melodic-similarity analysis of real copyright cases [13]; these audio- and embedding-centric methods, like query-by-humming lineage [14], [15], do not provide a symbolic, per-query recall guarantee of the kind a publisher can contract against.</w:t>
-      </w:r>
-    </w:p>
-    <w:p>
-      <w:pPr>
-        <w:spacing w:after="0"/>
-        <w:ind w:firstLine="204"/>
-        <w:jc w:val="both"/>
-      </w:pPr>
-      <w:r>
-        <w:t>This paper's thesis is architectural: the three requirements decompose across two layers with different contracts. The first layer maximizes recall under a stated noise model and proves it—an evidence lower bound that holds for any query whose per-note deviation stays within declared tolerances. The second layer maximizes precision by checking structure that style peers do not share: the ordered chain of notes with their inter-onset intervals. We additionally require the first layer to be anytime [16]: under a partial budget it must return the best partial answer together with a sound bound on what remains open.</w:t>
-      </w:r>
-    </w:p>
-    <w:p>
-      <w:pPr>
-        <w:spacing w:after="0"/>
-        <w:ind w:firstLine="204"/>
-        <w:jc w:val="both"/>
-      </w:pPr>
-      <w:r>
-        <w:t xml:space="preserve">Our findings, all measured on the Lakh MIDI corpus (full corpus, 174,300 pieces), are: (1) item-set containment alone is screening-grade only—on style-similar hard negatives its fragment-level false-positive rate reaches 93%, and no threshold repairs this without destroying recall; (2) a strict-tolerance ordered-chain confirmation layer on top of the screen cuts the false-positive rate to 2.1% at 83.9% recall under transcription noise, meeting the &lt;5% screening requirement of a decision-support tool; (3) the screen's rare-first schedule tightens the certified open-candidate bound by 1.1× over a hot-first schedule at 70% budget, with identical full-budget recall. </w:t>
-      </w:r>
-    </w:p>
-    <w:p>
-      <w:pPr>
-        <w:spacing w:after="0"/>
-        <w:ind w:firstLine="204"/>
-        <w:jc w:val="both"/>
-      </w:pPr>
-      <w:r>
-        <w:t>Two further findings complete the picture: (4) detection on a controlled memorization spectrum rises monotonically to 100% at full copying; and (5) a full-corpus census over 174,300 pieces measures 5.6 billion candidate pairs at the screening operating point, and a stratified audit of the high-scoring candidates confirms an estimated 107k verbatim-level duplicate pairs at 90% channel precision, while on in-the-wild cases the system localizes a spliced 30-second segment and recovers a +3-semitone transposed cover with exact, score-checkable alignment maps.</w:t>
-      </w:r>
-    </w:p>
-    <w:p>
-      <w:pPr>
-        <w:spacing w:after="0"/>
-        <w:ind w:firstLine="204"/>
-        <w:jc w:val="both"/>
-      </w:pPr>
-      <w:r>
-        <w:t xml:space="preserve">The through-line of these results is that guarantees, not thresholds, are the unit of design: each layer is specified by a contract it must honor, and every reported number is a measurement of contract compliance rather than a tuned operating point. The contributions are: (1) an architectural decomposition of copy detection into a provable-recall screening problem and a structural confirmation problem, with formal contracts for each layer, validated by a controlled negative result: no single item-level method reaches decision-grade precision, and no purely structural method scales; (2) a tolerant item-set screen whose per-query recall is guaranteed by a sound evidence lower bound under a declared noise model, auditable cell by cell on 337 adversarial cells with zero violations; (3) an anytime schedule analysis showing that rare-first processing tightens the certified open-candidate bound over hot-first under partial budgets (by 1.1× at 70% budget) and that the bound is computable after any schedule prefix, turning an engineering heuristic into a schedulable guarantee. </w:t>
-      </w:r>
-    </w:p>
-    <w:p>
-      <w:pPr>
-        <w:spacing w:after="0"/>
-        <w:ind w:firstLine="204"/>
-        <w:jc w:val="both"/>
-      </w:pPr>
-      <w:r>
-        <w:t>The last two contributions are systems-level: (4) a strict-tolerance ordered-chain confirmation layer that outputs note-level alignment evidence, reaching 2.1% fragment-level false positives at 83.9% recall on style-similar hard negatives, together with a controlled memorization study showing monotone detection growth and 96-100% correct source attribution under full copying, together with a full-corpus census over 174,300 pieces that measures 5.6 billion candidate pairs at the screening operating point and, via a stratified adjudication audit, an estimated 107k verbatim-level duplicate pairs at 90% channel precision; and (5) a fully scripted reproduction release that regenerates every number, table, and figure in this paper from the raw corpus download.</w:t>
-      </w:r>
-    </w:p>
-    <w:p>
-      <w:pPr>
-        <w:spacing w:after="0"/>
-        <w:ind w:firstLine="204"/>
-        <w:jc w:val="both"/>
-      </w:pPr>
-      <w:r>
-        <w:t>Section II reviews related work. Section III formalizes the problem, states the evidence-bound theorem, and describes the three processing layers. Section IV details the experimental setup and operating parameters. Section V reports controlled experiments; Section VI reports real-world studies. Section VII discusses limitations and deployment considerations, and Section VIII concludes.</w:t>
-      </w:r>
-    </w:p>
-    <w:p>
-      <w:pPr>
-        <w:spacing w:after="0"/>
-        <w:ind w:firstLine="204"/>
-        <w:jc w:val="both"/>
-      </w:pPr>
-      <w:r>
-        <w:t>Fig. 1 previews the whole system as an evidence funnel: candidate sets narrow through the L1 screen and the L2 top-</w:t>
+        <w:t>Cover-song identification has moved to learned audio embeddings [8]–[10], while plagiarism detection specifically has been addressed with chroma-based forensics [11], bipartite graph matching [12], and melodic-similarity analysis of real copyright cases [13]; these audio- and embedding-centric methods, like query-by-humming lineage [14], [15], do not provide a symbolic, per-query recall guarantee of the kind a publisher can contract against. Fig. 1 previews the whole system as an evidence funnel: candidate sets narrow through the L1 screen and the L2 top-</w:t>
       </w:r>
       <w:r>
         <w:rPr>
@@ -424,29 +354,12 @@
     </w:p>
     <w:p>
       <w:pPr>
-        <w:pStyle w:val="Heading1"/>
-      </w:pPr>
-      <w:r>
-        <w:t>II. RELATED WORK</w:t>
-      </w:r>
-    </w:p>
-    <w:p>
-      <w:pPr>
-        <w:pStyle w:val="Heading2"/>
-        <w:spacing w:before="100"/>
-      </w:pPr>
-      <w:r>
-        <w:t>A. Symbolic music retrieval and pattern discovery</w:t>
-      </w:r>
-    </w:p>
-    <w:p>
-      <w:pPr>
         <w:spacing w:after="0"/>
         <w:ind w:firstLine="204"/>
         <w:jc w:val="both"/>
       </w:pPr>
       <w:r>
-        <w:t>Sequence-based matching of notated music under edit distance and transportation distance was established by Typke et al. [17], and geometric repeated-pattern discovery by Meredith et al. [5]. Surveying the field, Casey et al. [1] and Typke et al. [2] separate audio-descriptor approaches from symbolic approaches; Müller [3], [4] systematize chroma and alignment techniques. Our screen layer inherits the item-set view of FIM [6], [7] but replaces corpus-side enumeration with query-side containment verification, trading pattern completeness for a provable per-query recall contract.</w:t>
+        <w:t>This paper's thesis is architectural: the three requirements decompose across two layers with different contracts. The first layer maximizes recall under a stated noise model and proves it—an evidence lower bound that holds for any query whose per-note deviation stays within declared tolerances. The second layer maximizes precision by checking structure that style peers do not share: the ordered chain of notes with their inter-onset intervals. We additionally require the first layer to be anytime [16]: under a partial budget it must return the best partial answer together with a sound bound on what remains open. To our knowledge, no prior copy-detection system states and audits its screening contract as a per-query recall guarantee under a declared noise model.</w:t>
       </w:r>
     </w:p>
     <w:p>
@@ -456,7 +369,7 @@
         <w:jc w:val="both"/>
       </w:pPr>
       <w:r>
-        <w:t xml:space="preserve">Symbolic version identification has a complementary lineage. Alignment-based matching of MIDI to audio [18] and sequence-comparison methods benchmarked on the Lakh corpus [19] establish that symbolic sequences support robust matching, but their cost is per-candidate: applied as corpus-wide filters they do not scale, and applied after a cheap filter they inherit the filter's recall, which none of these systems bounds. </w:t>
+        <w:t xml:space="preserve">Our findings, all measured on the Lakh MIDI corpus (full corpus, 174,300 pieces), are: (1) item-set containment alone is screening-grade only—on style-similar hard negatives its fragment-level false-positive rate reaches 93%, and no threshold repairs this without destroying recall; (2) a strict-tolerance ordered-chain confirmation layer on top of the screen cuts the false-positive rate to 2.1% at 83.9% recall under transcription noise, meeting the &lt;5% screening requirement of a decision-support tool; (3) the screen's rare-first schedule tightens the certified open-candidate bound by 1.1× over a hot-first schedule at 70% budget, with identical full-budget recall. </w:t>
       </w:r>
     </w:p>
     <w:p>
@@ -466,25 +379,7 @@
         <w:jc w:val="both"/>
       </w:pPr>
       <w:r>
-        <w:t>Our screen layer can be read as a recall-guaranteed candidate generator for exactly such aligners: it hands confirmation a top-</w:t>
-      </w:r>
-      <w:r>
-        <w:rPr>
-          <w:i/>
-        </w:rPr>
-        <w:t>C</w:t>
-      </w:r>
-      <w:r>
-        <w:t xml:space="preserve"> set small enough that exact structural alignment becomes affordable, while the bound certifies that nothing outside the set needs alignment at all.</w:t>
-      </w:r>
-    </w:p>
-    <w:p>
-      <w:pPr>
-        <w:pStyle w:val="Heading2"/>
-        <w:spacing w:before="100"/>
-      </w:pPr>
-      <w:r>
-        <w:t>B. Memorization in generative models</w:t>
+        <w:t>Two further findings complete the picture: (4) detection on a controlled memorization spectrum rises monotonically to 100% at full copying; and (5) a full-corpus census over 174,300 pieces measures 5.6 billion candidate pairs at the screening operating point, and a stratified audit of the high-scoring candidates confirms an estimated 107k verbatim-level duplicate pairs at 90% channel precision, while on in-the-wild cases the system localizes a spliced 30-second segment and recovers a +3-semitone transposed cover with exact, score-checkable alignment maps.</w:t>
       </w:r>
     </w:p>
     <w:p>
@@ -494,7 +389,7 @@
         <w:jc w:val="both"/>
       </w:pPr>
       <w:r>
-        <w:t xml:space="preserve">Carlini et al. [20] demonstrated that large language models regurgitate training sequences and that extraction is detectable with membership tests [21]; the same extraction was then shown for diffusion models [22]. Deduplication reduces both verbatim regurgitation and privacy leakage [23], [24], and memorization is measurable even in probabilistic deep generative models [25]. For music specifically, symbolic generators such as Music Transformer [26] are trained on scraped MIDI, membership-inference auditing of generative music models has only recently been demonstrated [27], influence-level attribution has been explored with audio embeddings [28], and the legal status of such training data remains contested [29]. </w:t>
+        <w:t xml:space="preserve">The through-line of these results is that guarantees, not thresholds, are the unit of design: each layer is specified by a contract it must honor, and every reported number is a measurement of contract compliance rather than a tuned operating point. The contributions are: (1) an architectural decomposition of copy detection into a provable-recall screening problem and a structural confirmation problem, with formal contracts for each layer, motivated by a negative result that is also a theorem (Proposition 1: no corpus-side resemblance threshold attains complete recall on contained copies) and validated empirically: no single item-level method reaches decision-grade precision, and no purely structural method scales; (2) a tolerant item-set screen whose per-query recall is guaranteed by a sound evidence lower bound under a declared noise model, auditable cell by cell on 337 adversarial cells with zero violations; (3) an anytime schedule analysis showing that rare-first processing tightens the certified open-candidate bound over hot-first under partial budgets (by 1.1× at 70% budget) and that the bound is computable after any schedule prefix, turning an engineering heuristic into a schedulable guarantee. </w:t>
       </w:r>
     </w:p>
     <w:p>
@@ -504,16 +399,7 @@
         <w:jc w:val="both"/>
       </w:pPr>
       <w:r>
-        <w:t>Publishers consequently need batch screening tools rather than per-sample membership oracles. Our controlled experiments (Section VI-A) emulate the memorization spectrum without training neural models, using n-gram order and a copy operator—a deliberately transparent stand-in that exposes exactly where contiguity-based detection breaks down.</w:t>
-      </w:r>
-    </w:p>
-    <w:p>
-      <w:pPr>
-        <w:pStyle w:val="Heading2"/>
-        <w:spacing w:before="100"/>
-      </w:pPr>
-      <w:r>
-        <w:t>C. Anytime algorithms</w:t>
+        <w:t>The last two contributions are systems-level: (4) a strict-tolerance ordered-chain confirmation layer that outputs note-level alignment evidence, reaching 2.1% fragment-level false positives at 83.9% recall on style-similar hard negatives, together with a controlled memorization study showing monotone detection growth and 96-100% correct source attribution under full copying, together with a full-corpus census over 174,300 pieces that measures 5.6 billion candidate pairs at the screening operating point and, via a stratified adjudication audit, an estimated 107k verbatim-level duplicate pairs at 90% channel precision; and (5) a fully scripted reproduction release that regenerates every number, table, and figure in this paper from the raw corpus download.</w:t>
       </w:r>
     </w:p>
     <w:p>
@@ -523,7 +409,24 @@
         <w:jc w:val="both"/>
       </w:pPr>
       <w:r>
-        <w:t>Zilberstein [16] formalized anytime algorithms: interruptible procedures whose intermediate results improve monotonically and can be accompanied by a bound on unexplored outcomes. Our screen adopts this contract at the level of evidence items: after any prefix of the rare-first schedule, the set of pieces that can still reach the threshold is exactly computable, which turns an engineering heuristic into a guarantee a publisher can schedule around.</w:t>
+        <w:t>Section II reviews related work. Section III formalizes the problem, states the evidence-bound theorem, and describes the three processing layers. Section IV details the experimental setup and operating parameters. Section V reports controlled experiments; Section VI reports real-world studies. Section VII discusses limitations and deployment considerations, and Section VIII concludes.</w:t>
+      </w:r>
+    </w:p>
+    <w:p>
+      <w:pPr>
+        <w:pStyle w:val="Heading1"/>
+      </w:pPr>
+      <w:r>
+        <w:t>II. RELATED WORK</w:t>
+      </w:r>
+    </w:p>
+    <w:p>
+      <w:pPr>
+        <w:pStyle w:val="Heading2"/>
+        <w:spacing w:before="100"/>
+      </w:pPr>
+      <w:r>
+        <w:t>A. Symbolic music retrieval and pattern discovery</w:t>
       </w:r>
     </w:p>
     <w:p>
@@ -533,64 +436,7 @@
         <w:jc w:val="both"/>
       </w:pPr>
       <w:r>
-        <w:t>The bound instantiates a classical pattern. Threshold algorithms for top-</w:t>
-      </w:r>
-      <w:r>
-        <w:rPr>
-          <w:i/>
-        </w:rPr>
-        <w:t>k</w:t>
-      </w:r>
-      <w:r>
-        <w:t xml:space="preserve"> aggregation [30] maintain a partial-score bound under which no unseen candidate can qualify, and branch-and-bound search [31] carries an admissible estimate of everything not yet explored. Theorem 1 transfers this contract to tolerant item-set evidence: because every unprocessed position can contribute at most one to any piece, </w:t>
-      </w:r>
-      <w:r>
-        <w:rPr>
-          <w:i/>
-        </w:rPr>
-        <w:t>score</w:t>
-      </w:r>
-      <w:r>
-        <w:rPr>
-          <w:i/>
-          <w:vertAlign w:val="subscript"/>
-        </w:rPr>
-        <w:t>u</w:t>
-      </w:r>
-      <w:r>
-        <w:rPr>
-          <w:i/>
-        </w:rPr>
-        <w:t>(P)</w:t>
-      </w:r>
-      <w:r>
-        <w:t xml:space="preserve"> + (</w:t>
-      </w:r>
-      <w:r>
-        <w:rPr>
-          <w:i/>
-        </w:rPr>
-        <w:t>q</w:t>
-      </w:r>
-      <w:r>
-        <w:t xml:space="preserve"> − </w:t>
-      </w:r>
-      <w:r>
-        <w:rPr>
-          <w:i/>
-        </w:rPr>
-        <w:t>u</w:t>
-      </w:r>
-      <w:r>
-        <w:t>) plays the role of the partial bound, with tolerance turning it into a certified floor on final evidence rather than an optimistic estimate. We are not aware of an evidence bound of this form stated and cell-by-cell audited for music retrieval.</w:t>
-      </w:r>
-    </w:p>
-    <w:p>
-      <w:pPr>
-        <w:pStyle w:val="Heading1"/>
-      </w:pPr>
-      <w:r>
-        <w:t>III. SYSTEM</w:t>
+        <w:t>Sequence-based matching of notated music under edit distance and transportation distance was established by Typke et al. [17], and geometric repeated-pattern discovery by Meredith et al. [5]. Surveying the field, Casey et al. [1] and Typke et al. [2] separate audio-descriptor approaches from symbolic approaches; Müller [3], [4] systematize chroma and alignment techniques. Our screen layer inherits the item-set view of FIM [6], [7] but replaces corpus-side enumeration with query-side containment verification, trading pattern completeness for a provable per-query recall contract.</w:t>
       </w:r>
     </w:p>
     <w:p>
@@ -600,16 +446,7 @@
         <w:jc w:val="both"/>
       </w:pPr>
       <w:r>
-        <w:t>Fig. 2 shows the pipeline. All layers operate on a shared event encoding; the screen and the confirmation use different tolerances by design.</w:t>
-      </w:r>
-    </w:p>
-    <w:p>
-      <w:pPr>
-        <w:pStyle w:val="Heading2"/>
-        <w:spacing w:before="100"/>
-      </w:pPr>
-      <w:r>
-        <w:t>A. Problem statement and notation</w:t>
+        <w:t xml:space="preserve">Symbolic version identification has a complementary lineage. Alignment-based matching of MIDI to audio [18] and sequence-comparison methods benchmarked on the Lakh corpus [19] establish that symbolic sequences support robust matching, but their cost is per-candidate: applied as corpus-wide filters they do not scale, and applied after a cheap filter they inherit the filter's recall, which none of these systems bounds. </w:t>
       </w:r>
     </w:p>
     <w:p>
@@ -619,276 +456,25 @@
         <w:jc w:val="both"/>
       </w:pPr>
       <w:r>
-        <w:t xml:space="preserve">A piece </w:t>
+        <w:t>Our screen layer can be read as a recall-guaranteed candidate generator for exactly such aligners: it hands confirmation a top-</w:t>
       </w:r>
       <w:r>
         <w:rPr>
           <w:i/>
         </w:rPr>
-        <w:t>P</w:t>
-      </w:r>
-      <w:r>
-        <w:t xml:space="preserve"> = (</w:t>
-      </w:r>
-      <w:r>
-        <w:rPr>
-          <w:i/>
-        </w:rPr>
-        <w:t>e₁</w:t>
-      </w:r>
-      <w:r>
-        <w:t xml:space="preserve">, …, </w:t>
-      </w:r>
-      <w:r>
-        <w:rPr>
-          <w:i/>
-        </w:rPr>
-        <w:t>e</w:t>
-      </w:r>
-      <w:r>
-        <w:rPr>
-          <w:i/>
-          <w:vertAlign w:val="subscript"/>
-        </w:rPr>
-        <w:t>n</w:t>
-      </w:r>
-      <w:r>
-        <w:t xml:space="preserve">) is a sequence of note events </w:t>
-      </w:r>
-      <w:r>
-        <w:rPr>
-          <w:i/>
-        </w:rPr>
-        <w:t>e</w:t>
-      </w:r>
-      <w:r>
-        <w:rPr>
-          <w:i/>
-          <w:vertAlign w:val="subscript"/>
-        </w:rPr>
-        <w:t>i</w:t>
-      </w:r>
-      <w:r>
-        <w:t xml:space="preserve"> = (</w:t>
-      </w:r>
-      <w:r>
-        <w:rPr>
-          <w:i/>
-        </w:rPr>
-        <w:t>t</w:t>
-      </w:r>
-      <w:r>
-        <w:rPr>
-          <w:i/>
-          <w:vertAlign w:val="subscript"/>
-        </w:rPr>
-        <w:t>i</w:t>
-      </w:r>
-      <w:r>
-        <w:t xml:space="preserve">, </w:t>
-      </w:r>
-      <w:r>
-        <w:rPr>
-          <w:i/>
-        </w:rPr>
-        <w:t>p</w:t>
-      </w:r>
-      <w:r>
-        <w:rPr>
-          <w:i/>
-          <w:vertAlign w:val="subscript"/>
-        </w:rPr>
-        <w:t>i</w:t>
-      </w:r>
-      <w:r>
-        <w:t xml:space="preserve">, </w:t>
-      </w:r>
-      <w:r>
-        <w:rPr>
-          <w:i/>
-        </w:rPr>
-        <w:t>d</w:t>
-      </w:r>
-      <w:r>
-        <w:rPr>
-          <w:i/>
-          <w:vertAlign w:val="subscript"/>
-        </w:rPr>
-        <w:t>i</w:t>
-      </w:r>
-      <w:r>
-        <w:t xml:space="preserve">, </w:t>
-      </w:r>
-      <w:r>
-        <w:rPr>
-          <w:i/>
-        </w:rPr>
-        <w:t>v</w:t>
-      </w:r>
-      <w:r>
-        <w:rPr>
-          <w:i/>
-          <w:vertAlign w:val="subscript"/>
-        </w:rPr>
-        <w:t>i</w:t>
-      </w:r>
-      <w:r>
-        <w:t xml:space="preserve">): onset time, MIDI pitch, duration, and velocity. An encoding </w:t>
-      </w:r>
-      <w:r>
-        <w:rPr>
-          <w:i/>
-        </w:rPr>
-        <w:t>φ</w:t>
-      </w:r>
-      <w:r>
-        <w:t xml:space="preserve"> maps each event to an item, a tuple of quantized features (Section III-B); the item set </w:t>
-      </w:r>
-      <w:r>
-        <w:rPr>
-          <w:i/>
-        </w:rPr>
-        <w:t>S(P)</w:t>
-      </w:r>
-      <w:r>
-        <w:t>, the union of {</w:t>
-      </w:r>
-      <w:r>
-        <w:rPr>
-          <w:i/>
-        </w:rPr>
-        <w:t>φ</w:t>
-      </w:r>
-      <w:r>
-        <w:t>(</w:t>
-      </w:r>
-      <w:r>
-        <w:rPr>
-          <w:i/>
-        </w:rPr>
-        <w:t>e</w:t>
-      </w:r>
-      <w:r>
-        <w:rPr>
-          <w:i/>
-          <w:vertAlign w:val="subscript"/>
-        </w:rPr>
-        <w:t>i</w:t>
-      </w:r>
-      <w:r>
-        <w:t xml:space="preserve">)} over all positions, discards order and repetition. For tolerance vector </w:t>
-      </w:r>
-      <w:r>
-        <w:rPr>
-          <w:i/>
-        </w:rPr>
-        <w:t>k</w:t>
-      </w:r>
-      <w:r>
-        <w:t xml:space="preserve"> = (</w:t>
-      </w:r>
-      <w:r>
-        <w:rPr>
-          <w:i/>
-        </w:rPr>
-        <w:t>k_pitch</w:t>
-      </w:r>
-      <w:r>
-        <w:t xml:space="preserve">, </w:t>
-      </w:r>
-      <w:r>
-        <w:rPr>
-          <w:i/>
-        </w:rPr>
-        <w:t>k_bin</w:t>
-      </w:r>
-      <w:r>
-        <w:t xml:space="preserve">, </w:t>
-      </w:r>
-      <w:r>
-        <w:rPr>
-          <w:i/>
-        </w:rPr>
-        <w:t>k_vel</w:t>
-      </w:r>
-      <w:r>
-        <w:t xml:space="preserve">), the neighborhood </w:t>
-      </w:r>
-      <w:r>
-        <w:rPr>
-          <w:i/>
-        </w:rPr>
-        <w:t>N</w:t>
-      </w:r>
-      <w:r>
-        <w:rPr>
-          <w:i/>
-          <w:vertAlign w:val="subscript"/>
-        </w:rPr>
-        <w:t>k</w:t>
-      </w:r>
-      <w:r>
-        <w:rPr>
-          <w:i/>
-        </w:rPr>
-        <w:t>(x)</w:t>
-      </w:r>
-      <w:r>
-        <w:t xml:space="preserve"> of an item x is the set of items whose pitch differs by at most </w:t>
-      </w:r>
-      <w:r>
-        <w:rPr>
-          <w:i/>
-        </w:rPr>
-        <w:t>k_pitch</w:t>
-      </w:r>
-      <w:r>
-        <w:t xml:space="preserve"> semitones and whose duration, inter-onset interval (IOI), and velocity bins differ by at most </w:t>
-      </w:r>
-      <w:r>
-        <w:rPr>
-          <w:i/>
-        </w:rPr>
-        <w:t>k_bin</w:t>
-      </w:r>
-      <w:r>
-        <w:t xml:space="preserve"> and </w:t>
-      </w:r>
-      <w:r>
-        <w:rPr>
-          <w:i/>
-        </w:rPr>
-        <w:t>k_vel</w:t>
-      </w:r>
-      <w:r>
-        <w:t xml:space="preserve"> bins respectively. A planted copy of a span </w:t>
-      </w:r>
-      <w:r>
-        <w:rPr>
-          <w:i/>
-        </w:rPr>
-        <w:t>X</w:t>
-      </w:r>
-      <w:r>
-        <w:t xml:space="preserve"> is produced by transforming every event of </w:t>
-      </w:r>
-      <w:r>
-        <w:rPr>
-          <w:i/>
-        </w:rPr>
-        <w:t>X</w:t>
-      </w:r>
-      <w:r>
-        <w:t xml:space="preserve"> with one of the six families of Section IV; the declared screen tolerance </w:t>
-      </w:r>
-      <w:r>
-        <w:rPr>
-          <w:i/>
-        </w:rPr>
-        <w:t>k</w:t>
-      </w:r>
-      <w:r>
-        <w:t xml:space="preserve"> = (2, 1, 1) covers all families except transposition beyond ±2 semitones and transcription jitter beyond ±1 bin, which the interval-sketch index of Section III-B handles separately.</w:t>
+        <w:t>C</w:t>
+      </w:r>
+      <w:r>
+        <w:t xml:space="preserve"> set small enough that exact structural alignment becomes affordable, while the bound certifies that nothing outside the set needs alignment at all.</w:t>
+      </w:r>
+    </w:p>
+    <w:p>
+      <w:pPr>
+        <w:pStyle w:val="Heading2"/>
+        <w:spacing w:before="100"/>
+      </w:pPr>
+      <w:r>
+        <w:t>B. Memorization in generative models</w:t>
       </w:r>
     </w:p>
     <w:p>
@@ -898,33 +484,437 @@
         <w:jc w:val="both"/>
       </w:pPr>
       <w:r>
-        <w:t>Problem. Given a corpus D = {</w:t>
+        <w:t xml:space="preserve">Carlini et al. [20] demonstrated that large language models regurgitate training sequences and that extraction is detectable with membership tests [21]; the same extraction was then shown for diffusion models [22]. Deduplication reduces both verbatim regurgitation and privacy leakage [23], [24], and memorization is measurable even in probabilistic deep generative models [25]. For music specifically, symbolic generators such as Music Transformer [26] are trained on scraped MIDI, membership-inference auditing of generative music models has only recently been demonstrated [27], influence-level attribution has been explored with audio embeddings [28], and the legal status of such training data remains contested [29]. </w:t>
+      </w:r>
+    </w:p>
+    <w:p>
+      <w:pPr>
+        <w:spacing w:after="0"/>
+        <w:ind w:firstLine="204"/>
+        <w:jc w:val="both"/>
+      </w:pPr>
+      <w:r>
+        <w:t>Publishers consequently need batch screening tools rather than per-sample membership oracles. Our controlled experiments (Section VI-A) emulate the memorization spectrum without training neural models, using n-gram order and a copy operator—a deliberately transparent stand-in that exposes exactly where contiguity-based detection breaks down.</w:t>
+      </w:r>
+    </w:p>
+    <w:p>
+      <w:pPr>
+        <w:pStyle w:val="Heading2"/>
+        <w:spacing w:before="100"/>
+      </w:pPr>
+      <w:r>
+        <w:t>C. Anytime algorithms</w:t>
+      </w:r>
+    </w:p>
+    <w:p>
+      <w:pPr>
+        <w:spacing w:after="0"/>
+        <w:ind w:firstLine="204"/>
+        <w:jc w:val="both"/>
+      </w:pPr>
+      <w:r>
+        <w:t>Zilberstein [16] formalized anytime algorithms: interruptible procedures whose intermediate results improve monotonically and can be accompanied by a bound on unexplored outcomes. Our screen adopts this contract at the level of evidence items: after any prefix of the rare-first schedule, the set of pieces that can still reach the threshold is exactly computable, which turns an engineering heuristic into a guarantee a publisher can schedule around.</w:t>
+      </w:r>
+    </w:p>
+    <w:p>
+      <w:pPr>
+        <w:spacing w:after="0"/>
+        <w:ind w:firstLine="204"/>
+        <w:jc w:val="both"/>
+      </w:pPr>
+      <w:r>
+        <w:t>The bound instantiates a classical pattern. Threshold algorithms for top-</w:t>
       </w:r>
       <w:r>
         <w:rPr>
           <w:i/>
         </w:rPr>
-        <w:t>P₁</w:t>
-      </w:r>
-      <w:r>
-        <w:t xml:space="preserve">, …, </w:t>
+        <w:t>k</w:t>
+      </w:r>
+      <w:r>
+        <w:t xml:space="preserve"> aggregation [30] maintain a partial-score bound under which no unseen candidate can qualify, and branch-and-bound search [31] carries an admissible estimate of everything not yet explored. Theorem 1 transfers this contract to tolerant item-set evidence: because every unprocessed position can contribute at most one to any piece, </w:t>
       </w:r>
       <w:r>
         <w:rPr>
           <w:i/>
         </w:rPr>
-        <w:t>P</w:t>
+        <w:t>score</w:t>
       </w:r>
       <w:r>
         <w:rPr>
           <w:i/>
           <w:vertAlign w:val="subscript"/>
         </w:rPr>
+        <w:t>u</w:t>
+      </w:r>
+      <w:r>
+        <w:rPr>
+          <w:i/>
+        </w:rPr>
+        <w:t>(P)</w:t>
+      </w:r>
+      <w:r>
+        <w:t xml:space="preserve"> + (</w:t>
+      </w:r>
+      <w:r>
+        <w:rPr>
+          <w:i/>
+        </w:rPr>
+        <w:t>q</w:t>
+      </w:r>
+      <w:r>
+        <w:t xml:space="preserve"> − </w:t>
+      </w:r>
+      <w:r>
+        <w:rPr>
+          <w:i/>
+        </w:rPr>
+        <w:t>u</w:t>
+      </w:r>
+      <w:r>
+        <w:t>) plays the role of the partial bound, with tolerance turning it into a certified floor on final evidence rather than an optimistic estimate. We are not aware of an evidence bound of this form stated and cell-by-cell audited for music retrieval.</w:t>
+      </w:r>
+    </w:p>
+    <w:p>
+      <w:pPr>
+        <w:pStyle w:val="Heading1"/>
+      </w:pPr>
+      <w:r>
+        <w:t>III. SYSTEM</w:t>
+      </w:r>
+    </w:p>
+    <w:p>
+      <w:pPr>
+        <w:spacing w:after="0"/>
+        <w:ind w:firstLine="204"/>
+        <w:jc w:val="both"/>
+      </w:pPr>
+      <w:r>
+        <w:t>Fig. 2 shows the pipeline. All layers operate on a shared event encoding; the screen and the confirmation use different tolerances by design.</w:t>
+      </w:r>
+    </w:p>
+    <w:p>
+      <w:pPr>
+        <w:pStyle w:val="Heading2"/>
+        <w:spacing w:before="100"/>
+      </w:pPr>
+      <w:r>
+        <w:t>A. Problem statement and notation</w:t>
+      </w:r>
+    </w:p>
+    <w:p>
+      <w:pPr>
+        <w:spacing w:after="0"/>
+        <w:ind w:firstLine="204"/>
+        <w:jc w:val="both"/>
+      </w:pPr>
+      <w:r>
+        <w:t xml:space="preserve">A piece </w:t>
+      </w:r>
+      <w:r>
+        <w:rPr>
+          <w:i/>
+        </w:rPr>
+        <w:t>P</w:t>
+      </w:r>
+      <w:r>
+        <w:t xml:space="preserve"> = (</w:t>
+      </w:r>
+      <w:r>
+        <w:rPr>
+          <w:i/>
+        </w:rPr>
+        <w:t>e₁</w:t>
+      </w:r>
+      <w:r>
+        <w:t xml:space="preserve">, …, </w:t>
+      </w:r>
+      <w:r>
+        <w:rPr>
+          <w:i/>
+        </w:rPr>
+        <w:t>e</w:t>
+      </w:r>
+      <w:r>
+        <w:rPr>
+          <w:i/>
+          <w:vertAlign w:val="subscript"/>
+        </w:rPr>
+        <w:t>n</w:t>
+      </w:r>
+      <w:r>
+        <w:t xml:space="preserve">) is a sequence of note events </w:t>
+      </w:r>
+      <w:r>
+        <w:rPr>
+          <w:i/>
+        </w:rPr>
+        <w:t>e</w:t>
+      </w:r>
+      <w:r>
+        <w:rPr>
+          <w:i/>
+          <w:vertAlign w:val="subscript"/>
+        </w:rPr>
+        <w:t>i</w:t>
+      </w:r>
+      <w:r>
+        <w:t xml:space="preserve"> = (</w:t>
+      </w:r>
+      <w:r>
+        <w:rPr>
+          <w:i/>
+        </w:rPr>
+        <w:t>t</w:t>
+      </w:r>
+      <w:r>
+        <w:rPr>
+          <w:i/>
+          <w:vertAlign w:val="subscript"/>
+        </w:rPr>
+        <w:t>i</w:t>
+      </w:r>
+      <w:r>
+        <w:t xml:space="preserve">, </w:t>
+      </w:r>
+      <w:r>
+        <w:rPr>
+          <w:i/>
+        </w:rPr>
+        <w:t>p</w:t>
+      </w:r>
+      <w:r>
+        <w:rPr>
+          <w:i/>
+          <w:vertAlign w:val="subscript"/>
+        </w:rPr>
+        <w:t>i</w:t>
+      </w:r>
+      <w:r>
+        <w:t xml:space="preserve">, </w:t>
+      </w:r>
+      <w:r>
+        <w:rPr>
+          <w:i/>
+        </w:rPr>
+        <w:t>d</w:t>
+      </w:r>
+      <w:r>
+        <w:rPr>
+          <w:i/>
+          <w:vertAlign w:val="subscript"/>
+        </w:rPr>
+        <w:t>i</w:t>
+      </w:r>
+      <w:r>
+        <w:t xml:space="preserve">, </w:t>
+      </w:r>
+      <w:r>
+        <w:rPr>
+          <w:i/>
+        </w:rPr>
+        <w:t>v</w:t>
+      </w:r>
+      <w:r>
+        <w:rPr>
+          <w:i/>
+          <w:vertAlign w:val="subscript"/>
+        </w:rPr>
+        <w:t>i</w:t>
+      </w:r>
+      <w:r>
+        <w:t xml:space="preserve">): onset time, MIDI pitch, duration, and velocity. An encoding </w:t>
+      </w:r>
+      <w:r>
+        <w:rPr>
+          <w:i/>
+        </w:rPr>
+        <w:t>φ</w:t>
+      </w:r>
+      <w:r>
+        <w:t xml:space="preserve"> maps each event to an item, a tuple of quantized features (Section III-B); the item set </w:t>
+      </w:r>
+      <w:r>
+        <w:rPr>
+          <w:i/>
+        </w:rPr>
+        <w:t>S(P)</w:t>
+      </w:r>
+      <w:r>
+        <w:t>, the union of {</w:t>
+      </w:r>
+      <w:r>
+        <w:rPr>
+          <w:i/>
+        </w:rPr>
+        <w:t>φ</w:t>
+      </w:r>
+      <w:r>
+        <w:t>(</w:t>
+      </w:r>
+      <w:r>
+        <w:rPr>
+          <w:i/>
+        </w:rPr>
+        <w:t>e</w:t>
+      </w:r>
+      <w:r>
+        <w:rPr>
+          <w:i/>
+          <w:vertAlign w:val="subscript"/>
+        </w:rPr>
+        <w:t>i</w:t>
+      </w:r>
+      <w:r>
+        <w:t xml:space="preserve">)} over all positions, discards order and repetition. For tolerance vector </w:t>
+      </w:r>
+      <w:r>
+        <w:rPr>
+          <w:i/>
+        </w:rPr>
+        <w:t>k</w:t>
+      </w:r>
+      <w:r>
+        <w:t xml:space="preserve"> = (</w:t>
+      </w:r>
+      <w:r>
+        <w:rPr>
+          <w:i/>
+        </w:rPr>
+        <w:t>k_pitch</w:t>
+      </w:r>
+      <w:r>
+        <w:t xml:space="preserve">, </w:t>
+      </w:r>
+      <w:r>
+        <w:rPr>
+          <w:i/>
+        </w:rPr>
+        <w:t>k_bin</w:t>
+      </w:r>
+      <w:r>
+        <w:t xml:space="preserve">, </w:t>
+      </w:r>
+      <w:r>
+        <w:rPr>
+          <w:i/>
+        </w:rPr>
+        <w:t>k_vel</w:t>
+      </w:r>
+      <w:r>
+        <w:t xml:space="preserve">), the neighborhood </w:t>
+      </w:r>
+      <w:r>
+        <w:rPr>
+          <w:i/>
+        </w:rPr>
         <w:t>N</w:t>
       </w:r>
       <w:r>
         <w:rPr>
           <w:i/>
+          <w:vertAlign w:val="subscript"/>
+        </w:rPr>
+        <w:t>k</w:t>
+      </w:r>
+      <w:r>
+        <w:rPr>
+          <w:i/>
+        </w:rPr>
+        <w:t>(x)</w:t>
+      </w:r>
+      <w:r>
+        <w:t xml:space="preserve"> of an item x is the set of items whose pitch differs by at most </w:t>
+      </w:r>
+      <w:r>
+        <w:rPr>
+          <w:i/>
+        </w:rPr>
+        <w:t>k_pitch</w:t>
+      </w:r>
+      <w:r>
+        <w:t xml:space="preserve"> semitones and whose duration, inter-onset interval (IOI), and velocity bins differ by at most </w:t>
+      </w:r>
+      <w:r>
+        <w:rPr>
+          <w:i/>
+        </w:rPr>
+        <w:t>k_bin</w:t>
+      </w:r>
+      <w:r>
+        <w:t xml:space="preserve"> and </w:t>
+      </w:r>
+      <w:r>
+        <w:rPr>
+          <w:i/>
+        </w:rPr>
+        <w:t>k_vel</w:t>
+      </w:r>
+      <w:r>
+        <w:t xml:space="preserve"> bins respectively. A planted copy of a span </w:t>
+      </w:r>
+      <w:r>
+        <w:rPr>
+          <w:i/>
+        </w:rPr>
+        <w:t>X</w:t>
+      </w:r>
+      <w:r>
+        <w:t xml:space="preserve"> is produced by transforming every event of </w:t>
+      </w:r>
+      <w:r>
+        <w:rPr>
+          <w:i/>
+        </w:rPr>
+        <w:t>X</w:t>
+      </w:r>
+      <w:r>
+        <w:t xml:space="preserve"> with one of the six families of Section IV; the declared screen tolerance </w:t>
+      </w:r>
+      <w:r>
+        <w:rPr>
+          <w:i/>
+        </w:rPr>
+        <w:t>k</w:t>
+      </w:r>
+      <w:r>
+        <w:t xml:space="preserve"> = (2, 1, 1) covers all families except transposition beyond ±2 semitones and transcription jitter beyond ±1 bin, which the interval-sketch index of Section III-B handles separately.</w:t>
+      </w:r>
+    </w:p>
+    <w:p>
+      <w:pPr>
+        <w:spacing w:after="0"/>
+        <w:ind w:firstLine="204"/>
+        <w:jc w:val="both"/>
+      </w:pPr>
+      <w:r>
+        <w:t>Problem. Given a corpus D = {</w:t>
+      </w:r>
+      <w:r>
+        <w:rPr>
+          <w:i/>
+        </w:rPr>
+        <w:t>P₁</w:t>
+      </w:r>
+      <w:r>
+        <w:t xml:space="preserve">, …, </w:t>
+      </w:r>
+      <w:r>
+        <w:rPr>
+          <w:i/>
+        </w:rPr>
+        <w:t>P</w:t>
+      </w:r>
+      <w:r>
+        <w:rPr>
+          <w:i/>
+          <w:vertAlign w:val="subscript"/>
+        </w:rPr>
+        <w:t>N</w:t>
+      </w:r>
+      <w:r>
+        <w:rPr>
+          <w:i/>
         </w:rPr>
         <w:t>}</w:t>
       </w:r>
@@ -948,6 +938,97 @@
       </w:r>
       <w:r>
         <w:t xml:space="preserve"> a copied span under the declared noise model appears in the list, and (soundness of evidence) every confirmed candidate carries a note-level alignment that a human adjudicator can check against a score. The two requirements pull in opposite directions: completeness favors permissive item-level matching, soundness favors strict structural comparison. The system's bet is that the two can be separated cleanly enough to prove the first and measure the second.</w:t>
+      </w:r>
+    </w:p>
+    <w:p>
+      <w:pPr>
+        <w:spacing w:after="0"/>
+        <w:ind w:firstLine="227"/>
+        <w:jc w:val="both"/>
+      </w:pPr>
+      <w:r>
+        <w:t xml:space="preserve">Proposition 1 (containment invisibility of resemblance). Fix </w:t>
+      </w:r>
+      <w:r>
+        <w:rPr>
+          <w:i/>
+        </w:rPr>
+        <w:t>τ</w:t>
+      </w:r>
+      <w:r>
+        <w:t xml:space="preserve"> &gt; 0 and a query Q with </w:t>
+      </w:r>
+      <w:r>
+        <w:rPr>
+          <w:i/>
+        </w:rPr>
+        <w:t>q</w:t>
+      </w:r>
+      <w:r>
+        <w:t xml:space="preserve"> items. For any corpus piece </w:t>
+      </w:r>
+      <w:r>
+        <w:rPr>
+          <w:i/>
+        </w:rPr>
+        <w:t>P</w:t>
+      </w:r>
+      <w:r>
+        <w:t xml:space="preserve"> with p distinct items, J(Q, </w:t>
+      </w:r>
+      <w:r>
+        <w:rPr>
+          <w:i/>
+        </w:rPr>
+        <w:t>P</w:t>
+      </w:r>
+      <w:r>
+        <w:t xml:space="preserve">) ≤ </w:t>
+      </w:r>
+      <w:r>
+        <w:rPr>
+          <w:i/>
+        </w:rPr>
+        <w:t>q</w:t>
+      </w:r>
+      <w:r>
+        <w:t xml:space="preserve">/p: the donor of a planted span scores below </w:t>
+      </w:r>
+      <w:r>
+        <w:rPr>
+          <w:i/>
+        </w:rPr>
+        <w:t>τ</w:t>
+      </w:r>
+      <w:r>
+        <w:t xml:space="preserve"> whenever p &gt; </w:t>
+      </w:r>
+      <w:r>
+        <w:rPr>
+          <w:i/>
+        </w:rPr>
+        <w:t>q</w:t>
+      </w:r>
+      <w:r>
+        <w:t>/</w:t>
+      </w:r>
+      <w:r>
+        <w:rPr>
+          <w:i/>
+        </w:rPr>
+        <w:t>τ</w:t>
+      </w:r>
+      <w:r>
+        <w:t xml:space="preserve">, however faithfully the copied items are preserved. No fixed corpus-side resemblance threshold therefore attains complete recall on contained copies, and no MinHash-LSH configuration repairs this, since banding only reparametrizes the same Jaccard operating point. Proof: the intersection contains at most the </w:t>
+      </w:r>
+      <w:r>
+        <w:rPr>
+          <w:i/>
+        </w:rPr>
+        <w:t>q</w:t>
+      </w:r>
+      <w:r>
+        <w:t xml:space="preserve"> query items and the union contains all p piece items; the bound is tight when the span is the only overlap. ∎</w:t>
       </w:r>
     </w:p>
     <w:p>
@@ -1120,16 +1201,7 @@
         <w:jc w:val="both"/>
       </w:pPr>
       <w:r>
-        <w:t xml:space="preserve">Theorem 1 (evidence lower bound). Let </w:t>
-      </w:r>
-      <w:r>
-        <w:rPr>
-          <w:i/>
-        </w:rPr>
-        <w:t>q</w:t>
-      </w:r>
-      <w:r>
-        <w:t xml:space="preserve"> have </w:t>
+        <w:t xml:space="preserve">Theorem 1 (tolerant evidence lower bound and certified open set). Let a query have </w:t>
       </w:r>
       <w:r>
         <w:rPr>
@@ -4991,6 +5063,18 @@
     </w:p>
     <w:p>
       <w:pPr>
+        <w:spacing w:before="40"/>
+      </w:pPr>
+      <w:r>
+        <w:rPr>
+          <w:rFonts w:ascii="Times New Roman" w:hAnsi="Times New Roman"/>
+          <w:sz w:val="16"/>
+        </w:rPr>
+        <w:t>Rows are corpus-size subsamples drawn across different experiment generations, so the piece counts are not a uniform ladder and build times are not monotone in row order; scaling conclusions rely on within-generation interpolation rather than on adjacent-row differences.</w:t>
+      </w:r>
+    </w:p>
+    <w:p>
+      <w:pPr>
         <w:rPr>
           <w:sz w:val="12"/>
         </w:rPr>
@@ -5002,18 +5086,6 @@
           <w:cols w:space="288"/>
         </w:sectPr>
       </w:pPr>
-    </w:p>
-    <w:p>
-      <w:pPr>
-        <w:spacing w:before="0"/>
-      </w:pPr>
-      <w:r>
-        <w:rPr>
-          <w:rFonts w:ascii="Times New Roman" w:hAnsi="Times New Roman"/>
-          <w:sz w:val="16"/>
-        </w:rPr>
-        <w:t>Rows are corpus-size subsamples drawn across different experiment generations, so the piece counts are not a uniform ladder and build times are not monotone in row order; scaling conclusions rely on within-generation interpolation rather than on adjacent-row differences.</w:t>
-      </w:r>
     </w:p>
     <w:p>
       <w:pPr>
@@ -13253,7 +13325,7 @@
         <w:jc w:val="both"/>
       </w:pPr>
       <w:r>
-        <w:t xml:space="preserve">Why does the LSH index return nothing? The reason is geometric, not engineering. A planted query of the recall matrix embeds a 40-item span in 300 noise items and probes a corpus of pieces of ~700 items each, so even a perfect set-Jaccard oracle scores the donor at only 0.045 / 0.099 / 0.200 (quartiles over the 337 cells; Fig. 11(a)); just 168 of 337 donors reach Jaccard 0.10. Jaccard measures relative overlap, so a contained copy is structurally invisible to it no matter how faithfully the 40 shared items are preserved. </w:t>
+        <w:t xml:space="preserve">Why does the LSH index return nothing? The reason is geometric, not engineering—Proposition 1 makes it a statement about Jaccard, not about this implementation. A planted query of the recall matrix embeds a 40-item span in 300 noise items and probes a corpus of pieces of ~700 items each, so even a perfect set-Jaccard oracle scores the donor at only 0.045 / 0.099 / 0.200 (quartiles over the 337 cells; Fig. 11(a)); just 168 of 337 donors reach Jaccard 0.10. Jaccard measures relative overlap, so a contained copy is structurally invisible to it no matter how faithfully the 40 shared items are preserved. </w:t>
       </w:r>
     </w:p>
     <w:p>
@@ -17440,6 +17512,46 @@
       <w:r>
         <w:t>B. D. Ondov et al., “Mash: Fast genome and metagenome distance estimation using MinHash,” Genome Biology, vol. 17, 2016.</w:t>
       </w:r>
+    </w:p>
+    <w:p>
+      <w:pPr>
+        <w:rPr>
+          <w:sz w:val="12"/>
+        </w:rPr>
+        <w:sectPr>
+          <w:footnotePr>
+            <w:numRestart w:val="eachSect"/>
+          </w:footnotePr>
+          <w:type w:val="continuous"/>
+          <w:pgSz w:w="12240" w:h="15840"/>
+          <w:pgMar w:top="1008" w:right="936" w:bottom="1008" w:left="936" w:header="432" w:footer="432" w:gutter="0"/>
+          <w:cols w:num="2" w:space="720" w:equalWidth="0">
+            <w:col w:w="5040" w:space="288"/>
+            <w:col w:w="5040" w:space="0"/>
+          </w:cols>
+        </w:sectPr>
+      </w:pPr>
+    </w:p>
+    <w:p>
+      <w:pPr>
+        <w:rPr>
+          <w:sz w:val="18"/>
+        </w:rPr>
+      </w:pPr>
+    </w:p>
+    <w:p>
+      <w:pPr>
+        <w:rPr>
+          <w:sz w:val="12"/>
+        </w:rPr>
+        <w:sectPr>
+          <w:headerReference w:type="default" r:id="rId9"/>
+          <w:type w:val="continuous"/>
+          <w:pgSz w:w="12240" w:h="15840"/>
+          <w:pgMar w:top="1008" w:right="936" w:bottom="1008" w:left="936" w:header="432" w:footer="432" w:gutter="0"/>
+          <w:cols w:space="288"/>
+        </w:sectPr>
+      </w:pPr>
     </w:p>
     <w:sectPr>
       <w:footnotePr>

</xml_diff>

<commit_message>
Restructure V-G as predict-then-measure against Proposition 1
The MinHash-LSH baseline section now opens with the prediction the
proposition makes for the planted setup (no resemblance threshold can
both recover contained donors and bound candidate volume, donor
Jaccard capped near the span-to-container ratio), then presents the
oracle quartiles and the band-configuration sweep as confirmation
that the cap is operative. No numbers changed; narrative only.
Still 13 pages; citation and table-order audits clean.
</commit_message>
<xml_diff>
--- a/Manuscript.docx
+++ b/Manuscript.docx
@@ -13325,7 +13325,7 @@
         <w:jc w:val="both"/>
       </w:pPr>
       <w:r>
-        <w:t xml:space="preserve">Why does the LSH index return nothing? The reason is geometric, not engineering—Proposition 1 makes it a statement about Jaccard, not about this implementation. A planted query of the recall matrix embeds a 40-item span in 300 noise items and probes a corpus of pieces of ~700 items each, so even a perfect set-Jaccard oracle scores the donor at only 0.045 / 0.099 / 0.200 (quartiles over the 337 cells; Fig. 11(a)); just 168 of 337 donors reach Jaccard 0.10. Jaccard measures relative overlap, so a contained copy is structurally invisible to it no matter how faithfully the 40 shared items are preserved. </w:t>
+        <w:t>Proposition 1 turns the expected failure of this baseline into a prediction to test. A planted query of the recall matrix embeds a 40-item span in 300 noise items and probes pieces of ~700 distinct items; the proposition then rules out any resemblance threshold that both recovers such contained donors and keeps candidate volume bounded, because the donor's Jaccard is capped near the span-to-container ratio and can only fall as containers grow. The measurement confirms the cap is operative, not hypothetical: even a perfect set-Jaccard oracle scores the donor at only 0.045 / 0.099 / 0.200 (quartiles over the 337 cells; Fig. 11(a)); just 168 of 337 donors reach Jaccard 0.10. A contained copy is structurally invisible to relative overlap, however faithfully its items are preserved.</w:t>
       </w:r>
     </w:p>
     <w:p>
@@ -13335,7 +13335,7 @@
         <w:jc w:val="both"/>
       </w:pPr>
       <w:r>
-        <w:t xml:space="preserve">Tuning the band configuration moves the operating point along a recall-versus-candidate-volume trade-off, not past it (Table X): with the standard 16 x 8 bands at </w:t>
+        <w:t xml:space="preserve">Tuning the band configuration then moves the operating point along the recall-versus-candidate-volume trade-off the proposition predicts, not past it (Table X): with the standard 16 x 8 bands at </w:t>
       </w:r>
       <w:r>
         <w:rPr>

</xml_diff>

<commit_message>
Drop two under-review references (engines restated as baselines, not contributions); remap citation numbers; correct Environment to C++ engines + Python harness
</commit_message>
<xml_diff>
--- a/Manuscript.docx
+++ b/Manuscript.docx
@@ -2101,7 +2101,7 @@
         <w:jc w:val="both"/>
       </w:pPr>
       <w:r>
-        <w:t>Baselines. Set-Jaccard corpus scan, SIATEC-family pattern discovery [5], and n-gram Jaccard (Section V-A); FIM engines from our prior work [33], [34] serve as enumeration baselines. Both engines are independent of the present system—they enumerate patterns corpus-side, whereas the screen verifies containment query-side—and serve here solely as feasibility references.</w:t>
+        <w:t>Baselines. Set-Jaccard corpus scan, SIATEC-family pattern discovery [5], and n-gram Jaccard (Section V-A); the two frequent-itemset engines of our companion papers (under review) serve as enumeration baselines. They are independent of—and not contributions of—this paper; for completeness, Algorithm 1 gives pseudocode of the full pipeline, and the released source contains both engines' complete implementation details.</w:t>
       </w:r>
     </w:p>
     <w:p>
@@ -2111,7 +2111,16 @@
         <w:jc w:val="both"/>
       </w:pPr>
       <w:r>
-        <w:t>Environment. All experiments run on a single commodity workstation (12th-generation Intel Core i9, 128 GB RAM) in pure Python 3.12 with NumPy; no GPU accelerates any stage, so all latencies are conservative CPU-only figures. Every experiment is scripted end to end: the released pipeline re-downloads the corpus shards, rebuilds the index, regenerates every table and figure, and reproduces the manuscript numbers from scratch.</w:t>
+        <w:t xml:space="preserve">Environment. All experiments run on one commodity workstation (12th-generation Intel Core i9, 128 GB RAM); the computation engines are </w:t>
+      </w:r>
+      <w:r>
+        <w:rPr>
+          <w:i/>
+        </w:rPr>
+        <w:t>C</w:t>
+      </w:r>
+      <w:r>
+        <w:t>++, the harness (corpus preparation, index building, measurement, figure and table generation) is Python 3.12 with NumPy, and all quoted latencies are CPU-only figures. The released pipeline re-downloads the corpus shards, rebuilds the index, and regenerates every table and figure from scratch.</w:t>
       </w:r>
     </w:p>
     <w:p>
@@ -2801,7 +2810,7 @@
         <w:t>τ</w:t>
       </w:r>
       <w:r>
-        <w:t xml:space="preserve"> = 0.05 and 0.20): the S-curve of the band configuration activates only above Jaccard ~0.7, while a contained span of 40 items inside a ~700-item query reaches Jaccard ~0.1 at best, so the index answers every query with an empty candidate set. Section V-G analyses this geometry directly on the recall-matrix protocol. Corpus-side FIM enumeration—the engines of our previous work [33], [34]—was measured infeasible at the support levels copying detection requires (over 11 million frequent pairs at </w:t>
+        <w:t xml:space="preserve"> = 0.05 and 0.20): the S-curve of the band configuration activates only above Jaccard ~0.7, while a contained span of 40 items inside a ~700-item query reaches Jaccard ~0.1 at best, so the index answers every query with an empty candidate set. Section V-G analyses this geometry directly on the recall-matrix protocol. Corpus-side FIM enumeration—the two companion engines—was measured infeasible at the support levels copying detection requires (over 11 million frequent pairs at </w:t>
       </w:r>
       <w:r>
         <w:rPr>
@@ -13372,7 +13381,7 @@
         <w:jc w:val="both"/>
       </w:pPr>
       <w:r>
-        <w:t xml:space="preserve">Could containment-aware LSH close this gap? Containment estimators [35], [36] replace resemblance with the ratio </w:t>
+        <w:t xml:space="preserve">Could containment-aware LSH close this gap? Containment estimators [33], [34] replace resemblance with the ratio </w:t>
       </w:r>
       <w:r>
         <w:rPr>
@@ -17475,24 +17484,6 @@
       </w:pPr>
       <w:r>
         <w:t>K. J. M. Lee, J. Ens, S. Adkins, P. Sarmento, et al., “The GigaMIDI dataset with features for expressive music performance detection,” Transactions of the Int. Society for Music Information Retrieval, 2025.</w:t>
-      </w:r>
-    </w:p>
-    <w:p>
-      <w:pPr>
-        <w:pStyle w:val="References"/>
-        <w:ind w:left="425" w:hanging="425"/>
-      </w:pPr>
-      <w:r>
-        <w:t>Y. Zhang et al., “Anytime frequent itemset mining: A threshold-free progressive item-activation framework with CPU–GPU heterogeneous collaboration,” under review.</w:t>
-      </w:r>
-    </w:p>
-    <w:p>
-      <w:pPr>
-        <w:pStyle w:val="References"/>
-        <w:ind w:left="425" w:hanging="425"/>
-      </w:pPr>
-      <w:r>
-        <w:t>Y. Zhang et al., “TensorFIM: Exact maximal frequent itemset mining on tensor cores,” under review.</w:t>
       </w:r>
     </w:p>
     <w:p>

</xml_diff>

<commit_message>
Store the continuous section break in the authors paragraph itself; removes the blank line before the abstract and pulls the orphaned line above Fig. 1 back to page 1
</commit_message>
<xml_diff>
--- a/Manuscript.docx
+++ b/Manuscript.docx
@@ -20,72 +20,6 @@
     <w:p>
       <w:pPr>
         <w:pStyle w:val="Authors"/>
-      </w:pPr>
-      <w:r>
-        <w:t>Xuemei Li</w:t>
-      </w:r>
-      <w:r>
-        <w:rPr>
-          <w:vertAlign w:val="superscript"/>
-        </w:rPr>
-        <w:t>1</w:t>
-      </w:r>
-      <w:r>
-        <w:t xml:space="preserve">, </w:t>
-      </w:r>
-      <w:r>
-        <w:t>Jianping Deng</w:t>
-      </w:r>
-      <w:r>
-        <w:rPr>
-          <w:vertAlign w:val="superscript"/>
-        </w:rPr>
-        <w:t>1</w:t>
-      </w:r>
-      <w:r>
-        <w:t xml:space="preserve">, </w:t>
-      </w:r>
-      <w:r>
-        <w:t>Meng Huang</w:t>
-      </w:r>
-      <w:r>
-        <w:rPr>
-          <w:vertAlign w:val="superscript"/>
-        </w:rPr>
-        <w:t>2</w:t>
-      </w:r>
-      <w:r>
-        <w:t xml:space="preserve">, </w:t>
-      </w:r>
-      <w:r>
-        <w:t>Bao Wang</w:t>
-      </w:r>
-      <w:r>
-        <w:rPr>
-          <w:vertAlign w:val="superscript"/>
-        </w:rPr>
-        <w:t>2</w:t>
-      </w:r>
-      <w:r>
-        <w:t xml:space="preserve">, and </w:t>
-      </w:r>
-      <w:r>
-        <w:t>Yalong Zhang</w:t>
-      </w:r>
-      <w:r>
-        <w:rPr>
-          <w:vertAlign w:val="superscript"/>
-        </w:rPr>
-        <w:t>2*</w:t>
-      </w:r>
-    </w:p>
-    <w:p>
-      <w:pPr>
-        <w:spacing w:before="0" w:after="40"/>
-        <w:rPr>
-          <w:sz w:val="2"/>
-          <w:szCs w:val="2"/>
-        </w:rPr>
         <w:sectPr>
           <w:headerReference w:type="default" r:id="rId9"/>
           <w:type w:val="continuous"/>
@@ -94,6 +28,63 @@
           <w:cols w:space="288"/>
         </w:sectPr>
       </w:pPr>
+      <w:r>
+        <w:t>Xuemei Li</w:t>
+      </w:r>
+      <w:r>
+        <w:rPr>
+          <w:vertAlign w:val="superscript"/>
+        </w:rPr>
+        <w:t>1</w:t>
+      </w:r>
+      <w:r>
+        <w:t xml:space="preserve">, </w:t>
+      </w:r>
+      <w:r>
+        <w:t>Jianping Deng</w:t>
+      </w:r>
+      <w:r>
+        <w:rPr>
+          <w:vertAlign w:val="superscript"/>
+        </w:rPr>
+        <w:t>1</w:t>
+      </w:r>
+      <w:r>
+        <w:t xml:space="preserve">, </w:t>
+      </w:r>
+      <w:r>
+        <w:t>Meng Huang</w:t>
+      </w:r>
+      <w:r>
+        <w:rPr>
+          <w:vertAlign w:val="superscript"/>
+        </w:rPr>
+        <w:t>2</w:t>
+      </w:r>
+      <w:r>
+        <w:t xml:space="preserve">, </w:t>
+      </w:r>
+      <w:r>
+        <w:t>Bao Wang</w:t>
+      </w:r>
+      <w:r>
+        <w:rPr>
+          <w:vertAlign w:val="superscript"/>
+        </w:rPr>
+        <w:t>2</w:t>
+      </w:r>
+      <w:r>
+        <w:t xml:space="preserve">, and </w:t>
+      </w:r>
+      <w:r>
+        <w:t>Yalong Zhang</w:t>
+      </w:r>
+      <w:r>
+        <w:rPr>
+          <w:vertAlign w:val="superscript"/>
+        </w:rPr>
+        <w:t>2*</w:t>
+      </w:r>
     </w:p>
     <w:p>
       <w:pPr>

</xml_diff>